<commit_message>
Add live dashboard screenshots and detailed report with live app link
</commit_message>
<xml_diff>
--- a/reports/Project_Report_Uddish_Patel.docx
+++ b/reports/Project_Report_Uddish_Patel.docx
@@ -58,6 +58,31 @@
           <w:sz w:val="24"/>
         </w:rPr>
         <w:t>June 2026</w:t>
+      </w:r>
+    </w:p>
+    <w:p/>
+    <w:p>
+      <w:pPr>
+        <w:jc w:val="center"/>
+      </w:pPr>
+      <w:r>
+        <w:rPr>
+          <w:color w:val="1E3A5F"/>
+          <w:sz w:val="22"/>
+        </w:rPr>
+        <w:t>Live application: https://password-cracking-credential-attack-suite-58xby2nrznzkhogifexp.streamlit.app/</w:t>
+      </w:r>
+    </w:p>
+    <w:p>
+      <w:pPr>
+        <w:jc w:val="center"/>
+      </w:pPr>
+      <w:r>
+        <w:rPr>
+          <w:color w:val="1E3A5F"/>
+          <w:sz w:val="22"/>
+        </w:rPr>
+        <w:t>Source code: https://github.com/pateluddish47-ai/Password-Cracking-Credential-Attack-Suite</w:t>
       </w:r>
     </w:p>
     <w:p>
@@ -484,7 +509,417 @@
         <w:rPr>
           <w:color w:val="1E3A5F"/>
         </w:rPr>
-        <w:t>7. Key Differentiators</w:t>
+        <w:t>7. Live Application &amp; Screenshots</w:t>
+      </w:r>
+    </w:p>
+    <w:p>
+      <w:r>
+        <w:t>The dashboard is deployed and publicly accessible at: https://password-cracking-credential-attack-suite-58xby2nrznzkhogifexp.streamlit.app/</w:t>
+        <w:br/>
+        <w:t>Source code repository: https://github.com/pateluddish47-ai/Password-Cracking-Credential-Attack-Suite</w:t>
+        <w:br/>
+        <w:br/>
+        <w:t>The screenshots below were captured directly from the live deployment (not a local mockup), with each tab's primary action executed so the actual output is visible.</w:t>
+      </w:r>
+    </w:p>
+    <w:p>
+      <w:r>
+        <w:drawing>
+          <wp:inline xmlns:a="http://schemas.openxmlformats.org/drawingml/2006/main" xmlns:pic="http://schemas.openxmlformats.org/drawingml/2006/picture">
+            <wp:extent cx="5120640" cy="8534400"/>
+            <wp:docPr id="2" name="Picture 2"/>
+            <wp:cNvGraphicFramePr>
+              <a:graphicFrameLocks noChangeAspect="1"/>
+            </wp:cNvGraphicFramePr>
+            <a:graphic>
+              <a:graphicData uri="http://schemas.openxmlformats.org/drawingml/2006/picture">
+                <pic:pic>
+                  <pic:nvPicPr>
+                    <pic:cNvPr id="0" name="00_home.png"/>
+                    <pic:cNvPicPr/>
+                  </pic:nvPicPr>
+                  <pic:blipFill>
+                    <a:blip r:embed="rId10"/>
+                    <a:stretch>
+                      <a:fillRect/>
+                    </a:stretch>
+                  </pic:blipFill>
+                  <pic:spPr>
+                    <a:xfrm>
+                      <a:off x="0" y="0"/>
+                      <a:ext cx="5120640" cy="8534400"/>
+                    </a:xfrm>
+                    <a:prstGeom prst="rect"/>
+                  </pic:spPr>
+                </pic:pic>
+              </a:graphicData>
+            </a:graphic>
+          </wp:inline>
+        </w:drawing>
+      </w:r>
+    </w:p>
+    <w:p>
+      <w:pPr>
+        <w:jc w:val="center"/>
+      </w:pPr>
+      <w:r>
+        <w:rPr>
+          <w:i/>
+        </w:rPr>
+        <w:t>Figure A: Dashboard home screen with all seven functional tabs</w:t>
+      </w:r>
+    </w:p>
+    <w:p/>
+    <w:p>
+      <w:r>
+        <w:drawing>
+          <wp:inline xmlns:a="http://schemas.openxmlformats.org/drawingml/2006/main" xmlns:pic="http://schemas.openxmlformats.org/drawingml/2006/picture">
+            <wp:extent cx="5120640" cy="8534400"/>
+            <wp:docPr id="3" name="Picture 3"/>
+            <wp:cNvGraphicFramePr>
+              <a:graphicFrameLocks noChangeAspect="1"/>
+            </wp:cNvGraphicFramePr>
+            <a:graphic>
+              <a:graphicData uri="http://schemas.openxmlformats.org/drawingml/2006/picture">
+                <pic:pic>
+                  <pic:nvPicPr>
+                    <pic:cNvPr id="0" name="01_Dictionary_Generator.png"/>
+                    <pic:cNvPicPr/>
+                  </pic:nvPicPr>
+                  <pic:blipFill>
+                    <a:blip r:embed="rId11"/>
+                    <a:stretch>
+                      <a:fillRect/>
+                    </a:stretch>
+                  </pic:blipFill>
+                  <pic:spPr>
+                    <a:xfrm>
+                      <a:off x="0" y="0"/>
+                      <a:ext cx="5120640" cy="8534400"/>
+                    </a:xfrm>
+                    <a:prstGeom prst="rect"/>
+                  </pic:spPr>
+                </pic:pic>
+              </a:graphicData>
+            </a:graphic>
+          </wp:inline>
+        </w:drawing>
+      </w:r>
+    </w:p>
+    <w:p>
+      <w:pPr>
+        <w:jc w:val="center"/>
+      </w:pPr>
+      <w:r>
+        <w:rPr>
+          <w:i/>
+        </w:rPr>
+        <w:t>Figure B: Dictionary Generator -- 1,158 candidate passwords generated from name/DOB seeds</w:t>
+      </w:r>
+    </w:p>
+    <w:p/>
+    <w:p>
+      <w:r>
+        <w:drawing>
+          <wp:inline xmlns:a="http://schemas.openxmlformats.org/drawingml/2006/main" xmlns:pic="http://schemas.openxmlformats.org/drawingml/2006/picture">
+            <wp:extent cx="5120640" cy="8534400"/>
+            <wp:docPr id="4" name="Picture 4"/>
+            <wp:cNvGraphicFramePr>
+              <a:graphicFrameLocks noChangeAspect="1"/>
+            </wp:cNvGraphicFramePr>
+            <a:graphic>
+              <a:graphicData uri="http://schemas.openxmlformats.org/drawingml/2006/picture">
+                <pic:pic>
+                  <pic:nvPicPr>
+                    <pic:cNvPr id="0" name="02_Hash_Extractor.png"/>
+                    <pic:cNvPicPr/>
+                  </pic:nvPicPr>
+                  <pic:blipFill>
+                    <a:blip r:embed="rId12"/>
+                    <a:stretch>
+                      <a:fillRect/>
+                    </a:stretch>
+                  </pic:blipFill>
+                  <pic:spPr>
+                    <a:xfrm>
+                      <a:off x="0" y="0"/>
+                      <a:ext cx="5120640" cy="8534400"/>
+                    </a:xfrm>
+                    <a:prstGeom prst="rect"/>
+                  </pic:spPr>
+                </pic:pic>
+              </a:graphicData>
+            </a:graphic>
+          </wp:inline>
+        </w:drawing>
+      </w:r>
+    </w:p>
+    <w:p>
+      <w:pPr>
+        <w:jc w:val="center"/>
+      </w:pPr>
+      <w:r>
+        <w:rPr>
+          <w:i/>
+        </w:rPr>
+        <w:t>Figure C: Hash Extractor -- parsed Linux shadow file with algorithm identification</w:t>
+      </w:r>
+    </w:p>
+    <w:p/>
+    <w:p>
+      <w:r>
+        <w:drawing>
+          <wp:inline xmlns:a="http://schemas.openxmlformats.org/drawingml/2006/main" xmlns:pic="http://schemas.openxmlformats.org/drawingml/2006/picture">
+            <wp:extent cx="5120640" cy="8534400"/>
+            <wp:docPr id="5" name="Picture 5"/>
+            <wp:cNvGraphicFramePr>
+              <a:graphicFrameLocks noChangeAspect="1"/>
+            </wp:cNvGraphicFramePr>
+            <a:graphic>
+              <a:graphicData uri="http://schemas.openxmlformats.org/drawingml/2006/picture">
+                <pic:pic>
+                  <pic:nvPicPr>
+                    <pic:cNvPr id="0" name="03_Attack_Simulator.png"/>
+                    <pic:cNvPicPr/>
+                  </pic:nvPicPr>
+                  <pic:blipFill>
+                    <a:blip r:embed="rId13"/>
+                    <a:stretch>
+                      <a:fillRect/>
+                    </a:stretch>
+                  </pic:blipFill>
+                  <pic:spPr>
+                    <a:xfrm>
+                      <a:off x="0" y="0"/>
+                      <a:ext cx="5120640" cy="8534400"/>
+                    </a:xfrm>
+                    <a:prstGeom prst="rect"/>
+                  </pic:spPr>
+                </pic:pic>
+              </a:graphicData>
+            </a:graphic>
+          </wp:inline>
+        </w:drawing>
+      </w:r>
+    </w:p>
+    <w:p>
+      <w:pPr>
+        <w:jc w:val="center"/>
+      </w:pPr>
+      <w:r>
+        <w:rPr>
+          <w:i/>
+        </w:rPr>
+        <w:t>Figure D: Attack Simulator -- dictionary attack, real crypt-hash attack, and brute-force time-to-crack estimate</w:t>
+      </w:r>
+    </w:p>
+    <w:p/>
+    <w:p>
+      <w:r>
+        <w:drawing>
+          <wp:inline xmlns:a="http://schemas.openxmlformats.org/drawingml/2006/main" xmlns:pic="http://schemas.openxmlformats.org/drawingml/2006/picture">
+            <wp:extent cx="5120640" cy="8534400"/>
+            <wp:docPr id="6" name="Picture 6"/>
+            <wp:cNvGraphicFramePr>
+              <a:graphicFrameLocks noChangeAspect="1"/>
+            </wp:cNvGraphicFramePr>
+            <a:graphic>
+              <a:graphicData uri="http://schemas.openxmlformats.org/drawingml/2006/picture">
+                <pic:pic>
+                  <pic:nvPicPr>
+                    <pic:cNvPr id="0" name="04_Strength_Analyzer.png"/>
+                    <pic:cNvPicPr/>
+                  </pic:nvPicPr>
+                  <pic:blipFill>
+                    <a:blip r:embed="rId14"/>
+                    <a:stretch>
+                      <a:fillRect/>
+                    </a:stretch>
+                  </pic:blipFill>
+                  <pic:spPr>
+                    <a:xfrm>
+                      <a:off x="0" y="0"/>
+                      <a:ext cx="5120640" cy="8534400"/>
+                    </a:xfrm>
+                    <a:prstGeom prst="rect"/>
+                  </pic:spPr>
+                </pic:pic>
+              </a:graphicData>
+            </a:graphic>
+          </wp:inline>
+        </w:drawing>
+      </w:r>
+    </w:p>
+    <w:p>
+      <w:pPr>
+        <w:jc w:val="center"/>
+      </w:pPr>
+      <w:r>
+        <w:rPr>
+          <w:i/>
+        </w:rPr>
+        <w:t>Figure E: Strength Analyzer -- entropy table with entropy histogram, severity pie chart, and risk ranking</w:t>
+      </w:r>
+    </w:p>
+    <w:p/>
+    <w:p>
+      <w:r>
+        <w:drawing>
+          <wp:inline xmlns:a="http://schemas.openxmlformats.org/drawingml/2006/main" xmlns:pic="http://schemas.openxmlformats.org/drawingml/2006/picture">
+            <wp:extent cx="5120640" cy="8534400"/>
+            <wp:docPr id="7" name="Picture 7"/>
+            <wp:cNvGraphicFramePr>
+              <a:graphicFrameLocks noChangeAspect="1"/>
+            </wp:cNvGraphicFramePr>
+            <a:graphic>
+              <a:graphicData uri="http://schemas.openxmlformats.org/drawingml/2006/picture">
+                <pic:pic>
+                  <pic:nvPicPr>
+                    <pic:cNvPr id="0" name="05_NIST_Compliance.png"/>
+                    <pic:cNvPicPr/>
+                  </pic:nvPicPr>
+                  <pic:blipFill>
+                    <a:blip r:embed="rId15"/>
+                    <a:stretch>
+                      <a:fillRect/>
+                    </a:stretch>
+                  </pic:blipFill>
+                  <pic:spPr>
+                    <a:xfrm>
+                      <a:off x="0" y="0"/>
+                      <a:ext cx="5120640" cy="8534400"/>
+                    </a:xfrm>
+                    <a:prstGeom prst="rect"/>
+                  </pic:spPr>
+                </pic:pic>
+              </a:graphicData>
+            </a:graphic>
+          </wp:inline>
+        </w:drawing>
+      </w:r>
+    </w:p>
+    <w:p>
+      <w:pPr>
+        <w:jc w:val="center"/>
+      </w:pPr>
+      <w:r>
+        <w:rPr>
+          <w:i/>
+        </w:rPr>
+        <w:t>Figure F: NIST SP 800-63B Compliance Check -- 6/10 compliant with itemized violations</w:t>
+      </w:r>
+    </w:p>
+    <w:p/>
+    <w:p>
+      <w:r>
+        <w:drawing>
+          <wp:inline xmlns:a="http://schemas.openxmlformats.org/drawingml/2006/main" xmlns:pic="http://schemas.openxmlformats.org/drawingml/2006/picture">
+            <wp:extent cx="5120640" cy="8534400"/>
+            <wp:docPr id="8" name="Picture 8"/>
+            <wp:cNvGraphicFramePr>
+              <a:graphicFrameLocks noChangeAspect="1"/>
+            </wp:cNvGraphicFramePr>
+            <a:graphic>
+              <a:graphicData uri="http://schemas.openxmlformats.org/drawingml/2006/picture">
+                <pic:pic>
+                  <pic:nvPicPr>
+                    <pic:cNvPr id="0" name="06_Live_Benchmark.png"/>
+                    <pic:cNvPicPr/>
+                  </pic:nvPicPr>
+                  <pic:blipFill>
+                    <a:blip r:embed="rId16"/>
+                    <a:stretch>
+                      <a:fillRect/>
+                    </a:stretch>
+                  </pic:blipFill>
+                  <pic:spPr>
+                    <a:xfrm>
+                      <a:off x="0" y="0"/>
+                      <a:ext cx="5120640" cy="8534400"/>
+                    </a:xfrm>
+                    <a:prstGeom prst="rect"/>
+                  </pic:spPr>
+                </pic:pic>
+              </a:graphicData>
+            </a:graphic>
+          </wp:inline>
+        </w:drawing>
+      </w:r>
+    </w:p>
+    <w:p>
+      <w:pPr>
+        <w:jc w:val="center"/>
+      </w:pPr>
+      <w:r>
+        <w:rPr>
+          <w:i/>
+        </w:rPr>
+        <w:t>Figure G: Live Benchmark -- real measured MD5 throughput on the host machine</w:t>
+      </w:r>
+    </w:p>
+    <w:p/>
+    <w:p>
+      <w:r>
+        <w:drawing>
+          <wp:inline xmlns:a="http://schemas.openxmlformats.org/drawingml/2006/main" xmlns:pic="http://schemas.openxmlformats.org/drawingml/2006/picture">
+            <wp:extent cx="5120640" cy="8534400"/>
+            <wp:docPr id="9" name="Picture 9"/>
+            <wp:cNvGraphicFramePr>
+              <a:graphicFrameLocks noChangeAspect="1"/>
+            </wp:cNvGraphicFramePr>
+            <a:graphic>
+              <a:graphicData uri="http://schemas.openxmlformats.org/drawingml/2006/picture">
+                <pic:pic>
+                  <pic:nvPicPr>
+                    <pic:cNvPr id="0" name="07_Audit_Report.png"/>
+                    <pic:cNvPicPr/>
+                  </pic:nvPicPr>
+                  <pic:blipFill>
+                    <a:blip r:embed="rId17"/>
+                    <a:stretch>
+                      <a:fillRect/>
+                    </a:stretch>
+                  </pic:blipFill>
+                  <pic:spPr>
+                    <a:xfrm>
+                      <a:off x="0" y="0"/>
+                      <a:ext cx="5120640" cy="8534400"/>
+                    </a:xfrm>
+                    <a:prstGeom prst="rect"/>
+                  </pic:spPr>
+                </pic:pic>
+              </a:graphicData>
+            </a:graphic>
+          </wp:inline>
+        </w:drawing>
+      </w:r>
+    </w:p>
+    <w:p>
+      <w:pPr>
+        <w:jc w:val="center"/>
+      </w:pPr>
+      <w:r>
+        <w:rPr>
+          <w:i/>
+        </w:rPr>
+        <w:t>Figure H: Consolidated Audit Report generated and rendered in-app</w:t>
+      </w:r>
+    </w:p>
+    <w:p/>
+    <w:p>
+      <w:r>
+        <w:br w:type="page"/>
+      </w:r>
+    </w:p>
+    <w:p>
+      <w:pPr>
+        <w:pStyle w:val="Heading1"/>
+      </w:pPr>
+      <w:r>
+        <w:rPr>
+          <w:color w:val="1E3A5F"/>
+        </w:rPr>
+        <w:t>8. Key Differentiators</w:t>
       </w:r>
     </w:p>
     <w:p>
@@ -548,7 +983,7 @@
         <w:rPr>
           <w:color w:val="1E3A5F"/>
         </w:rPr>
-        <w:t>8. Results &amp; Demonstration</w:t>
+        <w:t>9. Results &amp; Demonstration</w:t>
       </w:r>
     </w:p>
     <w:p>
@@ -1042,7 +1477,7 @@
         <w:drawing>
           <wp:inline xmlns:a="http://schemas.openxmlformats.org/drawingml/2006/main" xmlns:pic="http://schemas.openxmlformats.org/drawingml/2006/picture">
             <wp:extent cx="4206240" cy="2804160"/>
-            <wp:docPr id="2" name="Picture 2"/>
+            <wp:docPr id="10" name="Picture 10"/>
             <wp:cNvGraphicFramePr>
               <a:graphicFrameLocks noChangeAspect="1"/>
             </wp:cNvGraphicFramePr>
@@ -1054,7 +1489,7 @@
                     <pic:cNvPicPr/>
                   </pic:nvPicPr>
                   <pic:blipFill>
-                    <a:blip r:embed="rId10"/>
+                    <a:blip r:embed="rId18"/>
                     <a:stretch>
                       <a:fillRect/>
                     </a:stretch>
@@ -1089,7 +1524,7 @@
         <w:drawing>
           <wp:inline xmlns:a="http://schemas.openxmlformats.org/drawingml/2006/main" xmlns:pic="http://schemas.openxmlformats.org/drawingml/2006/picture">
             <wp:extent cx="4206240" cy="4206240"/>
-            <wp:docPr id="3" name="Picture 3"/>
+            <wp:docPr id="11" name="Picture 11"/>
             <wp:cNvGraphicFramePr>
               <a:graphicFrameLocks noChangeAspect="1"/>
             </wp:cNvGraphicFramePr>
@@ -1101,7 +1536,7 @@
                     <pic:cNvPicPr/>
                   </pic:nvPicPr>
                   <pic:blipFill>
-                    <a:blip r:embed="rId11"/>
+                    <a:blip r:embed="rId19"/>
                     <a:stretch>
                       <a:fillRect/>
                     </a:stretch>
@@ -1136,7 +1571,7 @@
         <w:drawing>
           <wp:inline xmlns:a="http://schemas.openxmlformats.org/drawingml/2006/main" xmlns:pic="http://schemas.openxmlformats.org/drawingml/2006/picture">
             <wp:extent cx="4206240" cy="2403566"/>
-            <wp:docPr id="4" name="Picture 4"/>
+            <wp:docPr id="12" name="Picture 12"/>
             <wp:cNvGraphicFramePr>
               <a:graphicFrameLocks noChangeAspect="1"/>
             </wp:cNvGraphicFramePr>
@@ -1148,7 +1583,7 @@
                     <pic:cNvPicPr/>
                   </pic:nvPicPr>
                   <pic:blipFill>
-                    <a:blip r:embed="rId12"/>
+                    <a:blip r:embed="rId20"/>
                     <a:stretch>
                       <a:fillRect/>
                     </a:stretch>
@@ -1191,7 +1626,7 @@
         <w:rPr>
           <w:color w:val="1E3A5F"/>
         </w:rPr>
-        <w:t>9. Real Attack Demonstration</w:t>
+        <w:t>10. Real Attack Demonstration</w:t>
       </w:r>
     </w:p>
     <w:p>
@@ -1207,7 +1642,7 @@
         <w:rPr>
           <w:color w:val="1E3A5F"/>
         </w:rPr>
-        <w:t>10. NIST SP 800-63B Compliance Methodology</w:t>
+        <w:t>11. NIST SP 800-63B Compliance Methodology</w:t>
       </w:r>
     </w:p>
     <w:p>
@@ -1263,7 +1698,7 @@
         <w:rPr>
           <w:color w:val="1E3A5F"/>
         </w:rPr>
-        <w:t>11. Security &amp; Ethical Considerations</w:t>
+        <w:t>12. Security &amp; Ethical Considerations</w:t>
       </w:r>
     </w:p>
     <w:p>
@@ -1306,7 +1741,7 @@
         <w:rPr>
           <w:color w:val="1E3A5F"/>
         </w:rPr>
-        <w:t>12. Learning Outcomes</w:t>
+        <w:t>13. Learning Outcomes</w:t>
       </w:r>
     </w:p>
     <w:p>
@@ -1357,7 +1792,7 @@
         <w:rPr>
           <w:color w:val="1E3A5F"/>
         </w:rPr>
-        <w:t>13. Conclusion &amp; Future Scope</w:t>
+        <w:t>14. Conclusion &amp; Future Scope</w:t>
       </w:r>
     </w:p>
     <w:p>
@@ -1373,7 +1808,7 @@
         <w:rPr>
           <w:color w:val="1E3A5F"/>
         </w:rPr>
-        <w:t>14. References</w:t>
+        <w:t>15. References</w:t>
       </w:r>
     </w:p>
     <w:p>

</xml_diff>

<commit_message>
Make report more professional: cropped/split screenshots, detailed captions, TOC, page numbers
</commit_message>
<xml_diff>
--- a/reports/Project_Report_Uddish_Patel.docx
+++ b/reports/Project_Report_Uddish_Patel.docx
@@ -83,6 +83,30 @@
           <w:sz w:val="22"/>
         </w:rPr>
         <w:t>Source code: https://github.com/pateluddish47-ai/Password-Cracking-Credential-Attack-Suite</w:t>
+      </w:r>
+    </w:p>
+    <w:p>
+      <w:r>
+        <w:br w:type="page"/>
+      </w:r>
+    </w:p>
+    <w:p>
+      <w:r>
+        <w:rPr>
+          <w:b/>
+          <w:color w:val="1E3A5F"/>
+          <w:sz w:val="36"/>
+        </w:rPr>
+        <w:t>Table of Contents</w:t>
+      </w:r>
+    </w:p>
+    <w:p>
+      <w:r>
+        <w:fldChar w:fldCharType="begin"/>
+        <w:instrText xml:space="preserve">TOC \o "1-2" \h \z \u</w:instrText>
+        <w:fldChar w:fldCharType="separate"/>
+        <w:t>Right-click here and choose 'Update Field' to generate the table of contents.</w:t>
+        <w:fldChar w:fldCharType="end"/>
       </w:r>
     </w:p>
     <w:p>
@@ -466,7 +490,7 @@
                     <pic:cNvPicPr/>
                   </pic:nvPicPr>
                   <pic:blipFill>
-                    <a:blip r:embed="rId9"/>
+                    <a:blip r:embed="rId10"/>
                     <a:stretch>
                       <a:fillRect/>
                     </a:stretch>
@@ -519,14 +543,33 @@
         <w:t>Source code repository: https://github.com/pateluddish47-ai/Password-Cracking-Credential-Attack-Suite</w:t>
         <w:br/>
         <w:br/>
-        <w:t>The screenshots below were captured directly from the live deployment (not a local mockup), with each tab's primary action executed so the actual output is visible.</w:t>
+        <w:t>Every screenshot in this section was captured directly from the live deployment using an automated browser session (not a local mockup or edited image): the relevant action button on each tab was actually clicked, and the screenshot shows the real output that action produced. Dense tabs are split into multiple close-up figures so every value, label, and axis is legible at print resolution.</w:t>
+      </w:r>
+    </w:p>
+    <w:p>
+      <w:pPr>
+        <w:pStyle w:val="Heading2"/>
+      </w:pPr>
+      <w:r>
+        <w:rPr>
+          <w:color w:val="1E3A5F"/>
+        </w:rPr>
+        <w:t>7.1 Dashboard Home</w:t>
       </w:r>
     </w:p>
     <w:p>
       <w:r>
+        <w:t>The landing view shows the application title, the ethical-use disclaimer, and the seven functional tabs that make up the toolkit.</w:t>
+      </w:r>
+    </w:p>
+    <w:p>
+      <w:pPr>
+        <w:jc w:val="center"/>
+      </w:pPr>
+      <w:r>
         <w:drawing>
           <wp:inline xmlns:a="http://schemas.openxmlformats.org/drawingml/2006/main" xmlns:pic="http://schemas.openxmlformats.org/drawingml/2006/picture">
-            <wp:extent cx="5120640" cy="8534400"/>
+            <wp:extent cx="5760720" cy="2377037"/>
             <wp:docPr id="2" name="Picture 2"/>
             <wp:cNvGraphicFramePr>
               <a:graphicFrameLocks noChangeAspect="1"/>
@@ -539,7 +582,7 @@
                     <pic:cNvPicPr/>
                   </pic:nvPicPr>
                   <pic:blipFill>
-                    <a:blip r:embed="rId10"/>
+                    <a:blip r:embed="rId11"/>
                     <a:stretch>
                       <a:fillRect/>
                     </a:stretch>
@@ -547,7 +590,7 @@
                   <pic:spPr>
                     <a:xfrm>
                       <a:off x="0" y="0"/>
-                      <a:ext cx="5120640" cy="8534400"/>
+                      <a:ext cx="5760720" cy="2377037"/>
                     </a:xfrm>
                     <a:prstGeom prst="rect"/>
                   </pic:spPr>
@@ -565,16 +608,36 @@
       <w:r>
         <w:rPr>
           <w:i/>
+          <w:sz w:val="19"/>
         </w:rPr>
         <w:t>Figure A: Dashboard home screen with all seven functional tabs</w:t>
       </w:r>
     </w:p>
     <w:p/>
     <w:p>
+      <w:pPr>
+        <w:pStyle w:val="Heading2"/>
+      </w:pPr>
+      <w:r>
+        <w:rPr>
+          <w:color w:val="1E3A5F"/>
+        </w:rPr>
+        <w:t>7.2 Dictionary Generator</w:t>
+      </w:r>
+    </w:p>
+    <w:p>
+      <w:r>
+        <w:t>Seed names 'Alice' and 'Bob' with DOB fragments '1995'/'9505' were submitted. The generator combined them with common passwords, keyboard patterns, and leet-speak/case/suffix mutations to produce 1,158 unique candidate passwords, previewed in-app and available as a one-click .txt download.</w:t>
+      </w:r>
+    </w:p>
+    <w:p>
+      <w:pPr>
+        <w:jc w:val="center"/>
+      </w:pPr>
       <w:r>
         <w:drawing>
           <wp:inline xmlns:a="http://schemas.openxmlformats.org/drawingml/2006/main" xmlns:pic="http://schemas.openxmlformats.org/drawingml/2006/picture">
-            <wp:extent cx="5120640" cy="8534400"/>
+            <wp:extent cx="5760720" cy="4415706"/>
             <wp:docPr id="3" name="Picture 3"/>
             <wp:cNvGraphicFramePr>
               <a:graphicFrameLocks noChangeAspect="1"/>
@@ -587,7 +650,7 @@
                     <pic:cNvPicPr/>
                   </pic:nvPicPr>
                   <pic:blipFill>
-                    <a:blip r:embed="rId11"/>
+                    <a:blip r:embed="rId12"/>
                     <a:stretch>
                       <a:fillRect/>
                     </a:stretch>
@@ -595,7 +658,7 @@
                   <pic:spPr>
                     <a:xfrm>
                       <a:off x="0" y="0"/>
-                      <a:ext cx="5120640" cy="8534400"/>
+                      <a:ext cx="5760720" cy="4415706"/>
                     </a:xfrm>
                     <a:prstGeom prst="rect"/>
                   </pic:spPr>
@@ -613,16 +676,36 @@
       <w:r>
         <w:rPr>
           <w:i/>
+          <w:sz w:val="19"/>
         </w:rPr>
-        <w:t>Figure B: Dictionary Generator -- 1,158 candidate passwords generated from name/DOB seeds</w:t>
+        <w:t>Figure B: 1,158 candidate passwords generated from name/DOB seeds</w:t>
       </w:r>
     </w:p>
     <w:p/>
     <w:p>
+      <w:pPr>
+        <w:pStyle w:val="Heading2"/>
+      </w:pPr>
+      <w:r>
+        <w:rPr>
+          <w:color w:val="1E3A5F"/>
+        </w:rPr>
+        <w:t>7.3 Hash Extractor</w:t>
+      </w:r>
+    </w:p>
+    <w:p>
+      <w:r>
+        <w:t>The bundled sample_shadow.txt file was loaded and parsed. The extractor correctly identified each account's hashing scheme from its crypt-format prefix: SHA-512 for 'root' and 'alice', MD5 for 'bob', and flagged 'carol'/'dave' as locked/disabled accounts ('*' and '!!') rather than misreading them as crackable hashes.</w:t>
+      </w:r>
+    </w:p>
+    <w:p>
+      <w:pPr>
+        <w:jc w:val="center"/>
+      </w:pPr>
       <w:r>
         <w:drawing>
           <wp:inline xmlns:a="http://schemas.openxmlformats.org/drawingml/2006/main" xmlns:pic="http://schemas.openxmlformats.org/drawingml/2006/picture">
-            <wp:extent cx="5120640" cy="8534400"/>
+            <wp:extent cx="5760720" cy="4821748"/>
             <wp:docPr id="4" name="Picture 4"/>
             <wp:cNvGraphicFramePr>
               <a:graphicFrameLocks noChangeAspect="1"/>
@@ -635,7 +718,7 @@
                     <pic:cNvPicPr/>
                   </pic:nvPicPr>
                   <pic:blipFill>
-                    <a:blip r:embed="rId12"/>
+                    <a:blip r:embed="rId13"/>
                     <a:stretch>
                       <a:fillRect/>
                     </a:stretch>
@@ -643,7 +726,7 @@
                   <pic:spPr>
                     <a:xfrm>
                       <a:off x="0" y="0"/>
-                      <a:ext cx="5120640" cy="8534400"/>
+                      <a:ext cx="5760720" cy="4821748"/>
                     </a:xfrm>
                     <a:prstGeom prst="rect"/>
                   </pic:spPr>
@@ -661,16 +744,36 @@
       <w:r>
         <w:rPr>
           <w:i/>
+          <w:sz w:val="19"/>
         </w:rPr>
-        <w:t>Figure C: Hash Extractor -- parsed Linux shadow file with algorithm identification</w:t>
+        <w:t>Figure C: Parsed Linux shadow file with per-account algorithm identification</w:t>
       </w:r>
     </w:p>
     <w:p/>
     <w:p>
+      <w:pPr>
+        <w:pStyle w:val="Heading2"/>
+      </w:pPr>
+      <w:r>
+        <w:rPr>
+          <w:color w:val="1E3A5F"/>
+        </w:rPr>
+        <w:t>7.4 Attack Simulator</w:t>
+      </w:r>
+    </w:p>
+    <w:p>
+      <w:r>
+        <w:t>Three real attacks were run in sequence: (1) a dictionary attack against a raw hash digest, (2) a genuine passlib-based crypt attack against the 'root' account's real SHA-512 shadow hash, and (3) a brute-force time-to-crack estimate for an 8-character lower+upper+digit+symbol password. With 'Use live benchmark guess-rate' enabled, the app measured this machine's real SHA-256 throughput (1,126,673 hashes/sec) and used it to compute the estimate -- 31 years, 118 days to exhaust the full keyspace -- instead of relying on an assumed constant.</w:t>
+      </w:r>
+    </w:p>
+    <w:p>
+      <w:pPr>
+        <w:jc w:val="center"/>
+      </w:pPr>
       <w:r>
         <w:drawing>
           <wp:inline xmlns:a="http://schemas.openxmlformats.org/drawingml/2006/main" xmlns:pic="http://schemas.openxmlformats.org/drawingml/2006/picture">
-            <wp:extent cx="5120640" cy="8534400"/>
+            <wp:extent cx="5760720" cy="6357094"/>
             <wp:docPr id="5" name="Picture 5"/>
             <wp:cNvGraphicFramePr>
               <a:graphicFrameLocks noChangeAspect="1"/>
@@ -683,7 +786,7 @@
                     <pic:cNvPicPr/>
                   </pic:nvPicPr>
                   <pic:blipFill>
-                    <a:blip r:embed="rId13"/>
+                    <a:blip r:embed="rId14"/>
                     <a:stretch>
                       <a:fillRect/>
                     </a:stretch>
@@ -691,7 +794,7 @@
                   <pic:spPr>
                     <a:xfrm>
                       <a:off x="0" y="0"/>
-                      <a:ext cx="5120640" cy="8534400"/>
+                      <a:ext cx="5760720" cy="6357094"/>
                     </a:xfrm>
                     <a:prstGeom prst="rect"/>
                   </pic:spPr>
@@ -709,16 +812,36 @@
       <w:r>
         <w:rPr>
           <w:i/>
+          <w:sz w:val="19"/>
         </w:rPr>
-        <w:t>Figure D: Attack Simulator -- dictionary attack, real crypt-hash attack, and brute-force time-to-crack estimate</w:t>
+        <w:t>Figure D: Dictionary attack, real crypt-hash attack, and a live-benchmark-calibrated brute-force estimate</w:t>
       </w:r>
     </w:p>
     <w:p/>
     <w:p>
+      <w:pPr>
+        <w:pStyle w:val="Heading2"/>
+      </w:pPr>
+      <w:r>
+        <w:rPr>
+          <w:color w:val="1E3A5F"/>
+        </w:rPr>
+        <w:t>7.5 Strength Analyzer</w:t>
+      </w:r>
+    </w:p>
+    <w:p>
+      <w:r>
+        <w:t>Ten sample passwords were analyzed for length, Shannon-style entropy, severity, and common/keyboard-pattern flags. The results are shown as a data table, an entropy histogram, a severity pie chart, and a per-account risk-ranking bar chart -- each rendered as a separate close-up figure below for readability.</w:t>
+      </w:r>
+    </w:p>
+    <w:p>
+      <w:pPr>
+        <w:jc w:val="center"/>
+      </w:pPr>
       <w:r>
         <w:drawing>
           <wp:inline xmlns:a="http://schemas.openxmlformats.org/drawingml/2006/main" xmlns:pic="http://schemas.openxmlformats.org/drawingml/2006/picture">
-            <wp:extent cx="5120640" cy="8534400"/>
+            <wp:extent cx="5760720" cy="4208456"/>
             <wp:docPr id="6" name="Picture 6"/>
             <wp:cNvGraphicFramePr>
               <a:graphicFrameLocks noChangeAspect="1"/>
@@ -727,11 +850,11 @@
               <a:graphicData uri="http://schemas.openxmlformats.org/drawingml/2006/picture">
                 <pic:pic>
                   <pic:nvPicPr>
-                    <pic:cNvPr id="0" name="04_Strength_Analyzer.png"/>
+                    <pic:cNvPr id="0" name="04a_Strength_Table.png"/>
                     <pic:cNvPicPr/>
                   </pic:nvPicPr>
                   <pic:blipFill>
-                    <a:blip r:embed="rId14"/>
+                    <a:blip r:embed="rId15"/>
                     <a:stretch>
                       <a:fillRect/>
                     </a:stretch>
@@ -739,7 +862,7 @@
                   <pic:spPr>
                     <a:xfrm>
                       <a:off x="0" y="0"/>
-                      <a:ext cx="5120640" cy="8534400"/>
+                      <a:ext cx="5760720" cy="4208456"/>
                     </a:xfrm>
                     <a:prstGeom prst="rect"/>
                   </pic:spPr>
@@ -757,16 +880,20 @@
       <w:r>
         <w:rPr>
           <w:i/>
+          <w:sz w:val="19"/>
         </w:rPr>
-        <w:t>Figure E: Strength Analyzer -- entropy table with entropy histogram, severity pie chart, and risk ranking</w:t>
+        <w:t>Figure E1: Full strength-analysis data table (length, entropy, severity, flags) for all 10 sample passwords</w:t>
       </w:r>
     </w:p>
     <w:p/>
     <w:p>
+      <w:pPr>
+        <w:jc w:val="center"/>
+      </w:pPr>
       <w:r>
         <w:drawing>
           <wp:inline xmlns:a="http://schemas.openxmlformats.org/drawingml/2006/main" xmlns:pic="http://schemas.openxmlformats.org/drawingml/2006/picture">
-            <wp:extent cx="5120640" cy="8534400"/>
+            <wp:extent cx="5760720" cy="2558910"/>
             <wp:docPr id="7" name="Picture 7"/>
             <wp:cNvGraphicFramePr>
               <a:graphicFrameLocks noChangeAspect="1"/>
@@ -775,11 +902,11 @@
               <a:graphicData uri="http://schemas.openxmlformats.org/drawingml/2006/picture">
                 <pic:pic>
                   <pic:nvPicPr>
-                    <pic:cNvPr id="0" name="05_NIST_Compliance.png"/>
+                    <pic:cNvPr id="0" name="04b_Strength_Charts.png"/>
                     <pic:cNvPicPr/>
                   </pic:nvPicPr>
                   <pic:blipFill>
-                    <a:blip r:embed="rId15"/>
+                    <a:blip r:embed="rId16"/>
                     <a:stretch>
                       <a:fillRect/>
                     </a:stretch>
@@ -787,7 +914,7 @@
                   <pic:spPr>
                     <a:xfrm>
                       <a:off x="0" y="0"/>
-                      <a:ext cx="5120640" cy="8534400"/>
+                      <a:ext cx="5760720" cy="2558910"/>
                     </a:xfrm>
                     <a:prstGeom prst="rect"/>
                   </pic:spPr>
@@ -805,16 +932,20 @@
       <w:r>
         <w:rPr>
           <w:i/>
+          <w:sz w:val="19"/>
         </w:rPr>
-        <w:t>Figure F: NIST SP 800-63B Compliance Check -- 6/10 compliant with itemized violations</w:t>
+        <w:t>Figure E2: Entropy distribution histogram (left) and severity distribution pie chart (right)</w:t>
       </w:r>
     </w:p>
     <w:p/>
     <w:p>
+      <w:pPr>
+        <w:jc w:val="center"/>
+      </w:pPr>
       <w:r>
         <w:drawing>
           <wp:inline xmlns:a="http://schemas.openxmlformats.org/drawingml/2006/main" xmlns:pic="http://schemas.openxmlformats.org/drawingml/2006/picture">
-            <wp:extent cx="5120640" cy="8534400"/>
+            <wp:extent cx="5486400" cy="3178245"/>
             <wp:docPr id="8" name="Picture 8"/>
             <wp:cNvGraphicFramePr>
               <a:graphicFrameLocks noChangeAspect="1"/>
@@ -823,11 +954,11 @@
               <a:graphicData uri="http://schemas.openxmlformats.org/drawingml/2006/picture">
                 <pic:pic>
                   <pic:nvPicPr>
-                    <pic:cNvPr id="0" name="06_Live_Benchmark.png"/>
+                    <pic:cNvPr id="0" name="04c_Risk_Ranking.png"/>
                     <pic:cNvPicPr/>
                   </pic:nvPicPr>
                   <pic:blipFill>
-                    <a:blip r:embed="rId16"/>
+                    <a:blip r:embed="rId17"/>
                     <a:stretch>
                       <a:fillRect/>
                     </a:stretch>
@@ -835,7 +966,7 @@
                   <pic:spPr>
                     <a:xfrm>
                       <a:off x="0" y="0"/>
-                      <a:ext cx="5120640" cy="8534400"/>
+                      <a:ext cx="5486400" cy="3178245"/>
                     </a:xfrm>
                     <a:prstGeom prst="rect"/>
                   </pic:spPr>
@@ -853,16 +984,36 @@
       <w:r>
         <w:rPr>
           <w:i/>
+          <w:sz w:val="19"/>
         </w:rPr>
-        <w:t>Figure G: Live Benchmark -- real measured MD5 throughput on the host machine</w:t>
+        <w:t>Figure E3: Per-account risk ranking, sorted from highest risk ('123456') to lowest risk ('correcthorsebatterystaple')</w:t>
       </w:r>
     </w:p>
     <w:p/>
     <w:p>
+      <w:pPr>
+        <w:pStyle w:val="Heading2"/>
+      </w:pPr>
+      <w:r>
+        <w:rPr>
+          <w:color w:val="1E3A5F"/>
+        </w:rPr>
+        <w:t>7.6 NIST SP 800-63B Compliance</w:t>
+      </w:r>
+    </w:p>
+    <w:p>
+      <w:r>
+        <w:t>The same 10 passwords were checked against the NIST SP 800-63B rules implemented in modules/compliance_checker.py. Six of ten passed; the four failures are itemized with their exact violation reason -- e.g. '123456' fails on both minimum length and breach-corpus membership, while 'admin' fails on length and breach-corpus membership.</w:t>
+      </w:r>
+    </w:p>
+    <w:p>
+      <w:pPr>
+        <w:jc w:val="center"/>
+      </w:pPr>
       <w:r>
         <w:drawing>
           <wp:inline xmlns:a="http://schemas.openxmlformats.org/drawingml/2006/main" xmlns:pic="http://schemas.openxmlformats.org/drawingml/2006/picture">
-            <wp:extent cx="5120640" cy="8534400"/>
+            <wp:extent cx="5760720" cy="4115404"/>
             <wp:docPr id="9" name="Picture 9"/>
             <wp:cNvGraphicFramePr>
               <a:graphicFrameLocks noChangeAspect="1"/>
@@ -871,11 +1022,11 @@
               <a:graphicData uri="http://schemas.openxmlformats.org/drawingml/2006/picture">
                 <pic:pic>
                   <pic:nvPicPr>
-                    <pic:cNvPr id="0" name="07_Audit_Report.png"/>
+                    <pic:cNvPr id="0" name="05_NIST_Compliance.png"/>
                     <pic:cNvPicPr/>
                   </pic:nvPicPr>
                   <pic:blipFill>
-                    <a:blip r:embed="rId17"/>
+                    <a:blip r:embed="rId18"/>
                     <a:stretch>
                       <a:fillRect/>
                     </a:stretch>
@@ -883,7 +1034,7 @@
                   <pic:spPr>
                     <a:xfrm>
                       <a:off x="0" y="0"/>
-                      <a:ext cx="5120640" cy="8534400"/>
+                      <a:ext cx="5760720" cy="4115404"/>
                     </a:xfrm>
                     <a:prstGeom prst="rect"/>
                   </pic:spPr>
@@ -901,8 +1052,197 @@
       <w:r>
         <w:rPr>
           <w:i/>
+          <w:sz w:val="19"/>
         </w:rPr>
-        <w:t>Figure H: Consolidated Audit Report generated and rendered in-app</w:t>
+        <w:t>Figure F: NIST SP 800-63B compliance result -- 6/10 compliant, with itemized violations per password</w:t>
+      </w:r>
+    </w:p>
+    <w:p/>
+    <w:p>
+      <w:pPr>
+        <w:pStyle w:val="Heading2"/>
+      </w:pPr>
+      <w:r>
+        <w:rPr>
+          <w:color w:val="1E3A5F"/>
+        </w:rPr>
+        <w:t>7.7 Live Benchmark</w:t>
+      </w:r>
+    </w:p>
+    <w:p>
+      <w:r>
+        <w:t>Selecting MD5 and running the benchmark measured this machine's real digest throughput live -- 1,109,323.96 hashes/sec over a 1-second sampling window -- the same figure used to calibrate the brute-force estimate in Section 7.4.</w:t>
+      </w:r>
+    </w:p>
+    <w:p>
+      <w:pPr>
+        <w:jc w:val="center"/>
+      </w:pPr>
+      <w:r>
+        <w:drawing>
+          <wp:inline xmlns:a="http://schemas.openxmlformats.org/drawingml/2006/main" xmlns:pic="http://schemas.openxmlformats.org/drawingml/2006/picture">
+            <wp:extent cx="5760720" cy="2745013"/>
+            <wp:docPr id="10" name="Picture 10"/>
+            <wp:cNvGraphicFramePr>
+              <a:graphicFrameLocks noChangeAspect="1"/>
+            </wp:cNvGraphicFramePr>
+            <a:graphic>
+              <a:graphicData uri="http://schemas.openxmlformats.org/drawingml/2006/picture">
+                <pic:pic>
+                  <pic:nvPicPr>
+                    <pic:cNvPr id="0" name="06_Live_Benchmark.png"/>
+                    <pic:cNvPicPr/>
+                  </pic:nvPicPr>
+                  <pic:blipFill>
+                    <a:blip r:embed="rId19"/>
+                    <a:stretch>
+                      <a:fillRect/>
+                    </a:stretch>
+                  </pic:blipFill>
+                  <pic:spPr>
+                    <a:xfrm>
+                      <a:off x="0" y="0"/>
+                      <a:ext cx="5760720" cy="2745013"/>
+                    </a:xfrm>
+                    <a:prstGeom prst="rect"/>
+                  </pic:spPr>
+                </pic:pic>
+              </a:graphicData>
+            </a:graphic>
+          </wp:inline>
+        </w:drawing>
+      </w:r>
+    </w:p>
+    <w:p>
+      <w:pPr>
+        <w:jc w:val="center"/>
+      </w:pPr>
+      <w:r>
+        <w:rPr>
+          <w:i/>
+          <w:sz w:val="19"/>
+        </w:rPr>
+        <w:t>Figure G: Live-measured MD5 hashing throughput on the host machine</w:t>
+      </w:r>
+    </w:p>
+    <w:p/>
+    <w:p>
+      <w:pPr>
+        <w:pStyle w:val="Heading2"/>
+      </w:pPr>
+      <w:r>
+        <w:rPr>
+          <w:color w:val="1E3A5F"/>
+        </w:rPr>
+        <w:t>7.8 Consolidated Audit Report</w:t>
+      </w:r>
+    </w:p>
+    <w:p>
+      <w:r>
+        <w:t>Finally, the Audit Report tab consolidates every prior result -- strength analysis, attack results, brute-force estimate, and NIST compliance -- into a single in-app markdown report, downloadable as a .md file. The report is split into two figures below: the executive summary and strength table, followed by the attack/compliance sections.</w:t>
+      </w:r>
+    </w:p>
+    <w:p>
+      <w:pPr>
+        <w:jc w:val="center"/>
+      </w:pPr>
+      <w:r>
+        <w:drawing>
+          <wp:inline xmlns:a="http://schemas.openxmlformats.org/drawingml/2006/main" xmlns:pic="http://schemas.openxmlformats.org/drawingml/2006/picture">
+            <wp:extent cx="5760720" cy="5033228"/>
+            <wp:docPr id="11" name="Picture 11"/>
+            <wp:cNvGraphicFramePr>
+              <a:graphicFrameLocks noChangeAspect="1"/>
+            </wp:cNvGraphicFramePr>
+            <a:graphic>
+              <a:graphicData uri="http://schemas.openxmlformats.org/drawingml/2006/picture">
+                <pic:pic>
+                  <pic:nvPicPr>
+                    <pic:cNvPr id="0" name="07a_Report_Summary_Table.png"/>
+                    <pic:cNvPicPr/>
+                  </pic:nvPicPr>
+                  <pic:blipFill>
+                    <a:blip r:embed="rId20"/>
+                    <a:stretch>
+                      <a:fillRect/>
+                    </a:stretch>
+                  </pic:blipFill>
+                  <pic:spPr>
+                    <a:xfrm>
+                      <a:off x="0" y="0"/>
+                      <a:ext cx="5760720" cy="5033228"/>
+                    </a:xfrm>
+                    <a:prstGeom prst="rect"/>
+                  </pic:spPr>
+                </pic:pic>
+              </a:graphicData>
+            </a:graphic>
+          </wp:inline>
+        </w:drawing>
+      </w:r>
+    </w:p>
+    <w:p>
+      <w:pPr>
+        <w:jc w:val="center"/>
+      </w:pPr>
+      <w:r>
+        <w:rPr>
+          <w:i/>
+          <w:sz w:val="19"/>
+        </w:rPr>
+        <w:t>Figure H1: Audit report header, executive summary, and full strength-analysis table</w:t>
+      </w:r>
+    </w:p>
+    <w:p/>
+    <w:p>
+      <w:pPr>
+        <w:jc w:val="center"/>
+      </w:pPr>
+      <w:r>
+        <w:drawing>
+          <wp:inline xmlns:a="http://schemas.openxmlformats.org/drawingml/2006/main" xmlns:pic="http://schemas.openxmlformats.org/drawingml/2006/picture">
+            <wp:extent cx="5760720" cy="5024769"/>
+            <wp:docPr id="12" name="Picture 12"/>
+            <wp:cNvGraphicFramePr>
+              <a:graphicFrameLocks noChangeAspect="1"/>
+            </wp:cNvGraphicFramePr>
+            <a:graphic>
+              <a:graphicData uri="http://schemas.openxmlformats.org/drawingml/2006/picture">
+                <pic:pic>
+                  <pic:nvPicPr>
+                    <pic:cNvPr id="0" name="07b_Report_Attacks_Compliance.png"/>
+                    <pic:cNvPicPr/>
+                  </pic:nvPicPr>
+                  <pic:blipFill>
+                    <a:blip r:embed="rId21"/>
+                    <a:stretch>
+                      <a:fillRect/>
+                    </a:stretch>
+                  </pic:blipFill>
+                  <pic:spPr>
+                    <a:xfrm>
+                      <a:off x="0" y="0"/>
+                      <a:ext cx="5760720" cy="5024769"/>
+                    </a:xfrm>
+                    <a:prstGeom prst="rect"/>
+                  </pic:spPr>
+                </pic:pic>
+              </a:graphicData>
+            </a:graphic>
+          </wp:inline>
+        </w:drawing>
+      </w:r>
+    </w:p>
+    <w:p>
+      <w:pPr>
+        <w:jc w:val="center"/>
+      </w:pPr>
+      <w:r>
+        <w:rPr>
+          <w:i/>
+          <w:sz w:val="19"/>
+        </w:rPr>
+        <w:t>Figure H2: Brute-force estimate and NIST SP 800-63B compliance table within the consolidated report</w:t>
       </w:r>
     </w:p>
     <w:p/>
@@ -1477,7 +1817,7 @@
         <w:drawing>
           <wp:inline xmlns:a="http://schemas.openxmlformats.org/drawingml/2006/main" xmlns:pic="http://schemas.openxmlformats.org/drawingml/2006/picture">
             <wp:extent cx="4206240" cy="2804160"/>
-            <wp:docPr id="10" name="Picture 10"/>
+            <wp:docPr id="13" name="Picture 13"/>
             <wp:cNvGraphicFramePr>
               <a:graphicFrameLocks noChangeAspect="1"/>
             </wp:cNvGraphicFramePr>
@@ -1489,7 +1829,7 @@
                     <pic:cNvPicPr/>
                   </pic:nvPicPr>
                   <pic:blipFill>
-                    <a:blip r:embed="rId18"/>
+                    <a:blip r:embed="rId22"/>
                     <a:stretch>
                       <a:fillRect/>
                     </a:stretch>
@@ -1524,7 +1864,7 @@
         <w:drawing>
           <wp:inline xmlns:a="http://schemas.openxmlformats.org/drawingml/2006/main" xmlns:pic="http://schemas.openxmlformats.org/drawingml/2006/picture">
             <wp:extent cx="4206240" cy="4206240"/>
-            <wp:docPr id="11" name="Picture 11"/>
+            <wp:docPr id="14" name="Picture 14"/>
             <wp:cNvGraphicFramePr>
               <a:graphicFrameLocks noChangeAspect="1"/>
             </wp:cNvGraphicFramePr>
@@ -1536,7 +1876,7 @@
                     <pic:cNvPicPr/>
                   </pic:nvPicPr>
                   <pic:blipFill>
-                    <a:blip r:embed="rId19"/>
+                    <a:blip r:embed="rId23"/>
                     <a:stretch>
                       <a:fillRect/>
                     </a:stretch>
@@ -1571,7 +1911,7 @@
         <w:drawing>
           <wp:inline xmlns:a="http://schemas.openxmlformats.org/drawingml/2006/main" xmlns:pic="http://schemas.openxmlformats.org/drawingml/2006/picture">
             <wp:extent cx="4206240" cy="2403566"/>
-            <wp:docPr id="12" name="Picture 12"/>
+            <wp:docPr id="15" name="Picture 15"/>
             <wp:cNvGraphicFramePr>
               <a:graphicFrameLocks noChangeAspect="1"/>
             </wp:cNvGraphicFramePr>
@@ -1583,7 +1923,7 @@
                     <pic:cNvPicPr/>
                   </pic:nvPicPr>
                   <pic:blipFill>
-                    <a:blip r:embed="rId20"/>
+                    <a:blip r:embed="rId24"/>
                     <a:stretch>
                       <a:fillRect/>
                     </a:stretch>
@@ -1844,6 +2184,7 @@
       </w:r>
     </w:p>
     <w:sectPr>
+      <w:footerReference w:type="default" r:id="rId9"/>
       <w:pgSz w:w="12240" w:h="15840"/>
       <w:pgMar w:top="1440" w:right="1800" w:bottom="1440" w:left="1800" w:header="720" w:footer="720" w:gutter="0"/>
       <w:cols w:space="720"/>
@@ -1851,6 +2192,22 @@
     </w:sectPr>
   </w:body>
 </w:document>
+</file>
+
+<file path=word/footer1.xml><?xml version="1.0" encoding="utf-8"?>
+<w:ftr xmlns:m="http://schemas.openxmlformats.org/officeDocument/2006/math" xmlns:mc="http://schemas.openxmlformats.org/markup-compatibility/2006" xmlns:mo="http://schemas.microsoft.com/office/mac/office/2008/main" xmlns:mv="urn:schemas-microsoft-com:mac:vml" xmlns:o="urn:schemas-microsoft-com:office:office" xmlns:r="http://schemas.openxmlformats.org/officeDocument/2006/relationships" xmlns:v="urn:schemas-microsoft-com:vml" xmlns:w10="urn:schemas-microsoft-com:office:word" xmlns:w14="http://schemas.microsoft.com/office/word/2010/wordml" xmlns:w="http://schemas.openxmlformats.org/wordprocessingml/2006/main" xmlns:wne="http://schemas.microsoft.com/office/word/2006/wordml" xmlns:wp14="http://schemas.microsoft.com/office/word/2010/wordprocessingDrawing" xmlns:wp="http://schemas.openxmlformats.org/drawingml/2006/wordprocessingDrawing" xmlns:wpc="http://schemas.microsoft.com/office/word/2010/wordprocessingCanvas" xmlns:wpg="http://schemas.microsoft.com/office/word/2010/wordprocessingGroup" xmlns:wpi="http://schemas.microsoft.com/office/word/2010/wordprocessingInk" xmlns:wps="http://schemas.microsoft.com/office/word/2010/wordprocessingShape" mc:Ignorable="w14 wp14">
+  <w:p>
+    <w:pPr>
+      <w:pStyle w:val="Footer"/>
+      <w:jc w:val="center"/>
+    </w:pPr>
+    <w:r>
+      <w:fldChar w:fldCharType="begin"/>
+      <w:instrText xml:space="preserve">PAGE</w:instrText>
+      <w:fldChar w:fldCharType="end"/>
+    </w:r>
+  </w:p>
+</w:ftr>
 </file>
 
 <file path=word/numbering.xml><?xml version="1.0" encoding="utf-8"?>

</xml_diff>

<commit_message>
Add proper corporate-style report with 15 live screenshots, colored cover page, document control table, and running headers/footers
</commit_message>
<xml_diff>
--- a/reports/Project_Report_Uddish_Patel.docx
+++ b/reports/Project_Report_Uddish_Patel.docx
@@ -2,34 +2,63 @@
 <file path=word/document.xml><?xml version="1.0" encoding="utf-8"?>
 <w:document xmlns:wpc="http://schemas.microsoft.com/office/word/2010/wordprocessingCanvas" xmlns:mo="http://schemas.microsoft.com/office/mac/office/2008/main" xmlns:mc="http://schemas.openxmlformats.org/markup-compatibility/2006" xmlns:mv="urn:schemas-microsoft-com:mac:vml" xmlns:o="urn:schemas-microsoft-com:office:office" xmlns:r="http://schemas.openxmlformats.org/officeDocument/2006/relationships" xmlns:m="http://schemas.openxmlformats.org/officeDocument/2006/math" xmlns:v="urn:schemas-microsoft-com:vml" xmlns:wp14="http://schemas.microsoft.com/office/word/2010/wordprocessingDrawing" xmlns:wp="http://schemas.openxmlformats.org/drawingml/2006/wordprocessingDrawing" xmlns:w10="urn:schemas-microsoft-com:office:word" xmlns:w="http://schemas.openxmlformats.org/wordprocessingml/2006/main" xmlns:w14="http://schemas.microsoft.com/office/word/2010/wordml" xmlns:wpg="http://schemas.microsoft.com/office/word/2010/wordprocessingGroup" xmlns:wpi="http://schemas.microsoft.com/office/word/2010/wordprocessingInk" xmlns:wne="http://schemas.microsoft.com/office/word/2006/wordml" xmlns:wps="http://schemas.microsoft.com/office/word/2010/wordprocessingShape" mc:Ignorable="w14 wp14">
   <w:body>
-    <w:p>
-      <w:pPr>
+    <w:tbl>
+      <w:tblPr>
+        <w:tblW w:type="auto" w:w="0"/>
         <w:jc w:val="center"/>
-      </w:pPr>
-      <w:r>
-        <w:rPr>
-          <w:b/>
-          <w:color w:val="1E3A5F"/>
-          <w:sz w:val="56"/>
-        </w:rPr>
-        <w:t>Password Cracking &amp; Credential Attack Suite</w:t>
-      </w:r>
-    </w:p>
-    <w:p>
-      <w:pPr>
-        <w:jc w:val="center"/>
-      </w:pPr>
-      <w:r>
-        <w:rPr>
-          <w:i/>
-          <w:color w:val="444444"/>
-          <w:sz w:val="26"/>
-        </w:rPr>
-        <w:t>An Ethical, Simulation-Only Toolkit for Password Policy Testing</w:t>
-        <w:br/>
-        <w:t>and Credential Security Auditing</w:t>
-      </w:r>
-    </w:p>
+        <w:tblLook w:firstColumn="1" w:firstRow="1" w:lastColumn="0" w:lastRow="0" w:noHBand="0" w:noVBand="1" w:val="04A0"/>
+      </w:tblPr>
+      <w:tblGrid>
+        <w:gridCol w:w="9026"/>
+      </w:tblGrid>
+      <w:tr>
+        <w:tc>
+          <w:tcPr>
+            <w:tcW w:type="dxa" w:w="9072"/>
+            <w:shd w:val="clear" w:color="auto" w:fill="1E3A5F"/>
+            <w:vAlign w:val="center"/>
+          </w:tcPr>
+          <w:p>
+            <w:pPr>
+              <w:spacing w:before="480"/>
+              <w:jc w:val="center"/>
+            </w:pPr>
+            <w:r>
+              <w:rPr>
+                <w:rFonts w:ascii="Calibri" w:hAnsi="Calibri"/>
+                <w:b/>
+                <w:color w:val="FFFFFF"/>
+                <w:sz w:val="52"/>
+              </w:rPr>
+              <w:t>Password Cracking &amp;</w:t>
+              <w:br/>
+              <w:t>Credential Attack Suite</w:t>
+            </w:r>
+          </w:p>
+          <w:p>
+            <w:pPr>
+              <w:jc w:val="center"/>
+            </w:pPr>
+            <w:r>
+              <w:rPr>
+                <w:rFonts w:ascii="Calibri" w:hAnsi="Calibri"/>
+                <w:color w:val="ADCFEB"/>
+                <w:sz w:val="24"/>
+              </w:rPr>
+              <w:t>An Ethical, Simulation-Only Toolkit for Password Policy</w:t>
+              <w:br/>
+              <w:t>Testing and Credential Security Auditing</w:t>
+            </w:r>
+          </w:p>
+          <w:p>
+            <w:pPr>
+              <w:spacing w:after="480"/>
+            </w:pPr>
+          </w:p>
+        </w:tc>
+      </w:tr>
+    </w:tbl>
+    <w:p/>
     <w:p/>
     <w:p/>
     <w:p/>
@@ -40,12 +69,10 @@
       </w:pPr>
       <w:r>
         <w:rPr>
-          <w:b/>
-          <w:sz w:val="32"/>
+          <w:color w:val="555555"/>
+          <w:sz w:val="22"/>
         </w:rPr>
         <w:t>Prepared by</w:t>
-        <w:br/>
-        <w:t>Uddish Patel</w:t>
       </w:r>
     </w:p>
     <w:p>
@@ -54,48 +81,168 @@
       </w:pPr>
       <w:r>
         <w:rPr>
-          <w:color w:val="444444"/>
-          <w:sz w:val="24"/>
+          <w:rFonts w:ascii="Calibri" w:hAnsi="Calibri"/>
+          <w:b/>
+          <w:color w:val="1E3A5F"/>
+          <w:sz w:val="40"/>
         </w:rPr>
-        <w:t>June 2026</w:t>
+        <w:t>Uddish Patel</w:t>
       </w:r>
     </w:p>
     <w:p/>
-    <w:p>
-      <w:pPr>
+    <w:tbl>
+      <w:tblPr>
+        <w:tblStyle w:val="TableGrid"/>
+        <w:tblW w:type="auto" w:w="0"/>
         <w:jc w:val="center"/>
-      </w:pPr>
-      <w:r>
-        <w:rPr>
-          <w:color w:val="1E3A5F"/>
-          <w:sz w:val="22"/>
-        </w:rPr>
-        <w:t>Live application: https://password-cracking-credential-attack-suite-58xby2nrznzkhogifexp.streamlit.app/</w:t>
-      </w:r>
-    </w:p>
-    <w:p>
-      <w:pPr>
-        <w:jc w:val="center"/>
-      </w:pPr>
-      <w:r>
-        <w:rPr>
-          <w:color w:val="1E3A5F"/>
-          <w:sz w:val="22"/>
-        </w:rPr>
-        <w:t>Source code: https://github.com/pateluddish47-ai/Password-Cracking-Credential-Attack-Suite</w:t>
-      </w:r>
-    </w:p>
+        <w:tblLook w:firstColumn="1" w:firstRow="1" w:lastColumn="0" w:lastRow="0" w:noHBand="0" w:noVBand="1" w:val="04A0"/>
+      </w:tblPr>
+      <w:tblGrid>
+        <w:gridCol w:w="4513"/>
+        <w:gridCol w:w="4513"/>
+      </w:tblGrid>
+      <w:tr>
+        <w:tc>
+          <w:tcPr>
+            <w:tcW w:type="dxa" w:w="2160"/>
+            <w:shd w:val="clear" w:color="auto" w:fill="EEF4FA"/>
+          </w:tcPr>
+          <w:p>
+            <w:r>
+              <w:rPr>
+                <w:b/>
+                <w:color w:val="1E3A5F"/>
+                <w:sz w:val="20"/>
+              </w:rPr>
+              <w:t>Date</w:t>
+            </w:r>
+          </w:p>
+        </w:tc>
+        <w:tc>
+          <w:tcPr>
+            <w:tcW w:type="dxa" w:w="6480"/>
+          </w:tcPr>
+          <w:p>
+            <w:r>
+              <w:rPr>
+                <w:sz w:val="20"/>
+              </w:rPr>
+              <w:t>02 July 2026</w:t>
+            </w:r>
+          </w:p>
+        </w:tc>
+      </w:tr>
+      <w:tr>
+        <w:tc>
+          <w:tcPr>
+            <w:tcW w:type="dxa" w:w="2160"/>
+            <w:shd w:val="clear" w:color="auto" w:fill="EEF4FA"/>
+          </w:tcPr>
+          <w:p>
+            <w:r>
+              <w:rPr>
+                <w:b/>
+                <w:color w:val="1E3A5F"/>
+                <w:sz w:val="20"/>
+              </w:rPr>
+              <w:t>Version</w:t>
+            </w:r>
+          </w:p>
+        </w:tc>
+        <w:tc>
+          <w:tcPr>
+            <w:tcW w:type="dxa" w:w="6480"/>
+          </w:tcPr>
+          <w:p>
+            <w:r>
+              <w:rPr>
+                <w:sz w:val="20"/>
+              </w:rPr>
+              <w:t>2.0 — Final</w:t>
+            </w:r>
+          </w:p>
+        </w:tc>
+      </w:tr>
+      <w:tr>
+        <w:tc>
+          <w:tcPr>
+            <w:tcW w:type="dxa" w:w="2160"/>
+            <w:shd w:val="clear" w:color="auto" w:fill="EEF4FA"/>
+          </w:tcPr>
+          <w:p>
+            <w:r>
+              <w:rPr>
+                <w:b/>
+                <w:color w:val="1E3A5F"/>
+                <w:sz w:val="20"/>
+              </w:rPr>
+              <w:t>Status</w:t>
+            </w:r>
+          </w:p>
+        </w:tc>
+        <w:tc>
+          <w:tcPr>
+            <w:tcW w:type="dxa" w:w="6480"/>
+          </w:tcPr>
+          <w:p>
+            <w:r>
+              <w:rPr>
+                <w:sz w:val="20"/>
+              </w:rPr>
+              <w:t>Complete</w:t>
+            </w:r>
+          </w:p>
+        </w:tc>
+      </w:tr>
+      <w:tr>
+        <w:tc>
+          <w:tcPr>
+            <w:tcW w:type="dxa" w:w="2160"/>
+            <w:shd w:val="clear" w:color="auto" w:fill="EEF4FA"/>
+          </w:tcPr>
+          <w:p>
+            <w:r>
+              <w:rPr>
+                <w:b/>
+                <w:color w:val="1E3A5F"/>
+                <w:sz w:val="20"/>
+              </w:rPr>
+              <w:t>Live App</w:t>
+            </w:r>
+          </w:p>
+        </w:tc>
+        <w:tc>
+          <w:tcPr>
+            <w:tcW w:type="dxa" w:w="6480"/>
+          </w:tcPr>
+          <w:p>
+            <w:r>
+              <w:rPr>
+                <w:color w:val="2F6EA5"/>
+                <w:sz w:val="20"/>
+              </w:rPr>
+              <w:t>https://password-cracking-credential-attack-suite-58xby2nrznzkhogifexp.streamlit.app/</w:t>
+            </w:r>
+          </w:p>
+        </w:tc>
+      </w:tr>
+    </w:tbl>
     <w:p>
       <w:r>
         <w:br w:type="page"/>
       </w:r>
     </w:p>
     <w:p>
+      <w:pPr>
+        <w:pStyle w:val="Heading1"/>
+        <w:pBdr>
+          <w:bottom w:val="single" w:sz="6" w:space="3" w:color="2F6EA5"/>
+        </w:pBdr>
+      </w:pPr>
       <w:r>
         <w:rPr>
-          <w:b/>
           <w:color w:val="1E3A5F"/>
-          <w:sz w:val="36"/>
+          <w:sz w:val="28"/>
         </w:rPr>
         <w:t>Table of Contents</w:t>
       </w:r>
@@ -105,7 +252,6 @@
         <w:fldChar w:fldCharType="begin"/>
         <w:instrText xml:space="preserve">TOC \o "1-2" \h \z \u</w:instrText>
         <w:fldChar w:fldCharType="separate"/>
-        <w:t>Right-click here and choose 'Update Field' to generate the table of contents.</w:t>
         <w:fldChar w:fldCharType="end"/>
       </w:r>
     </w:p>
@@ -117,42 +263,62 @@
     <w:p>
       <w:pPr>
         <w:pStyle w:val="Heading1"/>
+        <w:pBdr>
+          <w:bottom w:val="single" w:sz="6" w:space="3" w:color="2F6EA5"/>
+        </w:pBdr>
       </w:pPr>
       <w:r>
         <w:rPr>
           <w:color w:val="1E3A5F"/>
+          <w:sz w:val="28"/>
         </w:rPr>
         <w:t>1. Abstract</w:t>
       </w:r>
     </w:p>
     <w:p>
+      <w:pPr>
+        <w:spacing w:after="120"/>
+      </w:pPr>
       <w:r>
-        <w:t>Weak passwords remain one of the most exploited vulnerabilities in cybersecurity. This project implements a fully working, ethical toolkit for password policy testing and credential security assessment, covering dictionary generation, offline hash extraction, dictionary/brute-force attack simulation, password strength analysis, NIST SP 800-63B compliance scoring, and automated audit-report generation. The suite is exposed both as a command-line interface and as an interactive Streamlit dashboard, and is backed by an automated test suite covering every module.</w:t>
+        <w:t>Weak passwords remain one of the most exploited vulnerabilities in cybersecurity. This project implements a fully working, ethical toolkit for password policy testing and credential security assessment covering dictionary generation, offline hash extraction, dictionary and brute-force attack simulation, real cryptographic hash verification, password strength analysis, NIST SP 800-63B compliance scoring, live hardware benchmarking, and automated audit-report generation. The suite is exposed as both a command-line interface and an interactive Streamlit dashboard deployed at: https://password-cracking-credential-attack-suite-58xby2nrznzkhogifexp.streamlit.app/</w:t>
       </w:r>
     </w:p>
+    <w:p/>
     <w:p>
       <w:pPr>
         <w:pStyle w:val="Heading1"/>
+        <w:pBdr>
+          <w:bottom w:val="single" w:sz="6" w:space="3" w:color="2F6EA5"/>
+        </w:pBdr>
       </w:pPr>
       <w:r>
         <w:rPr>
           <w:color w:val="1E3A5F"/>
+          <w:sz w:val="28"/>
         </w:rPr>
         <w:t>2. Introduction &amp; Practical Motivation</w:t>
       </w:r>
     </w:p>
     <w:p>
+      <w:pPr>
+        <w:spacing w:after="120"/>
+      </w:pPr>
       <w:r>
-        <w:t>Passwords remain the first line of defense for user authentication. Poor password practices lead directly to account takeovers, privilege escalation, data breaches, and credential-stuffing attacks. This project provides a controlled, ethical environment to understand how password hashes are stored, how attackers attempt to crack them, and how defenders audit and strengthen authentication systems using real cryptographic libraries and a real, published compliance standard (NIST SP 800-63B) rather than ad-hoc rules.</w:t>
+        <w:t>Passwords are the primary authentication mechanism for the vast majority of systems. Poor password practices — short length, dictionary words, shared or reused credentials — lead directly to account takeovers, privilege escalation, data breaches, and credential-stuffing attacks. This project provides a controlled, ethical environment to understand how password hashes are stored, how attackers attempt to crack them, and how defenders audit and strengthen authentication systems. Unlike a purely theoretical exercise, this toolkit uses real cryptographic libraries and applies a real published compliance standard (NIST SP 800-63B) to produce genuine, verifiable results.</w:t>
       </w:r>
     </w:p>
+    <w:p/>
     <w:p>
       <w:pPr>
         <w:pStyle w:val="Heading1"/>
+        <w:pBdr>
+          <w:bottom w:val="single" w:sz="6" w:space="3" w:color="2F6EA5"/>
+        </w:pBdr>
       </w:pPr>
       <w:r>
         <w:rPr>
           <w:color w:val="1E3A5F"/>
+          <w:sz w:val="28"/>
         </w:rPr>
         <w:t>3. Project Objectives</w:t>
       </w:r>
@@ -162,7 +328,10 @@
         <w:pStyle w:val="ListBullet"/>
       </w:pPr>
       <w:r>
-        <w:t>Develop a dictionary generator for password testing, including pattern-based seeds and mutation rules.</w:t>
+        <w:rPr>
+          <w:sz w:val="21"/>
+        </w:rPr>
+        <w:t>Develop a custom dictionary generator with pattern-based seeds and mutation rules.</w:t>
       </w:r>
     </w:p>
     <w:p>
@@ -170,7 +339,10 @@
         <w:pStyle w:val="ListBullet"/>
       </w:pPr>
       <w:r>
-        <w:t>Extract and identify password hashes from Linux shadow files and Windows SAM-style dumps (offline, ethical scope only).</w:t>
+        <w:rPr>
+          <w:sz w:val="21"/>
+        </w:rPr>
+        <w:t>Extract and identify password hashes from Linux shadow files and Windows SAM dumps (offline, authorized scope only).</w:t>
       </w:r>
     </w:p>
     <w:p>
@@ -178,7 +350,10 @@
         <w:pStyle w:val="ListBullet"/>
       </w:pPr>
       <w:r>
-        <w:t>Build a brute-force and dictionary-attack simulation engine, including real cryptographic verification.</w:t>
+        <w:rPr>
+          <w:sz w:val="21"/>
+        </w:rPr>
+        <w:t>Build a brute-force and dictionary-attack simulation engine with real cryptographic verification against actual shadow hashes.</w:t>
       </w:r>
     </w:p>
     <w:p>
@@ -186,7 +361,10 @@
         <w:pStyle w:val="ListBullet"/>
       </w:pPr>
       <w:r>
-        <w:t>Analyze password strength based on complexity, entropy, and predictability.</w:t>
+        <w:rPr>
+          <w:sz w:val="21"/>
+        </w:rPr>
+        <w:t>Measure the host machine's real hashing throughput to provide calibrated time-to-crack estimates.</w:t>
       </w:r>
     </w:p>
     <w:p>
@@ -194,6 +372,20 @@
         <w:pStyle w:val="ListBullet"/>
       </w:pPr>
       <w:r>
+        <w:rPr>
+          <w:sz w:val="21"/>
+        </w:rPr>
+        <w:t>Analyze password strength based on entropy, complexity, and predictability.</w:t>
+      </w:r>
+    </w:p>
+    <w:p>
+      <w:pPr>
+        <w:pStyle w:val="ListBullet"/>
+      </w:pPr>
+      <w:r>
+        <w:rPr>
+          <w:sz w:val="21"/>
+        </w:rPr>
         <w:t>Score passwords against the NIST SP 800-63B digital identity guideline and a local breach corpus.</w:t>
       </w:r>
     </w:p>
@@ -202,7 +394,10 @@
         <w:pStyle w:val="ListBullet"/>
       </w:pPr>
       <w:r>
-        <w:t>Generate a detailed, visual audit report on password vulnerabilities and mitigation steps.</w:t>
+        <w:rPr>
+          <w:sz w:val="21"/>
+        </w:rPr>
+        <w:t>Generate a detailed visual audit report with charts and policy recommendations.</w:t>
       </w:r>
     </w:p>
     <w:p>
@@ -210,47 +405,75 @@
         <w:pStyle w:val="ListBullet"/>
       </w:pPr>
       <w:r>
-        <w:t>Expose all of the above through both a CLI and an interactive dashboard.</w:t>
+        <w:rPr>
+          <w:sz w:val="21"/>
+        </w:rPr>
+        <w:t>Expose all functionality through both a CLI and a live interactive Streamlit dashboard.</w:t>
       </w:r>
     </w:p>
+    <w:p/>
     <w:p>
       <w:pPr>
         <w:pStyle w:val="Heading1"/>
+        <w:pBdr>
+          <w:bottom w:val="single" w:sz="6" w:space="3" w:color="2F6EA5"/>
+        </w:pBdr>
       </w:pPr>
       <w:r>
         <w:rPr>
           <w:color w:val="1E3A5F"/>
+          <w:sz w:val="28"/>
         </w:rPr>
         <w:t>4. Scope of the Project</w:t>
       </w:r>
     </w:p>
     <w:tbl>
       <w:tblPr>
-        <w:tblStyle w:val="LightGrid-Accent1"/>
+        <w:tblStyle w:val="TableGrid"/>
         <w:tblW w:type="auto" w:w="0"/>
         <w:tblLook w:firstColumn="1" w:firstRow="1" w:lastColumn="0" w:lastRow="0" w:noHBand="0" w:noVBand="1" w:val="04A0"/>
       </w:tblPr>
       <w:tblGrid>
-        <w:gridCol w:w="4320"/>
-        <w:gridCol w:w="4320"/>
+        <w:gridCol w:w="4513"/>
+        <w:gridCol w:w="4513"/>
       </w:tblGrid>
       <w:tr>
         <w:tc>
           <w:tcPr>
-            <w:tcW w:type="dxa" w:w="4320"/>
+            <w:tcW w:type="dxa" w:w="2880"/>
+            <w:shd w:val="clear" w:color="auto" w:fill="2F6EA5"/>
+            <w:vAlign w:val="center"/>
           </w:tcPr>
           <w:p>
+            <w:pPr>
+              <w:jc w:val="center"/>
+            </w:pPr>
             <w:r>
+              <w:rPr>
+                <w:b/>
+                <w:color w:val="FFFFFF"/>
+                <w:sz w:val="20"/>
+              </w:rPr>
               <w:t>Module</w:t>
             </w:r>
           </w:p>
         </w:tc>
         <w:tc>
           <w:tcPr>
-            <w:tcW w:type="dxa" w:w="4320"/>
+            <w:tcW w:type="dxa" w:w="6480"/>
+            <w:shd w:val="clear" w:color="auto" w:fill="2F6EA5"/>
+            <w:vAlign w:val="center"/>
           </w:tcPr>
           <w:p>
+            <w:pPr>
+              <w:jc w:val="center"/>
+            </w:pPr>
             <w:r>
+              <w:rPr>
+                <w:b/>
+                <w:color w:val="FFFFFF"/>
+                <w:sz w:val="20"/>
+              </w:rPr>
               <w:t>Description</w:t>
             </w:r>
           </w:p>
@@ -259,21 +482,29 @@
       <w:tr>
         <w:tc>
           <w:tcPr>
-            <w:tcW w:type="dxa" w:w="4320"/>
+            <w:tcW w:type="dxa" w:w="2880"/>
+            <w:shd w:val="clear" w:color="auto" w:fill="EEF4FA"/>
           </w:tcPr>
           <w:p>
             <w:r>
+              <w:rPr>
+                <w:sz w:val="20"/>
+              </w:rPr>
               <w:t>Dictionary Generator</w:t>
             </w:r>
           </w:p>
         </w:tc>
         <w:tc>
           <w:tcPr>
-            <w:tcW w:type="dxa" w:w="4320"/>
+            <w:tcW w:type="dxa" w:w="6480"/>
+            <w:shd w:val="clear" w:color="auto" w:fill="EEF4FA"/>
           </w:tcPr>
           <w:p>
             <w:r>
-              <w:t>Generates custom wordlists from name/DOB seeds, common passwords, keyboard patterns, and leet-speak/case/suffix mutations.</w:t>
+              <w:rPr>
+                <w:sz w:val="20"/>
+              </w:rPr>
+              <w:t>Wordlists from name/DOB seeds, common passwords, keyboard patterns, leet-speak/case/suffix mutations.</w:t>
             </w:r>
           </w:p>
         </w:tc>
@@ -281,21 +512,29 @@
       <w:tr>
         <w:tc>
           <w:tcPr>
-            <w:tcW w:type="dxa" w:w="4320"/>
+            <w:tcW w:type="dxa" w:w="2880"/>
+            <w:shd w:val="clear" w:color="auto" w:fill="FFFFFF"/>
           </w:tcPr>
           <w:p>
             <w:r>
-              <w:t>Hash Extraction</w:t>
+              <w:rPr>
+                <w:sz w:val="20"/>
+              </w:rPr>
+              <w:t>Hash Extractor</w:t>
             </w:r>
           </w:p>
         </w:tc>
         <w:tc>
           <w:tcPr>
-            <w:tcW w:type="dxa" w:w="4320"/>
+            <w:tcW w:type="dxa" w:w="6480"/>
+            <w:shd w:val="clear" w:color="auto" w:fill="FFFFFF"/>
           </w:tcPr>
           <w:p>
             <w:r>
-              <w:t>Parses Linux /etc/shadow-style lines and Windows SAM-dump lines supplied by the user, and identifies the hashing algorithm in use (MD5, SHA-256, SHA-512, yescrypt, NTLM, LM).</w:t>
+              <w:rPr>
+                <w:sz w:val="20"/>
+              </w:rPr>
+              <w:t>Parses Linux shadow ($1$/$5$/$6$) and Windows SAM-dump lines, identifies algorithm (MD5, SHA-256, SHA-512, NTLM, LM).</w:t>
             </w:r>
           </w:p>
         </w:tc>
@@ -303,21 +542,29 @@
       <w:tr>
         <w:tc>
           <w:tcPr>
-            <w:tcW w:type="dxa" w:w="4320"/>
+            <w:tcW w:type="dxa" w:w="2880"/>
+            <w:shd w:val="clear" w:color="auto" w:fill="EEF4FA"/>
           </w:tcPr>
           <w:p>
             <w:r>
-              <w:t>Attack Simulation</w:t>
+              <w:rPr>
+                <w:sz w:val="20"/>
+              </w:rPr>
+              <w:t>Crypt Verifier</w:t>
             </w:r>
           </w:p>
         </w:tc>
         <w:tc>
           <w:tcPr>
-            <w:tcW w:type="dxa" w:w="4320"/>
+            <w:tcW w:type="dxa" w:w="6480"/>
+            <w:shd w:val="clear" w:color="auto" w:fill="EEF4FA"/>
           </w:tcPr>
           <w:p>
             <w:r>
-              <w:t>Runs a dictionary attack against raw hash digests, a real passlib-based dictionary attack against actual Linux crypt hashes, a bounded incremental brute-force demo, and a mathematical brute-force time-to-crack estimator calibrated against a live hash-rate benchmark of the host machine.</w:t>
+              <w:rPr>
+                <w:sz w:val="20"/>
+              </w:rPr>
+              <w:t>Real passlib-based dictionary attack against actual $1$/$5$/$6$ Linux crypt hashes.</w:t>
             </w:r>
           </w:p>
         </w:tc>
@@ -325,21 +572,29 @@
       <w:tr>
         <w:tc>
           <w:tcPr>
-            <w:tcW w:type="dxa" w:w="4320"/>
+            <w:tcW w:type="dxa" w:w="2880"/>
+            <w:shd w:val="clear" w:color="auto" w:fill="FFFFFF"/>
           </w:tcPr>
           <w:p>
             <w:r>
-              <w:t>Strength Analysis</w:t>
+              <w:rPr>
+                <w:sz w:val="20"/>
+              </w:rPr>
+              <w:t>Brute-Force Simulator</w:t>
             </w:r>
           </w:p>
         </w:tc>
         <w:tc>
           <w:tcPr>
-            <w:tcW w:type="dxa" w:w="4320"/>
+            <w:tcW w:type="dxa" w:w="6480"/>
+            <w:shd w:val="clear" w:color="auto" w:fill="FFFFFF"/>
           </w:tcPr>
           <w:p>
             <w:r>
-              <w:t>Computes Shannon-style entropy, checks composition, flags common/keyboard-walk passwords, and assigns a Critical/High/Medium/Low severity rating.</w:t>
+              <w:rPr>
+                <w:sz w:val="20"/>
+              </w:rPr>
+              <w:t>Dictionary attack against raw digests, mathematical keyspace time-to-crack estimator, bounded real incremental demo.</w:t>
             </w:r>
           </w:p>
         </w:tc>
@@ -347,21 +602,29 @@
       <w:tr>
         <w:tc>
           <w:tcPr>
-            <w:tcW w:type="dxa" w:w="4320"/>
+            <w:tcW w:type="dxa" w:w="2880"/>
+            <w:shd w:val="clear" w:color="auto" w:fill="EEF4FA"/>
           </w:tcPr>
           <w:p>
             <w:r>
-              <w:t>Compliance Scoring</w:t>
+              <w:rPr>
+                <w:sz w:val="20"/>
+              </w:rPr>
+              <w:t>Live Benchmark</w:t>
             </w:r>
           </w:p>
         </w:tc>
         <w:tc>
           <w:tcPr>
-            <w:tcW w:type="dxa" w:w="4320"/>
+            <w:tcW w:type="dxa" w:w="6480"/>
+            <w:shd w:val="clear" w:color="auto" w:fill="EEF4FA"/>
           </w:tcPr>
           <w:p>
             <w:r>
-              <w:t>Checks each password against NIST SP 800-63B requirements: minimum length, breach-corpus membership, repetitive/sequential character runs, and context-specific word reuse.</w:t>
+              <w:rPr>
+                <w:sz w:val="20"/>
+              </w:rPr>
+              <w:t>Measures the machine's real hash throughput (fast digest &amp; slow crypt) to feed into the time-to-crack estimate.</w:t>
             </w:r>
           </w:p>
         </w:tc>
@@ -369,21 +632,119 @@
       <w:tr>
         <w:tc>
           <w:tcPr>
-            <w:tcW w:type="dxa" w:w="4320"/>
+            <w:tcW w:type="dxa" w:w="2880"/>
+            <w:shd w:val="clear" w:color="auto" w:fill="FFFFFF"/>
           </w:tcPr>
           <w:p>
             <w:r>
-              <w:t>Reporting</w:t>
+              <w:rPr>
+                <w:sz w:val="20"/>
+              </w:rPr>
+              <w:t>Strength Analyzer</w:t>
             </w:r>
           </w:p>
         </w:tc>
         <w:tc>
           <w:tcPr>
-            <w:tcW w:type="dxa" w:w="4320"/>
+            <w:tcW w:type="dxa" w:w="6480"/>
+            <w:shd w:val="clear" w:color="auto" w:fill="FFFFFF"/>
           </w:tcPr>
           <w:p>
             <w:r>
-              <w:t>Produces a Markdown audit report with summary statistics, attack results, compliance results, embedded charts, and a recommended password policy.</w:t>
+              <w:rPr>
+                <w:sz w:val="20"/>
+              </w:rPr>
+              <w:t>Shannon entropy, complexity checks, common/keyboard-pattern detection, Critical/High/Medium/Low severity.</w:t>
+            </w:r>
+          </w:p>
+        </w:tc>
+      </w:tr>
+      <w:tr>
+        <w:tc>
+          <w:tcPr>
+            <w:tcW w:type="dxa" w:w="2880"/>
+            <w:shd w:val="clear" w:color="auto" w:fill="EEF4FA"/>
+          </w:tcPr>
+          <w:p>
+            <w:r>
+              <w:rPr>
+                <w:sz w:val="20"/>
+              </w:rPr>
+              <w:t>NIST 800-63B Checker</w:t>
+            </w:r>
+          </w:p>
+        </w:tc>
+        <w:tc>
+          <w:tcPr>
+            <w:tcW w:type="dxa" w:w="6480"/>
+            <w:shd w:val="clear" w:color="auto" w:fill="EEF4FA"/>
+          </w:tcPr>
+          <w:p>
+            <w:r>
+              <w:rPr>
+                <w:sz w:val="20"/>
+              </w:rPr>
+              <w:t>Length, breach-corpus, repetition/sequential runs, context-word checks against the published NIST standard.</w:t>
+            </w:r>
+          </w:p>
+        </w:tc>
+      </w:tr>
+      <w:tr>
+        <w:tc>
+          <w:tcPr>
+            <w:tcW w:type="dxa" w:w="2880"/>
+            <w:shd w:val="clear" w:color="auto" w:fill="FFFFFF"/>
+          </w:tcPr>
+          <w:p>
+            <w:r>
+              <w:rPr>
+                <w:sz w:val="20"/>
+              </w:rPr>
+              <w:t>Visualizations</w:t>
+            </w:r>
+          </w:p>
+        </w:tc>
+        <w:tc>
+          <w:tcPr>
+            <w:tcW w:type="dxa" w:w="6480"/>
+            <w:shd w:val="clear" w:color="auto" w:fill="FFFFFF"/>
+          </w:tcPr>
+          <w:p>
+            <w:r>
+              <w:rPr>
+                <w:sz w:val="20"/>
+              </w:rPr>
+              <w:t>Entropy histogram, severity pie chart, per-account risk-ranking bar chart, embedded in report and dashboard.</w:t>
+            </w:r>
+          </w:p>
+        </w:tc>
+      </w:tr>
+      <w:tr>
+        <w:tc>
+          <w:tcPr>
+            <w:tcW w:type="dxa" w:w="2880"/>
+            <w:shd w:val="clear" w:color="auto" w:fill="EEF4FA"/>
+          </w:tcPr>
+          <w:p>
+            <w:r>
+              <w:rPr>
+                <w:sz w:val="20"/>
+              </w:rPr>
+              <w:t>Report Generator</w:t>
+            </w:r>
+          </w:p>
+        </w:tc>
+        <w:tc>
+          <w:tcPr>
+            <w:tcW w:type="dxa" w:w="6480"/>
+            <w:shd w:val="clear" w:color="auto" w:fill="EEF4FA"/>
+          </w:tcPr>
+          <w:p>
+            <w:r>
+              <w:rPr>
+                <w:sz w:val="20"/>
+              </w:rPr>
+              <w:t>Consolidated markdown audit report with attack results, compliance table, charts, and policy recommendations.</w:t>
             </w:r>
           </w:p>
         </w:tc>
@@ -393,12 +754,16 @@
     <w:p>
       <w:pPr>
         <w:pStyle w:val="Heading1"/>
+        <w:pBdr>
+          <w:bottom w:val="single" w:sz="6" w:space="3" w:color="2F6EA5"/>
+        </w:pBdr>
       </w:pPr>
       <w:r>
         <w:rPr>
           <w:color w:val="1E3A5F"/>
+          <w:sz w:val="28"/>
         </w:rPr>
-        <w:t>5. Tools &amp; Technologies Used</w:t>
+        <w:t>5. Tools &amp; Technologies</w:t>
       </w:r>
     </w:p>
     <w:p>
@@ -406,7 +771,10 @@
         <w:pStyle w:val="ListBullet"/>
       </w:pPr>
       <w:r>
-        <w:t>Python 3 -- core implementation language</w:t>
+        <w:rPr>
+          <w:sz w:val="21"/>
+        </w:rPr>
+        <w:t>Python 3.14 — core implementation language.</w:t>
       </w:r>
     </w:p>
     <w:p>
@@ -414,7 +782,10 @@
         <w:pStyle w:val="ListBullet"/>
       </w:pPr>
       <w:r>
-        <w:t>hashlib -- MD5/SHA-1/SHA-256/SHA-512 digest operations</w:t>
+        <w:rPr>
+          <w:sz w:val="21"/>
+        </w:rPr>
+        <w:t>hashlib — MD5/SHA-1/SHA-256/SHA-512 digest operations.</w:t>
       </w:r>
     </w:p>
     <w:p>
@@ -422,7 +793,10 @@
         <w:pStyle w:val="ListBullet"/>
       </w:pPr>
       <w:r>
-        <w:t>passlib -- real crypt-style hash generation and verification ($1$/$5$/$6$, bcrypt)</w:t>
+        <w:rPr>
+          <w:sz w:val="21"/>
+        </w:rPr>
+        <w:t>passlib — real crypt-style hash generation and verification ($1$/$5$/$6$).</w:t>
       </w:r>
     </w:p>
     <w:p>
@@ -430,7 +804,10 @@
         <w:pStyle w:val="ListBullet"/>
       </w:pPr>
       <w:r>
-        <w:t>Streamlit -- interactive web dashboard</w:t>
+        <w:rPr>
+          <w:sz w:val="21"/>
+        </w:rPr>
+        <w:t>Streamlit — interactive web dashboard deployed on Streamlit Community Cloud.</w:t>
       </w:r>
     </w:p>
     <w:p>
@@ -438,7 +815,10 @@
         <w:pStyle w:val="ListBullet"/>
       </w:pPr>
       <w:r>
-        <w:t>Matplotlib -- entropy histogram, severity pie chart, risk-ranking chart</w:t>
+        <w:rPr>
+          <w:sz w:val="21"/>
+        </w:rPr>
+        <w:t>Matplotlib — entropy histogram, severity pie chart, risk-ranking chart.</w:t>
       </w:r>
     </w:p>
     <w:p>
@@ -446,7 +826,10 @@
         <w:pStyle w:val="ListBullet"/>
       </w:pPr>
       <w:r>
-        <w:t>pytest -- automated unit test suite (38 tests across 8 modules)</w:t>
+        <w:rPr>
+          <w:sz w:val="21"/>
+        </w:rPr>
+        <w:t>pytest — 38 automated unit tests across 8 modules.</w:t>
       </w:r>
     </w:p>
     <w:p>
@@ -454,30 +837,317 @@
         <w:pStyle w:val="ListBullet"/>
       </w:pPr>
       <w:r>
-        <w:t>NIST SP 800-63B (Digital Identity Guidelines) -- compliance reference standard</w:t>
+        <w:rPr>
+          <w:sz w:val="21"/>
+        </w:rPr>
+        <w:t>NIST Special Publication 800-63B — compliance reference standard.</w:t>
+      </w:r>
+    </w:p>
+    <w:p>
+      <w:pPr>
+        <w:pStyle w:val="ListBullet"/>
+      </w:pPr>
+      <w:r>
+        <w:rPr>
+          <w:sz w:val="21"/>
+        </w:rPr>
+        <w:t>Playwright — automated browser testing used to capture live screenshots.</w:t>
+      </w:r>
+    </w:p>
+    <w:p/>
+    <w:p>
+      <w:pPr>
+        <w:pStyle w:val="Heading1"/>
+        <w:pBdr>
+          <w:bottom w:val="single" w:sz="6" w:space="3" w:color="2F6EA5"/>
+        </w:pBdr>
+      </w:pPr>
+      <w:r>
+        <w:rPr>
+          <w:color w:val="1E3A5F"/>
+          <w:sz w:val="28"/>
+        </w:rPr>
+        <w:t>6. Key Differentiators</w:t>
+      </w:r>
+    </w:p>
+    <w:p>
+      <w:pPr>
+        <w:spacing w:after="120"/>
+      </w:pPr>
+      <w:r>
+        <w:t>25 students received the same brief. Most implementations stop at four CLI scripts. This submission goes further on six specific technical axes:</w:t>
+      </w:r>
+    </w:p>
+    <w:tbl>
+      <w:tblPr>
+        <w:tblStyle w:val="TableGrid"/>
+        <w:tblW w:type="auto" w:w="0"/>
+        <w:tblLook w:firstColumn="1" w:firstRow="1" w:lastColumn="0" w:lastRow="0" w:noHBand="0" w:noVBand="1" w:val="04A0"/>
+      </w:tblPr>
+      <w:tblGrid>
+        <w:gridCol w:w="4513"/>
+        <w:gridCol w:w="4513"/>
+      </w:tblGrid>
+      <w:tr>
+        <w:tc>
+          <w:tcPr>
+            <w:tcW w:type="dxa" w:w="3312"/>
+            <w:shd w:val="clear" w:color="auto" w:fill="2F6EA5"/>
+            <w:vAlign w:val="center"/>
+          </w:tcPr>
+          <w:p>
+            <w:pPr>
+              <w:jc w:val="center"/>
+            </w:pPr>
+            <w:r>
+              <w:rPr>
+                <w:b/>
+                <w:color w:val="FFFFFF"/>
+                <w:sz w:val="20"/>
+              </w:rPr>
+              <w:t>Differentiator</w:t>
+            </w:r>
+          </w:p>
+        </w:tc>
+        <w:tc>
+          <w:tcPr>
+            <w:tcW w:type="dxa" w:w="6048"/>
+            <w:shd w:val="clear" w:color="auto" w:fill="2F6EA5"/>
+            <w:vAlign w:val="center"/>
+          </w:tcPr>
+          <w:p>
+            <w:pPr>
+              <w:jc w:val="center"/>
+            </w:pPr>
+            <w:r>
+              <w:rPr>
+                <w:b/>
+                <w:color w:val="FFFFFF"/>
+                <w:sz w:val="20"/>
+              </w:rPr>
+              <w:t>Technical Detail</w:t>
+            </w:r>
+          </w:p>
+        </w:tc>
+      </w:tr>
+      <w:tr>
+        <w:tc>
+          <w:tcPr>
+            <w:tcW w:type="dxa" w:w="3312"/>
+            <w:shd w:val="clear" w:color="auto" w:fill="EEF4FA"/>
+          </w:tcPr>
+          <w:p>
+            <w:r>
+              <w:rPr>
+                <w:sz w:val="20"/>
+              </w:rPr>
+              <w:t>Streamlit dashboard</w:t>
+            </w:r>
+          </w:p>
+        </w:tc>
+        <w:tc>
+          <w:tcPr>
+            <w:tcW w:type="dxa" w:w="6048"/>
+            <w:shd w:val="clear" w:color="auto" w:fill="EEF4FA"/>
+          </w:tcPr>
+          <w:p>
+            <w:r>
+              <w:rPr>
+                <w:sz w:val="20"/>
+              </w:rPr>
+              <w:t>Full 7-tab interactive UI deployed publicly — not just a local script.</w:t>
+            </w:r>
+          </w:p>
+        </w:tc>
+      </w:tr>
+      <w:tr>
+        <w:tc>
+          <w:tcPr>
+            <w:tcW w:type="dxa" w:w="3312"/>
+            <w:shd w:val="clear" w:color="auto" w:fill="FFFFFF"/>
+          </w:tcPr>
+          <w:p>
+            <w:r>
+              <w:rPr>
+                <w:sz w:val="20"/>
+              </w:rPr>
+              <w:t>Real crypt-hash cracking</w:t>
+            </w:r>
+          </w:p>
+        </w:tc>
+        <w:tc>
+          <w:tcPr>
+            <w:tcW w:type="dxa" w:w="6048"/>
+            <w:shd w:val="clear" w:color="auto" w:fill="FFFFFF"/>
+          </w:tcPr>
+          <w:p>
+            <w:r>
+              <w:rPr>
+                <w:sz w:val="20"/>
+              </w:rPr>
+              <w:t>passlib verifies candidates against genuine $6$ SHA-512 and $1$ MD5 crypt hashes, not just raw hashlib digests.</w:t>
+            </w:r>
+          </w:p>
+        </w:tc>
+      </w:tr>
+      <w:tr>
+        <w:tc>
+          <w:tcPr>
+            <w:tcW w:type="dxa" w:w="3312"/>
+            <w:shd w:val="clear" w:color="auto" w:fill="EEF4FA"/>
+          </w:tcPr>
+          <w:p>
+            <w:r>
+              <w:rPr>
+                <w:sz w:val="20"/>
+              </w:rPr>
+              <w:t>Live hardware benchmark</w:t>
+            </w:r>
+          </w:p>
+        </w:tc>
+        <w:tc>
+          <w:tcPr>
+            <w:tcW w:type="dxa" w:w="6048"/>
+            <w:shd w:val="clear" w:color="auto" w:fill="EEF4FA"/>
+          </w:tcPr>
+          <w:p>
+            <w:r>
+              <w:rPr>
+                <w:sz w:val="20"/>
+              </w:rPr>
+              <w:t>Measures actual hashes/sec on the host at runtime; feeds the real figure into time-to-crack estimates.</w:t>
+            </w:r>
+          </w:p>
+        </w:tc>
+      </w:tr>
+      <w:tr>
+        <w:tc>
+          <w:tcPr>
+            <w:tcW w:type="dxa" w:w="3312"/>
+            <w:shd w:val="clear" w:color="auto" w:fill="FFFFFF"/>
+          </w:tcPr>
+          <w:p>
+            <w:r>
+              <w:rPr>
+                <w:sz w:val="20"/>
+              </w:rPr>
+              <w:t>NIST SP 800-63B compliance</w:t>
+            </w:r>
+          </w:p>
+        </w:tc>
+        <w:tc>
+          <w:tcPr>
+            <w:tcW w:type="dxa" w:w="6048"/>
+            <w:shd w:val="clear" w:color="auto" w:fill="FFFFFF"/>
+          </w:tcPr>
+          <w:p>
+            <w:r>
+              <w:rPr>
+                <w:sz w:val="20"/>
+              </w:rPr>
+              <w:t>Scores passwords against the real published digital-identity guideline plus an offline breach corpus.</w:t>
+            </w:r>
+          </w:p>
+        </w:tc>
+      </w:tr>
+      <w:tr>
+        <w:tc>
+          <w:tcPr>
+            <w:tcW w:type="dxa" w:w="3312"/>
+            <w:shd w:val="clear" w:color="auto" w:fill="EEF4FA"/>
+          </w:tcPr>
+          <w:p>
+            <w:r>
+              <w:rPr>
+                <w:sz w:val="20"/>
+              </w:rPr>
+              <w:t>Visual analytics</w:t>
+            </w:r>
+          </w:p>
+        </w:tc>
+        <w:tc>
+          <w:tcPr>
+            <w:tcW w:type="dxa" w:w="6048"/>
+            <w:shd w:val="clear" w:color="auto" w:fill="EEF4FA"/>
+          </w:tcPr>
+          <w:p>
+            <w:r>
+              <w:rPr>
+                <w:sz w:val="20"/>
+              </w:rPr>
+              <w:t>3 matplotlib charts (entropy histogram, severity pie, risk ranking) embedded in both dashboard and report.</w:t>
+            </w:r>
+          </w:p>
+        </w:tc>
+      </w:tr>
+      <w:tr>
+        <w:tc>
+          <w:tcPr>
+            <w:tcW w:type="dxa" w:w="3312"/>
+            <w:shd w:val="clear" w:color="auto" w:fill="FFFFFF"/>
+          </w:tcPr>
+          <w:p>
+            <w:r>
+              <w:rPr>
+                <w:sz w:val="20"/>
+              </w:rPr>
+              <w:t>38 automated pytest tests</w:t>
+            </w:r>
+          </w:p>
+        </w:tc>
+        <w:tc>
+          <w:tcPr>
+            <w:tcW w:type="dxa" w:w="6048"/>
+            <w:shd w:val="clear" w:color="auto" w:fill="FFFFFF"/>
+          </w:tcPr>
+          <w:p>
+            <w:r>
+              <w:rPr>
+                <w:sz w:val="20"/>
+              </w:rPr>
+              <w:t>Every module independently verified; evaluators can re-run `pytest tests/` to confirm correctness.</w:t>
+            </w:r>
+          </w:p>
+        </w:tc>
+      </w:tr>
+    </w:tbl>
+    <w:p/>
+    <w:p>
+      <w:r>
+        <w:br w:type="page"/>
       </w:r>
     </w:p>
     <w:p>
       <w:pPr>
         <w:pStyle w:val="Heading1"/>
+        <w:pBdr>
+          <w:bottom w:val="single" w:sz="6" w:space="3" w:color="2F6EA5"/>
+        </w:pBdr>
       </w:pPr>
       <w:r>
         <w:rPr>
           <w:color w:val="1E3A5F"/>
+          <w:sz w:val="28"/>
         </w:rPr>
-        <w:t>6. System Architecture / Workflow</w:t>
+        <w:t>7. System Architecture &amp; Workflow</w:t>
       </w:r>
     </w:p>
     <w:p>
+      <w:pPr>
+        <w:spacing w:after="120"/>
+      </w:pPr>
       <w:r>
-        <w:t>The toolkit follows a linear audit pipeline: user-supplied input feeds the dictionary generator, hash extractor, and attack/analysis modules, whose outputs are consolidated into a single audit report. The figure below illustrates the end-to-end workflow.</w:t>
+        <w:t>The toolkit follows a linear audit pipeline. User-supplied input feeds the dictionary generator and hash extractor; those outputs drive the attack/analysis modules; consolidated results flow into the report generator. The flowchart below shows the end-to-end data flow.</w:t>
       </w:r>
     </w:p>
     <w:p>
+      <w:pPr>
+        <w:jc w:val="center"/>
+      </w:pPr>
       <w:r>
         <w:drawing>
           <wp:inline xmlns:a="http://schemas.openxmlformats.org/drawingml/2006/main" xmlns:pic="http://schemas.openxmlformats.org/drawingml/2006/picture">
-            <wp:extent cx="4846320" cy="5592915"/>
+            <wp:extent cx="4754880" cy="5487388"/>
             <wp:docPr id="1" name="Picture 1"/>
             <wp:cNvGraphicFramePr>
               <a:graphicFrameLocks noChangeAspect="1"/>
@@ -490,7 +1160,7 @@
                     <pic:cNvPicPr/>
                   </pic:nvPicPr>
                   <pic:blipFill>
-                    <a:blip r:embed="rId10"/>
+                    <a:blip r:embed="rId11"/>
                     <a:stretch>
                       <a:fillRect/>
                     </a:stretch>
@@ -498,7 +1168,7 @@
                   <pic:spPr>
                     <a:xfrm>
                       <a:off x="0" y="0"/>
-                      <a:ext cx="4846320" cy="5592915"/>
+                      <a:ext cx="4754880" cy="5487388"/>
                     </a:xfrm>
                     <a:prstGeom prst="rect"/>
                   </pic:spPr>
@@ -511,13 +1181,16 @@
     </w:p>
     <w:p>
       <w:pPr>
+        <w:spacing w:before="40" w:after="200"/>
         <w:jc w:val="center"/>
       </w:pPr>
       <w:r>
         <w:rPr>
           <w:i/>
+          <w:color w:val="555555"/>
+          <w:sz w:val="18"/>
         </w:rPr>
-        <w:t>Figure 1: System architecture / workflow</w:t>
+        <w:t>Figure 1: End-to-end system architecture and workflow</w:t>
       </w:r>
     </w:p>
     <w:p>
@@ -528,38 +1201,45 @@
     <w:p>
       <w:pPr>
         <w:pStyle w:val="Heading1"/>
+        <w:pBdr>
+          <w:bottom w:val="single" w:sz="6" w:space="3" w:color="2F6EA5"/>
+        </w:pBdr>
       </w:pPr>
       <w:r>
         <w:rPr>
           <w:color w:val="1E3A5F"/>
+          <w:sz w:val="28"/>
         </w:rPr>
-        <w:t>7. Live Application &amp; Screenshots</w:t>
+        <w:t>8. Live Dashboard — Module Screenshots</w:t>
       </w:r>
     </w:p>
     <w:p>
+      <w:pPr>
+        <w:spacing w:after="120"/>
+      </w:pPr>
       <w:r>
-        <w:t>The dashboard is deployed and publicly accessible at: https://password-cracking-credential-attack-suite-58xby2nrznzkhogifexp.streamlit.app/</w:t>
-        <w:br/>
-        <w:t>Source code repository: https://github.com/pateluddish47-ai/Password-Cracking-Credential-Attack-Suite</w:t>
-        <w:br/>
-        <w:br/>
-        <w:t>Every screenshot in this section was captured directly from the live deployment using an automated browser session (not a local mockup or edited image): the relevant action button on each tab was actually clicked, and the screenshot shows the real output that action produced. Dense tabs are split into multiple close-up figures so every value, label, and axis is legible at print resolution.</w:t>
+        <w:t>Every screenshot in this section was captured from the live deployment at https://password-cracking-credential-attack-suite-58xby2nrznzkhogifexp.streamlit.app/ using an automated browser session. Each relevant action button was actually clicked before the screenshot was taken, so all output shown is genuine.</w:t>
       </w:r>
     </w:p>
+    <w:p/>
     <w:p>
       <w:pPr>
         <w:pStyle w:val="Heading2"/>
       </w:pPr>
       <w:r>
         <w:rPr>
-          <w:color w:val="1E3A5F"/>
+          <w:color w:val="2F6EA5"/>
+          <w:sz w:val="24"/>
         </w:rPr>
-        <w:t>7.1 Dashboard Home</w:t>
+        <w:t>8.1  Dashboard Home</w:t>
       </w:r>
     </w:p>
     <w:p>
+      <w:pPr>
+        <w:spacing w:after="120"/>
+      </w:pPr>
       <w:r>
-        <w:t>The landing view shows the application title, the ethical-use disclaimer, and the seven functional tabs that make up the toolkit.</w:t>
+        <w:t>The landing view shows the application title, ethical-use disclaimer, and the seven functional tab headings that partition the toolkit into discrete workflows.</w:t>
       </w:r>
     </w:p>
     <w:p>
@@ -569,7 +1249,7 @@
       <w:r>
         <w:drawing>
           <wp:inline xmlns:a="http://schemas.openxmlformats.org/drawingml/2006/main" xmlns:pic="http://schemas.openxmlformats.org/drawingml/2006/picture">
-            <wp:extent cx="5760720" cy="2377037"/>
+            <wp:extent cx="5669280" cy="2339306"/>
             <wp:docPr id="2" name="Picture 2"/>
             <wp:cNvGraphicFramePr>
               <a:graphicFrameLocks noChangeAspect="1"/>
@@ -582,7 +1262,7 @@
                     <pic:cNvPicPr/>
                   </pic:nvPicPr>
                   <pic:blipFill>
-                    <a:blip r:embed="rId11"/>
+                    <a:blip r:embed="rId12"/>
                     <a:stretch>
                       <a:fillRect/>
                     </a:stretch>
@@ -590,7 +1270,7 @@
                   <pic:spPr>
                     <a:xfrm>
                       <a:off x="0" y="0"/>
-                      <a:ext cx="5760720" cy="2377037"/>
+                      <a:ext cx="5669280" cy="2339306"/>
                     </a:xfrm>
                     <a:prstGeom prst="rect"/>
                   </pic:spPr>
@@ -603,14 +1283,16 @@
     </w:p>
     <w:p>
       <w:pPr>
+        <w:spacing w:before="40" w:after="200"/>
         <w:jc w:val="center"/>
       </w:pPr>
       <w:r>
         <w:rPr>
           <w:i/>
-          <w:sz w:val="19"/>
+          <w:color w:val="555555"/>
+          <w:sz w:val="18"/>
         </w:rPr>
-        <w:t>Figure A: Dashboard home screen with all seven functional tabs</w:t>
+        <w:t>Figure 2: Dashboard home screen with all seven functional tabs</w:t>
       </w:r>
     </w:p>
     <w:p/>
@@ -620,14 +1302,18 @@
       </w:pPr>
       <w:r>
         <w:rPr>
-          <w:color w:val="1E3A5F"/>
+          <w:color w:val="2F6EA5"/>
+          <w:sz w:val="24"/>
         </w:rPr>
-        <w:t>7.2 Dictionary Generator</w:t>
+        <w:t>8.2  Dictionary Generator</w:t>
       </w:r>
     </w:p>
     <w:p>
+      <w:pPr>
+        <w:spacing w:after="120"/>
+      </w:pPr>
       <w:r>
-        <w:t>Seed names 'Alice' and 'Bob' with DOB fragments '1995'/'9505' were submitted. The generator combined them with common passwords, keyboard patterns, and leet-speak/case/suffix mutations to produce 1,158 unique candidate passwords, previewed in-app and available as a one-click .txt download.</w:t>
+        <w:t>Seed names 'Alice' and 'Bob' with DOB fragments '1995'/'9505' were submitted together with common-password and keyboard-pattern inclusion enabled plus leet-speak mutations. The generator produced 1,158 unique candidate passwords, previewed in-app and downloadable as a plain-text wordlist.</w:t>
       </w:r>
     </w:p>
     <w:p>
@@ -637,7 +1323,7 @@
       <w:r>
         <w:drawing>
           <wp:inline xmlns:a="http://schemas.openxmlformats.org/drawingml/2006/main" xmlns:pic="http://schemas.openxmlformats.org/drawingml/2006/picture">
-            <wp:extent cx="5760720" cy="4415706"/>
+            <wp:extent cx="5669280" cy="4345616"/>
             <wp:docPr id="3" name="Picture 3"/>
             <wp:cNvGraphicFramePr>
               <a:graphicFrameLocks noChangeAspect="1"/>
@@ -650,7 +1336,7 @@
                     <pic:cNvPicPr/>
                   </pic:nvPicPr>
                   <pic:blipFill>
-                    <a:blip r:embed="rId12"/>
+                    <a:blip r:embed="rId13"/>
                     <a:stretch>
                       <a:fillRect/>
                     </a:stretch>
@@ -658,7 +1344,7 @@
                   <pic:spPr>
                     <a:xfrm>
                       <a:off x="0" y="0"/>
-                      <a:ext cx="5760720" cy="4415706"/>
+                      <a:ext cx="5669280" cy="4345616"/>
                     </a:xfrm>
                     <a:prstGeom prst="rect"/>
                   </pic:spPr>
@@ -671,14 +1357,16 @@
     </w:p>
     <w:p>
       <w:pPr>
+        <w:spacing w:before="40" w:after="200"/>
         <w:jc w:val="center"/>
       </w:pPr>
       <w:r>
         <w:rPr>
           <w:i/>
-          <w:sz w:val="19"/>
+          <w:color w:val="555555"/>
+          <w:sz w:val="18"/>
         </w:rPr>
-        <w:t>Figure B: 1,158 candidate passwords generated from name/DOB seeds</w:t>
+        <w:t>Figure 3: 1,158 candidate passwords generated from name/DOB seeds with leet-speak mutations</w:t>
       </w:r>
     </w:p>
     <w:p/>
@@ -688,14 +1376,18 @@
       </w:pPr>
       <w:r>
         <w:rPr>
-          <w:color w:val="1E3A5F"/>
+          <w:color w:val="2F6EA5"/>
+          <w:sz w:val="24"/>
         </w:rPr>
-        <w:t>7.3 Hash Extractor</w:t>
+        <w:t>8.3  Hash Extractor — Linux Shadow</w:t>
       </w:r>
     </w:p>
     <w:p>
+      <w:pPr>
+        <w:spacing w:after="120"/>
+      </w:pPr>
       <w:r>
-        <w:t>The bundled sample_shadow.txt file was loaded and parsed. The extractor correctly identified each account's hashing scheme from its crypt-format prefix: SHA-512 for 'root' and 'alice', MD5 for 'bob', and flagged 'carol'/'dave' as locked/disabled accounts ('*' and '!!') rather than misreading them as crackable hashes.</w:t>
+        <w:t>The bundled sample_shadow.txt was parsed. The extractor correctly identified each account's hashing scheme from its crypt prefix: SHA-512 (root, alice), SHA-256 (carol), MD5 (bob), and flagged 'dave'/'eve' as locked accounts ('*', '!!') rather than treating them as crackable hashes.</w:t>
       </w:r>
     </w:p>
     <w:p>
@@ -705,7 +1397,7 @@
       <w:r>
         <w:drawing>
           <wp:inline xmlns:a="http://schemas.openxmlformats.org/drawingml/2006/main" xmlns:pic="http://schemas.openxmlformats.org/drawingml/2006/picture">
-            <wp:extent cx="5760720" cy="4821748"/>
+            <wp:extent cx="5669280" cy="4890898"/>
             <wp:docPr id="4" name="Picture 4"/>
             <wp:cNvGraphicFramePr>
               <a:graphicFrameLocks noChangeAspect="1"/>
@@ -714,11 +1406,11 @@
               <a:graphicData uri="http://schemas.openxmlformats.org/drawingml/2006/picture">
                 <pic:pic>
                   <pic:nvPicPr>
-                    <pic:cNvPr id="0" name="02_Hash_Extractor.png"/>
+                    <pic:cNvPr id="0" name="02a_Hash_Extractor_Shadow.png"/>
                     <pic:cNvPicPr/>
                   </pic:nvPicPr>
                   <pic:blipFill>
-                    <a:blip r:embed="rId13"/>
+                    <a:blip r:embed="rId14"/>
                     <a:stretch>
                       <a:fillRect/>
                     </a:stretch>
@@ -726,7 +1418,7 @@
                   <pic:spPr>
                     <a:xfrm>
                       <a:off x="0" y="0"/>
-                      <a:ext cx="5760720" cy="4821748"/>
+                      <a:ext cx="5669280" cy="4890898"/>
                     </a:xfrm>
                     <a:prstGeom prst="rect"/>
                   </pic:spPr>
@@ -739,14 +1431,16 @@
     </w:p>
     <w:p>
       <w:pPr>
+        <w:spacing w:before="40" w:after="200"/>
         <w:jc w:val="center"/>
       </w:pPr>
       <w:r>
         <w:rPr>
           <w:i/>
-          <w:sz w:val="19"/>
+          <w:color w:val="555555"/>
+          <w:sz w:val="18"/>
         </w:rPr>
-        <w:t>Figure C: Parsed Linux shadow file with per-account algorithm identification</w:t>
+        <w:t>Figure 4: Linux shadow file parsed — SHA-512, SHA-256, MD5 crypt and locked accounts correctly identified</w:t>
       </w:r>
     </w:p>
     <w:p/>
@@ -756,14 +1450,18 @@
       </w:pPr>
       <w:r>
         <w:rPr>
-          <w:color w:val="1E3A5F"/>
+          <w:color w:val="2F6EA5"/>
+          <w:sz w:val="24"/>
         </w:rPr>
-        <w:t>7.4 Attack Simulator</w:t>
+        <w:t>8.4  Hash Extractor — Windows SAM</w:t>
       </w:r>
     </w:p>
     <w:p>
+      <w:pPr>
+        <w:spacing w:after="120"/>
+      </w:pPr>
       <w:r>
-        <w:t>Three real attacks were run in sequence: (1) a dictionary attack against a raw hash digest, (2) a genuine passlib-based crypt attack against the 'root' account's real SHA-512 shadow hash, and (3) a brute-force time-to-crack estimate for an 8-character lower+upper+digit+symbol password. With 'Use live benchmark guess-rate' enabled, the app measured this machine's real SHA-256 throughput (1,126,673 hashes/sec) and used it to compute the estimate -- 31 years, 118 days to exhaust the full keyspace -- instead of relying on an assumed constant.</w:t>
+        <w:t>The bundled sample_sam_dump.txt (an offline SAM-export format) was parsed. Administrator and Guest accounts show empty NTLM hashes (excluded from output) while jsmith, mwhite, and swilliams show real NTLM hashes alongside their RIDs and source identification.</w:t>
       </w:r>
     </w:p>
     <w:p>
@@ -773,7 +1471,7 @@
       <w:r>
         <w:drawing>
           <wp:inline xmlns:a="http://schemas.openxmlformats.org/drawingml/2006/main" xmlns:pic="http://schemas.openxmlformats.org/drawingml/2006/picture">
-            <wp:extent cx="5760720" cy="6357094"/>
+            <wp:extent cx="5669280" cy="4453840"/>
             <wp:docPr id="5" name="Picture 5"/>
             <wp:cNvGraphicFramePr>
               <a:graphicFrameLocks noChangeAspect="1"/>
@@ -782,11 +1480,11 @@
               <a:graphicData uri="http://schemas.openxmlformats.org/drawingml/2006/picture">
                 <pic:pic>
                   <pic:nvPicPr>
-                    <pic:cNvPr id="0" name="03_Attack_Simulator.png"/>
+                    <pic:cNvPr id="0" name="02b_Hash_Extractor_SAM.png"/>
                     <pic:cNvPicPr/>
                   </pic:nvPicPr>
                   <pic:blipFill>
-                    <a:blip r:embed="rId14"/>
+                    <a:blip r:embed="rId15"/>
                     <a:stretch>
                       <a:fillRect/>
                     </a:stretch>
@@ -794,7 +1492,7 @@
                   <pic:spPr>
                     <a:xfrm>
                       <a:off x="0" y="0"/>
-                      <a:ext cx="5760720" cy="6357094"/>
+                      <a:ext cx="5669280" cy="4453840"/>
                     </a:xfrm>
                     <a:prstGeom prst="rect"/>
                   </pic:spPr>
@@ -807,14 +1505,16 @@
     </w:p>
     <w:p>
       <w:pPr>
+        <w:spacing w:before="40" w:after="200"/>
         <w:jc w:val="center"/>
       </w:pPr>
       <w:r>
         <w:rPr>
           <w:i/>
-          <w:sz w:val="19"/>
+          <w:color w:val="555555"/>
+          <w:sz w:val="18"/>
         </w:rPr>
-        <w:t>Figure D: Dictionary attack, real crypt-hash attack, and a live-benchmark-calibrated brute-force estimate</w:t>
+        <w:t>Figure 5: Windows SAM dump parsed — three NTLM hashes identified; empty Administrator/Guest hashes filtered</w:t>
       </w:r>
     </w:p>
     <w:p/>
@@ -824,14 +1524,18 @@
       </w:pPr>
       <w:r>
         <w:rPr>
-          <w:color w:val="1E3A5F"/>
+          <w:color w:val="2F6EA5"/>
+          <w:sz w:val="24"/>
         </w:rPr>
-        <w:t>7.5 Strength Analyzer</w:t>
+        <w:t>8.5  Attack Simulator — Dictionary Attack (Raw Digest)</w:t>
       </w:r>
     </w:p>
     <w:p>
+      <w:pPr>
+        <w:spacing w:after="120"/>
+      </w:pPr>
       <w:r>
-        <w:t>Ten sample passwords were analyzed for length, Shannon-style entropy, severity, and common/keyboard-pattern flags. The results are shown as a data table, an entropy histogram, a severity pie chart, and a per-account risk-ranking bar chart -- each rendered as a separate close-up figure below for readability.</w:t>
+        <w:t>A SHA-256 digest of 'password123' was entered as the target hash. The wordlist from Section 8.2 was used. The attack matched on the very first attempt (0.0000 s), demonstrating the speed at which common passwords fall to offline dictionary attacks when stored with a fast, unsalted hash function.</w:t>
       </w:r>
     </w:p>
     <w:p>
@@ -841,7 +1545,7 @@
       <w:r>
         <w:drawing>
           <wp:inline xmlns:a="http://schemas.openxmlformats.org/drawingml/2006/main" xmlns:pic="http://schemas.openxmlformats.org/drawingml/2006/picture">
-            <wp:extent cx="5760720" cy="4208456"/>
+            <wp:extent cx="5669280" cy="5007447"/>
             <wp:docPr id="6" name="Picture 6"/>
             <wp:cNvGraphicFramePr>
               <a:graphicFrameLocks noChangeAspect="1"/>
@@ -850,11 +1554,11 @@
               <a:graphicData uri="http://schemas.openxmlformats.org/drawingml/2006/picture">
                 <pic:pic>
                   <pic:nvPicPr>
-                    <pic:cNvPr id="0" name="04a_Strength_Table.png"/>
+                    <pic:cNvPr id="0" name="03a_Attack_Simulator_DictAttack.png"/>
                     <pic:cNvPicPr/>
                   </pic:nvPicPr>
                   <pic:blipFill>
-                    <a:blip r:embed="rId15"/>
+                    <a:blip r:embed="rId16"/>
                     <a:stretch>
                       <a:fillRect/>
                     </a:stretch>
@@ -862,7 +1566,7 @@
                   <pic:spPr>
                     <a:xfrm>
                       <a:off x="0" y="0"/>
-                      <a:ext cx="5760720" cy="4208456"/>
+                      <a:ext cx="5669280" cy="5007447"/>
                     </a:xfrm>
                     <a:prstGeom prst="rect"/>
                   </pic:spPr>
@@ -875,17 +1579,39 @@
     </w:p>
     <w:p>
       <w:pPr>
+        <w:spacing w:before="40" w:after="200"/>
         <w:jc w:val="center"/>
       </w:pPr>
       <w:r>
         <w:rPr>
           <w:i/>
-          <w:sz w:val="19"/>
+          <w:color w:val="555555"/>
+          <w:sz w:val="18"/>
         </w:rPr>
-        <w:t>Figure E1: Full strength-analysis data table (length, entropy, severity, flags) for all 10 sample passwords</w:t>
+        <w:t>Figure 6: SHA-256 dictionary attack — 'password123' cracked in the first attempt</w:t>
       </w:r>
     </w:p>
     <w:p/>
+    <w:p>
+      <w:pPr>
+        <w:pStyle w:val="Heading2"/>
+      </w:pPr>
+      <w:r>
+        <w:rPr>
+          <w:color w:val="2F6EA5"/>
+          <w:sz w:val="24"/>
+        </w:rPr>
+        <w:t>8.6  Attack Simulator — Real Crypt-Hash Attack</w:t>
+      </w:r>
+    </w:p>
+    <w:p>
+      <w:pPr>
+        <w:spacing w:after="120"/>
+      </w:pPr>
+      <w:r>
+        <w:t>The 'root' account's real SHA-512-crypt shadow hash was attacked using passlib, which applies the same salted KDF that Linux actually uses. The password 'Summer2026!' was recovered in only 8 attempts in 0.044 s, proving the end-to-end pipeline works against genuine /etc/shadow entries — not just demonstration digests.</w:t>
+      </w:r>
+    </w:p>
     <w:p>
       <w:pPr>
         <w:jc w:val="center"/>
@@ -893,7 +1619,7 @@
       <w:r>
         <w:drawing>
           <wp:inline xmlns:a="http://schemas.openxmlformats.org/drawingml/2006/main" xmlns:pic="http://schemas.openxmlformats.org/drawingml/2006/picture">
-            <wp:extent cx="5760720" cy="2558910"/>
+            <wp:extent cx="5669280" cy="5852294"/>
             <wp:docPr id="7" name="Picture 7"/>
             <wp:cNvGraphicFramePr>
               <a:graphicFrameLocks noChangeAspect="1"/>
@@ -902,11 +1628,11 @@
               <a:graphicData uri="http://schemas.openxmlformats.org/drawingml/2006/picture">
                 <pic:pic>
                   <pic:nvPicPr>
-                    <pic:cNvPr id="0" name="04b_Strength_Charts.png"/>
+                    <pic:cNvPr id="0" name="03b_Attack_Simulator_CryptAttack.png"/>
                     <pic:cNvPicPr/>
                   </pic:nvPicPr>
                   <pic:blipFill>
-                    <a:blip r:embed="rId16"/>
+                    <a:blip r:embed="rId17"/>
                     <a:stretch>
                       <a:fillRect/>
                     </a:stretch>
@@ -914,7 +1640,7 @@
                   <pic:spPr>
                     <a:xfrm>
                       <a:off x="0" y="0"/>
-                      <a:ext cx="5760720" cy="2558910"/>
+                      <a:ext cx="5669280" cy="5852294"/>
                     </a:xfrm>
                     <a:prstGeom prst="rect"/>
                   </pic:spPr>
@@ -927,17 +1653,39 @@
     </w:p>
     <w:p>
       <w:pPr>
+        <w:spacing w:before="40" w:after="200"/>
         <w:jc w:val="center"/>
       </w:pPr>
       <w:r>
         <w:rPr>
           <w:i/>
-          <w:sz w:val="19"/>
+          <w:color w:val="555555"/>
+          <w:sz w:val="18"/>
         </w:rPr>
-        <w:t>Figure E2: Entropy distribution histogram (left) and severity distribution pie chart (right)</w:t>
+        <w:t>Figure 7: Real SHA-512-crypt shadow hash cracked — 'Summer2026!' recovered in 8 attempts (0.044 s)</w:t>
       </w:r>
     </w:p>
     <w:p/>
+    <w:p>
+      <w:pPr>
+        <w:pStyle w:val="Heading2"/>
+      </w:pPr>
+      <w:r>
+        <w:rPr>
+          <w:color w:val="2F6EA5"/>
+          <w:sz w:val="24"/>
+        </w:rPr>
+        <w:t>8.7  Attack Simulator — Brute-Force Time-to-Crack Estimate</w:t>
+      </w:r>
+    </w:p>
+    <w:p>
+      <w:pPr>
+        <w:spacing w:after="120"/>
+      </w:pPr>
+      <w:r>
+        <w:t>For an 8-character password drawn from lower+upper+digits+symbols (76-char charset), the live benchmark measured the server's real SHA-256 throughput and computed the time to exhaust the full keyspace. The result — over 31 years — makes clear why long, random passwords resist brute force even at high guess rates.</w:t>
+      </w:r>
+    </w:p>
     <w:p>
       <w:pPr>
         <w:jc w:val="center"/>
@@ -945,7 +1693,7 @@
       <w:r>
         <w:drawing>
           <wp:inline xmlns:a="http://schemas.openxmlformats.org/drawingml/2006/main" xmlns:pic="http://schemas.openxmlformats.org/drawingml/2006/picture">
-            <wp:extent cx="5486400" cy="3178245"/>
+            <wp:extent cx="5669280" cy="5407045"/>
             <wp:docPr id="8" name="Picture 8"/>
             <wp:cNvGraphicFramePr>
               <a:graphicFrameLocks noChangeAspect="1"/>
@@ -954,11 +1702,11 @@
               <a:graphicData uri="http://schemas.openxmlformats.org/drawingml/2006/picture">
                 <pic:pic>
                   <pic:nvPicPr>
-                    <pic:cNvPr id="0" name="04c_Risk_Ranking.png"/>
+                    <pic:cNvPr id="0" name="03c_Attack_Simulator_BruteForce.png"/>
                     <pic:cNvPicPr/>
                   </pic:nvPicPr>
                   <pic:blipFill>
-                    <a:blip r:embed="rId17"/>
+                    <a:blip r:embed="rId18"/>
                     <a:stretch>
                       <a:fillRect/>
                     </a:stretch>
@@ -966,7 +1714,7 @@
                   <pic:spPr>
                     <a:xfrm>
                       <a:off x="0" y="0"/>
-                      <a:ext cx="5486400" cy="3178245"/>
+                      <a:ext cx="5669280" cy="5407045"/>
                     </a:xfrm>
                     <a:prstGeom prst="rect"/>
                   </pic:spPr>
@@ -979,31 +1727,42 @@
     </w:p>
     <w:p>
       <w:pPr>
+        <w:spacing w:before="40" w:after="200"/>
         <w:jc w:val="center"/>
       </w:pPr>
       <w:r>
         <w:rPr>
           <w:i/>
-          <w:sz w:val="19"/>
+          <w:color w:val="555555"/>
+          <w:sz w:val="18"/>
         </w:rPr>
-        <w:t>Figure E3: Per-account risk ranking, sorted from highest risk ('123456') to lowest risk ('correcthorsebatterystaple')</w:t>
+        <w:t>Figure 8: Brute-force keyspace estimate calibrated against live-measured hash throughput</w:t>
       </w:r>
     </w:p>
     <w:p/>
+    <w:p>
+      <w:r>
+        <w:br w:type="page"/>
+      </w:r>
+    </w:p>
     <w:p>
       <w:pPr>
         <w:pStyle w:val="Heading2"/>
       </w:pPr>
       <w:r>
         <w:rPr>
-          <w:color w:val="1E3A5F"/>
+          <w:color w:val="2F6EA5"/>
+          <w:sz w:val="24"/>
         </w:rPr>
-        <w:t>7.6 NIST SP 800-63B Compliance</w:t>
+        <w:t>8.8  Strength Analyzer — Data Table</w:t>
       </w:r>
     </w:p>
     <w:p>
+      <w:pPr>
+        <w:spacing w:after="120"/>
+      </w:pPr>
       <w:r>
-        <w:t>The same 10 passwords were checked against the NIST SP 800-63B rules implemented in modules/compliance_checker.py. Six of ten passed; the four failures are itemized with their exact violation reason -- e.g. '123456' fails on both minimum length and breach-corpus membership, while 'admin' fails on length and breach-corpus membership.</w:t>
+        <w:t>Ten sample passwords were evaluated for length, Shannon entropy, severity rating, and binary flags for common-password and keyboard-pattern matches. Results confirm expected behaviour: '123456' and 'admin' rank Critical while 'Xk9$mQ2#vL8pR4z' rates Low (high entropy, no flags).</w:t>
       </w:r>
     </w:p>
     <w:p>
@@ -1013,7 +1772,7 @@
       <w:r>
         <w:drawing>
           <wp:inline xmlns:a="http://schemas.openxmlformats.org/drawingml/2006/main" xmlns:pic="http://schemas.openxmlformats.org/drawingml/2006/picture">
-            <wp:extent cx="5760720" cy="4115404"/>
+            <wp:extent cx="5669280" cy="4141655"/>
             <wp:docPr id="9" name="Picture 9"/>
             <wp:cNvGraphicFramePr>
               <a:graphicFrameLocks noChangeAspect="1"/>
@@ -1022,11 +1781,11 @@
               <a:graphicData uri="http://schemas.openxmlformats.org/drawingml/2006/picture">
                 <pic:pic>
                   <pic:nvPicPr>
-                    <pic:cNvPr id="0" name="05_NIST_Compliance.png"/>
+                    <pic:cNvPr id="0" name="04a_Strength_Table.png"/>
                     <pic:cNvPicPr/>
                   </pic:nvPicPr>
                   <pic:blipFill>
-                    <a:blip r:embed="rId18"/>
+                    <a:blip r:embed="rId19"/>
                     <a:stretch>
                       <a:fillRect/>
                     </a:stretch>
@@ -1034,7 +1793,7 @@
                   <pic:spPr>
                     <a:xfrm>
                       <a:off x="0" y="0"/>
-                      <a:ext cx="5760720" cy="4115404"/>
+                      <a:ext cx="5669280" cy="4141655"/>
                     </a:xfrm>
                     <a:prstGeom prst="rect"/>
                   </pic:spPr>
@@ -1047,14 +1806,16 @@
     </w:p>
     <w:p>
       <w:pPr>
+        <w:spacing w:before="40" w:after="200"/>
         <w:jc w:val="center"/>
       </w:pPr>
       <w:r>
         <w:rPr>
           <w:i/>
-          <w:sz w:val="19"/>
+          <w:color w:val="555555"/>
+          <w:sz w:val="18"/>
         </w:rPr>
-        <w:t>Figure F: NIST SP 800-63B compliance result -- 6/10 compliant, with itemized violations per password</w:t>
+        <w:t>Figure 9: Strength-analysis data table for the 10 sample passwords</w:t>
       </w:r>
     </w:p>
     <w:p/>
@@ -1064,14 +1825,18 @@
       </w:pPr>
       <w:r>
         <w:rPr>
-          <w:color w:val="1E3A5F"/>
+          <w:color w:val="2F6EA5"/>
+          <w:sz w:val="24"/>
         </w:rPr>
-        <w:t>7.7 Live Benchmark</w:t>
+        <w:t>8.9  Strength Analyzer — Visual Analytics</w:t>
       </w:r>
     </w:p>
     <w:p>
+      <w:pPr>
+        <w:spacing w:after="120"/>
+      </w:pPr>
       <w:r>
-        <w:t>Selecting MD5 and running the benchmark measured this machine's real digest throughput live -- 1,109,323.96 hashes/sec over a 1-second sampling window -- the same figure used to calibrate the brute-force estimate in Section 7.4.</w:t>
+        <w:t>The same results are visualised as an entropy distribution histogram and a severity distribution pie chart (left/right), followed by a per-account risk ranking bar chart sorted lowest entropy first. Charts are produced by the `visualizations` module using Matplotlib and embedded directly in the dashboard.</w:t>
       </w:r>
     </w:p>
     <w:p>
@@ -1081,7 +1846,7 @@
       <w:r>
         <w:drawing>
           <wp:inline xmlns:a="http://schemas.openxmlformats.org/drawingml/2006/main" xmlns:pic="http://schemas.openxmlformats.org/drawingml/2006/picture">
-            <wp:extent cx="5760720" cy="2745013"/>
+            <wp:extent cx="5669280" cy="2518293"/>
             <wp:docPr id="10" name="Picture 10"/>
             <wp:cNvGraphicFramePr>
               <a:graphicFrameLocks noChangeAspect="1"/>
@@ -1090,11 +1855,11 @@
               <a:graphicData uri="http://schemas.openxmlformats.org/drawingml/2006/picture">
                 <pic:pic>
                   <pic:nvPicPr>
-                    <pic:cNvPr id="0" name="06_Live_Benchmark.png"/>
+                    <pic:cNvPr id="0" name="04b_Strength_Charts.png"/>
                     <pic:cNvPicPr/>
                   </pic:nvPicPr>
                   <pic:blipFill>
-                    <a:blip r:embed="rId19"/>
+                    <a:blip r:embed="rId20"/>
                     <a:stretch>
                       <a:fillRect/>
                     </a:stretch>
@@ -1102,7 +1867,7 @@
                   <pic:spPr>
                     <a:xfrm>
                       <a:off x="0" y="0"/>
-                      <a:ext cx="5760720" cy="2745013"/>
+                      <a:ext cx="5669280" cy="2518293"/>
                     </a:xfrm>
                     <a:prstGeom prst="rect"/>
                   </pic:spPr>
@@ -1115,31 +1880,16 @@
     </w:p>
     <w:p>
       <w:pPr>
+        <w:spacing w:before="40" w:after="200"/>
         <w:jc w:val="center"/>
       </w:pPr>
       <w:r>
         <w:rPr>
           <w:i/>
-          <w:sz w:val="19"/>
+          <w:color w:val="555555"/>
+          <w:sz w:val="18"/>
         </w:rPr>
-        <w:t>Figure G: Live-measured MD5 hashing throughput on the host machine</w:t>
-      </w:r>
-    </w:p>
-    <w:p/>
-    <w:p>
-      <w:pPr>
-        <w:pStyle w:val="Heading2"/>
-      </w:pPr>
-      <w:r>
-        <w:rPr>
-          <w:color w:val="1E3A5F"/>
-        </w:rPr>
-        <w:t>7.8 Consolidated Audit Report</w:t>
-      </w:r>
-    </w:p>
-    <w:p>
-      <w:r>
-        <w:t>Finally, the Audit Report tab consolidates every prior result -- strength analysis, attack results, brute-force estimate, and NIST compliance -- into a single in-app markdown report, downloadable as a .md file. The report is split into two figures below: the executive summary and strength table, followed by the attack/compliance sections.</w:t>
+        <w:t>Figure 10: Entropy histogram (left) and severity pie chart (right)</w:t>
       </w:r>
     </w:p>
     <w:p>
@@ -1149,7 +1899,7 @@
       <w:r>
         <w:drawing>
           <wp:inline xmlns:a="http://schemas.openxmlformats.org/drawingml/2006/main" xmlns:pic="http://schemas.openxmlformats.org/drawingml/2006/picture">
-            <wp:extent cx="5760720" cy="5033228"/>
+            <wp:extent cx="5303520" cy="3072303"/>
             <wp:docPr id="11" name="Picture 11"/>
             <wp:cNvGraphicFramePr>
               <a:graphicFrameLocks noChangeAspect="1"/>
@@ -1158,11 +1908,11 @@
               <a:graphicData uri="http://schemas.openxmlformats.org/drawingml/2006/picture">
                 <pic:pic>
                   <pic:nvPicPr>
-                    <pic:cNvPr id="0" name="07a_Report_Summary_Table.png"/>
+                    <pic:cNvPr id="0" name="04c_Risk_Ranking.png"/>
                     <pic:cNvPicPr/>
                   </pic:nvPicPr>
                   <pic:blipFill>
-                    <a:blip r:embed="rId20"/>
+                    <a:blip r:embed="rId21"/>
                     <a:stretch>
                       <a:fillRect/>
                     </a:stretch>
@@ -1170,7 +1920,7 @@
                   <pic:spPr>
                     <a:xfrm>
                       <a:off x="0" y="0"/>
-                      <a:ext cx="5760720" cy="5033228"/>
+                      <a:ext cx="5303520" cy="3072303"/>
                     </a:xfrm>
                     <a:prstGeom prst="rect"/>
                   </pic:spPr>
@@ -1183,17 +1933,44 @@
     </w:p>
     <w:p>
       <w:pPr>
+        <w:spacing w:before="40" w:after="200"/>
         <w:jc w:val="center"/>
       </w:pPr>
       <w:r>
         <w:rPr>
           <w:i/>
-          <w:sz w:val="19"/>
+          <w:color w:val="555555"/>
+          <w:sz w:val="18"/>
         </w:rPr>
-        <w:t>Figure H1: Audit report header, executive summary, and full strength-analysis table</w:t>
+        <w:t>Figure 11: Per-account risk ranking — '123456' highest risk, 'Xk9$mQ2#vL8pR4z' lowest</w:t>
       </w:r>
     </w:p>
     <w:p/>
+    <w:p>
+      <w:r>
+        <w:br w:type="page"/>
+      </w:r>
+    </w:p>
+    <w:p>
+      <w:pPr>
+        <w:pStyle w:val="Heading2"/>
+      </w:pPr>
+      <w:r>
+        <w:rPr>
+          <w:color w:val="2F6EA5"/>
+          <w:sz w:val="24"/>
+        </w:rPr>
+        <w:t>8.10  NIST SP 800-63B Compliance</w:t>
+      </w:r>
+    </w:p>
+    <w:p>
+      <w:pPr>
+        <w:spacing w:after="120"/>
+      </w:pPr>
+      <w:r>
+        <w:t>The 10 sample passwords were checked against the compliance rules implemented in `modules/compliance_checker.py`. Six of ten passed. Failures are itemised: '123456' fails on minimum length AND breach-corpus membership; 'admin' fails on minimum length and breach-corpus; 'password123' and 'letmein1' fail on breach-corpus alone. No composition rules (mixed-case/digits/symbols) are mandated — consistent with NIST.</w:t>
+      </w:r>
+    </w:p>
     <w:p>
       <w:pPr>
         <w:jc w:val="center"/>
@@ -1201,7 +1978,7 @@
       <w:r>
         <w:drawing>
           <wp:inline xmlns:a="http://schemas.openxmlformats.org/drawingml/2006/main" xmlns:pic="http://schemas.openxmlformats.org/drawingml/2006/picture">
-            <wp:extent cx="5760720" cy="5024769"/>
+            <wp:extent cx="5669280" cy="4050080"/>
             <wp:docPr id="12" name="Picture 12"/>
             <wp:cNvGraphicFramePr>
               <a:graphicFrameLocks noChangeAspect="1"/>
@@ -1210,11 +1987,11 @@
               <a:graphicData uri="http://schemas.openxmlformats.org/drawingml/2006/picture">
                 <pic:pic>
                   <pic:nvPicPr>
-                    <pic:cNvPr id="0" name="07b_Report_Attacks_Compliance.png"/>
+                    <pic:cNvPr id="0" name="05_NIST_Compliance.png"/>
                     <pic:cNvPicPr/>
                   </pic:nvPicPr>
                   <pic:blipFill>
-                    <a:blip r:embed="rId21"/>
+                    <a:blip r:embed="rId22"/>
                     <a:stretch>
                       <a:fillRect/>
                     </a:stretch>
@@ -1222,7 +1999,7 @@
                   <pic:spPr>
                     <a:xfrm>
                       <a:off x="0" y="0"/>
-                      <a:ext cx="5760720" cy="5024769"/>
+                      <a:ext cx="5669280" cy="4050080"/>
                     </a:xfrm>
                     <a:prstGeom prst="rect"/>
                   </pic:spPr>
@@ -1235,588 +2012,47 @@
     </w:p>
     <w:p>
       <w:pPr>
+        <w:spacing w:before="40" w:after="200"/>
         <w:jc w:val="center"/>
       </w:pPr>
       <w:r>
         <w:rPr>
           <w:i/>
-          <w:sz w:val="19"/>
+          <w:color w:val="555555"/>
+          <w:sz w:val="18"/>
         </w:rPr>
-        <w:t>Figure H2: Brute-force estimate and NIST SP 800-63B compliance table within the consolidated report</w:t>
+        <w:t>Figure 12: NIST 800-63B compliance — 6/10 compliant, itemised violations per password</w:t>
       </w:r>
     </w:p>
     <w:p/>
     <w:p>
+      <w:pPr>
+        <w:pStyle w:val="Heading2"/>
+      </w:pPr>
       <w:r>
-        <w:br w:type="page"/>
+        <w:rPr>
+          <w:color w:val="2F6EA5"/>
+          <w:sz w:val="24"/>
+        </w:rPr>
+        <w:t>8.11  Live Hardware Benchmark</w:t>
       </w:r>
     </w:p>
     <w:p>
       <w:pPr>
-        <w:pStyle w:val="Heading1"/>
+        <w:spacing w:after="120"/>
       </w:pPr>
       <w:r>
-        <w:rPr>
-          <w:color w:val="1E3A5F"/>
-        </w:rPr>
-        <w:t>8. Key Differentiators</w:t>
-      </w:r>
-    </w:p>
-    <w:p>
-      <w:r>
-        <w:t>Beyond the four baseline modules, this implementation adds the following to demonstrate depth of understanding rather than a surface-level reproduction of the brief:</w:t>
+        <w:t>Selecting MD5 and clicking 'Run benchmark' measured 1.1 million MD5 hashes per second on the Streamlit Cloud container — the exact figure subsequently used in the brute-force time-to-crack calculation. This replaces a guessed constant with an empirically measured rate specific to the hardware running the assessment.</w:t>
       </w:r>
     </w:p>
     <w:p>
       <w:pPr>
-        <w:pStyle w:val="ListBullet"/>
+        <w:jc w:val="center"/>
       </w:pPr>
-      <w:r>
-        <w:t>A fully interactive Streamlit dashboard with seven functional tabs, not just a CLI.</w:t>
-      </w:r>
-    </w:p>
-    <w:p>
-      <w:pPr>
-        <w:pStyle w:val="ListBullet"/>
-      </w:pPr>
-      <w:r>
-        <w:t>Real cryptographic verification against actual Linux crypt hashes using passlib, in addition to raw-digest simulation.</w:t>
-      </w:r>
-    </w:p>
-    <w:p>
-      <w:pPr>
-        <w:pStyle w:val="ListBullet"/>
-      </w:pPr>
-      <w:r>
-        <w:t>A live hash-rate benchmark that measures this machine's real throughput and feeds it into time-to-crack estimates, instead of relying on a guessed constant.</w:t>
-      </w:r>
-    </w:p>
-    <w:p>
-      <w:pPr>
-        <w:pStyle w:val="ListBullet"/>
-      </w:pPr>
-      <w:r>
-        <w:t>Compliance scoring against the published NIST SP 800-63B standard with an offline breach corpus, repetition/sequence/context-word checks.</w:t>
-      </w:r>
-    </w:p>
-    <w:p>
-      <w:pPr>
-        <w:pStyle w:val="ListBullet"/>
-      </w:pPr>
-      <w:r>
-        <w:t>Visual analytics (entropy histogram, severity pie chart, per-account risk ranking) embedded in both the dashboard and the generated report.</w:t>
-      </w:r>
-    </w:p>
-    <w:p>
-      <w:pPr>
-        <w:pStyle w:val="ListBullet"/>
-      </w:pPr>
-      <w:r>
-        <w:t>A 38-test automated pytest suite covering every module, independently verifiable by re-running `pytest tests/`.</w:t>
-      </w:r>
-    </w:p>
-    <w:p>
-      <w:pPr>
-        <w:pStyle w:val="Heading1"/>
-      </w:pPr>
-      <w:r>
-        <w:rPr>
-          <w:color w:val="1E3A5F"/>
-        </w:rPr>
-        <w:t>9. Results &amp; Demonstration</w:t>
-      </w:r>
-    </w:p>
-    <w:p>
-      <w:r>
-        <w:t>The toolkit was exercised end-to-end against the bundled sample data (sample_data/sample_shadow.txt, sample_sam_dump.txt, sample_passwords.txt, breach_corpus.txt). A summary of the strength-analysis run is shown below.</w:t>
-      </w:r>
-    </w:p>
-    <w:tbl>
-      <w:tblPr>
-        <w:tblStyle w:val="LightGrid-Accent1"/>
-        <w:tblW w:type="auto" w:w="0"/>
-        <w:tblLook w:firstColumn="1" w:firstRow="1" w:lastColumn="0" w:lastRow="0" w:noHBand="0" w:noVBand="1" w:val="04A0"/>
-      </w:tblPr>
-      <w:tblGrid>
-        <w:gridCol w:w="2160"/>
-        <w:gridCol w:w="2160"/>
-        <w:gridCol w:w="2160"/>
-        <w:gridCol w:w="2160"/>
-      </w:tblGrid>
-      <w:tr>
-        <w:tc>
-          <w:tcPr>
-            <w:tcW w:type="dxa" w:w="2160"/>
-          </w:tcPr>
-          <w:p>
-            <w:r>
-              <w:t>Password</w:t>
-            </w:r>
-          </w:p>
-        </w:tc>
-        <w:tc>
-          <w:tcPr>
-            <w:tcW w:type="dxa" w:w="2160"/>
-          </w:tcPr>
-          <w:p>
-            <w:r>
-              <w:t>Length</w:t>
-            </w:r>
-          </w:p>
-        </w:tc>
-        <w:tc>
-          <w:tcPr>
-            <w:tcW w:type="dxa" w:w="2160"/>
-          </w:tcPr>
-          <w:p>
-            <w:r>
-              <w:t>Entropy (bits)</w:t>
-            </w:r>
-          </w:p>
-        </w:tc>
-        <w:tc>
-          <w:tcPr>
-            <w:tcW w:type="dxa" w:w="2160"/>
-          </w:tcPr>
-          <w:p>
-            <w:r>
-              <w:t>Severity</w:t>
-            </w:r>
-          </w:p>
-        </w:tc>
-      </w:tr>
-      <w:tr>
-        <w:tc>
-          <w:tcPr>
-            <w:tcW w:type="dxa" w:w="2160"/>
-          </w:tcPr>
-          <w:p>
-            <w:r>
-              <w:t>password123</w:t>
-            </w:r>
-          </w:p>
-        </w:tc>
-        <w:tc>
-          <w:tcPr>
-            <w:tcW w:type="dxa" w:w="2160"/>
-          </w:tcPr>
-          <w:p>
-            <w:r>
-              <w:t>11</w:t>
-            </w:r>
-          </w:p>
-        </w:tc>
-        <w:tc>
-          <w:tcPr>
-            <w:tcW w:type="dxa" w:w="2160"/>
-          </w:tcPr>
-          <w:p>
-            <w:r>
-              <w:t>56.87</w:t>
-            </w:r>
-          </w:p>
-        </w:tc>
-        <w:tc>
-          <w:tcPr>
-            <w:tcW w:type="dxa" w:w="2160"/>
-          </w:tcPr>
-          <w:p>
-            <w:r>
-              <w:t>Medium</w:t>
-            </w:r>
-          </w:p>
-        </w:tc>
-      </w:tr>
-      <w:tr>
-        <w:tc>
-          <w:tcPr>
-            <w:tcW w:type="dxa" w:w="2160"/>
-          </w:tcPr>
-          <w:p>
-            <w:r>
-              <w:t>qwerty12</w:t>
-            </w:r>
-          </w:p>
-        </w:tc>
-        <w:tc>
-          <w:tcPr>
-            <w:tcW w:type="dxa" w:w="2160"/>
-          </w:tcPr>
-          <w:p>
-            <w:r>
-              <w:t>8</w:t>
-            </w:r>
-          </w:p>
-        </w:tc>
-        <w:tc>
-          <w:tcPr>
-            <w:tcW w:type="dxa" w:w="2160"/>
-          </w:tcPr>
-          <w:p>
-            <w:r>
-              <w:t>41.36</w:t>
-            </w:r>
-          </w:p>
-        </w:tc>
-        <w:tc>
-          <w:tcPr>
-            <w:tcW w:type="dxa" w:w="2160"/>
-          </w:tcPr>
-          <w:p>
-            <w:r>
-              <w:t>High</w:t>
-            </w:r>
-          </w:p>
-        </w:tc>
-      </w:tr>
-      <w:tr>
-        <w:tc>
-          <w:tcPr>
-            <w:tcW w:type="dxa" w:w="2160"/>
-          </w:tcPr>
-          <w:p>
-            <w:r>
-              <w:t>P@ssw0rd!2025</w:t>
-            </w:r>
-          </w:p>
-        </w:tc>
-        <w:tc>
-          <w:tcPr>
-            <w:tcW w:type="dxa" w:w="2160"/>
-          </w:tcPr>
-          <w:p>
-            <w:r>
-              <w:t>13</w:t>
-            </w:r>
-          </w:p>
-        </w:tc>
-        <w:tc>
-          <w:tcPr>
-            <w:tcW w:type="dxa" w:w="2160"/>
-          </w:tcPr>
-          <w:p>
-            <w:r>
-              <w:t>85.41</w:t>
-            </w:r>
-          </w:p>
-        </w:tc>
-        <w:tc>
-          <w:tcPr>
-            <w:tcW w:type="dxa" w:w="2160"/>
-          </w:tcPr>
-          <w:p>
-            <w:r>
-              <w:t>Low</w:t>
-            </w:r>
-          </w:p>
-        </w:tc>
-      </w:tr>
-      <w:tr>
-        <w:tc>
-          <w:tcPr>
-            <w:tcW w:type="dxa" w:w="2160"/>
-          </w:tcPr>
-          <w:p>
-            <w:r>
-              <w:t>123456</w:t>
-            </w:r>
-          </w:p>
-        </w:tc>
-        <w:tc>
-          <w:tcPr>
-            <w:tcW w:type="dxa" w:w="2160"/>
-          </w:tcPr>
-          <w:p>
-            <w:r>
-              <w:t>6</w:t>
-            </w:r>
-          </w:p>
-        </w:tc>
-        <w:tc>
-          <w:tcPr>
-            <w:tcW w:type="dxa" w:w="2160"/>
-          </w:tcPr>
-          <w:p>
-            <w:r>
-              <w:t>19.93</w:t>
-            </w:r>
-          </w:p>
-        </w:tc>
-        <w:tc>
-          <w:tcPr>
-            <w:tcW w:type="dxa" w:w="2160"/>
-          </w:tcPr>
-          <w:p>
-            <w:r>
-              <w:t>Critical</w:t>
-            </w:r>
-          </w:p>
-        </w:tc>
-      </w:tr>
-      <w:tr>
-        <w:tc>
-          <w:tcPr>
-            <w:tcW w:type="dxa" w:w="2160"/>
-          </w:tcPr>
-          <w:p>
-            <w:r>
-              <w:t>Tr0ub4dor&amp;3</w:t>
-            </w:r>
-          </w:p>
-        </w:tc>
-        <w:tc>
-          <w:tcPr>
-            <w:tcW w:type="dxa" w:w="2160"/>
-          </w:tcPr>
-          <w:p>
-            <w:r>
-              <w:t>11</w:t>
-            </w:r>
-          </w:p>
-        </w:tc>
-        <w:tc>
-          <w:tcPr>
-            <w:tcW w:type="dxa" w:w="2160"/>
-          </w:tcPr>
-          <w:p>
-            <w:r>
-              <w:t>72.27</w:t>
-            </w:r>
-          </w:p>
-        </w:tc>
-        <w:tc>
-          <w:tcPr>
-            <w:tcW w:type="dxa" w:w="2160"/>
-          </w:tcPr>
-          <w:p>
-            <w:r>
-              <w:t>Low</w:t>
-            </w:r>
-          </w:p>
-        </w:tc>
-      </w:tr>
-      <w:tr>
-        <w:tc>
-          <w:tcPr>
-            <w:tcW w:type="dxa" w:w="2160"/>
-          </w:tcPr>
-          <w:p>
-            <w:r>
-              <w:t>admin</w:t>
-            </w:r>
-          </w:p>
-        </w:tc>
-        <w:tc>
-          <w:tcPr>
-            <w:tcW w:type="dxa" w:w="2160"/>
-          </w:tcPr>
-          <w:p>
-            <w:r>
-              <w:t>5</w:t>
-            </w:r>
-          </w:p>
-        </w:tc>
-        <w:tc>
-          <w:tcPr>
-            <w:tcW w:type="dxa" w:w="2160"/>
-          </w:tcPr>
-          <w:p>
-            <w:r>
-              <w:t>23.50</w:t>
-            </w:r>
-          </w:p>
-        </w:tc>
-        <w:tc>
-          <w:tcPr>
-            <w:tcW w:type="dxa" w:w="2160"/>
-          </w:tcPr>
-          <w:p>
-            <w:r>
-              <w:t>Critical</w:t>
-            </w:r>
-          </w:p>
-        </w:tc>
-      </w:tr>
-      <w:tr>
-        <w:tc>
-          <w:tcPr>
-            <w:tcW w:type="dxa" w:w="2160"/>
-          </w:tcPr>
-          <w:p>
-            <w:r>
-              <w:t>correcthorsebatterystaple</w:t>
-            </w:r>
-          </w:p>
-        </w:tc>
-        <w:tc>
-          <w:tcPr>
-            <w:tcW w:type="dxa" w:w="2160"/>
-          </w:tcPr>
-          <w:p>
-            <w:r>
-              <w:t>25</w:t>
-            </w:r>
-          </w:p>
-        </w:tc>
-        <w:tc>
-          <w:tcPr>
-            <w:tcW w:type="dxa" w:w="2160"/>
-          </w:tcPr>
-          <w:p>
-            <w:r>
-              <w:t>117.51</w:t>
-            </w:r>
-          </w:p>
-        </w:tc>
-        <w:tc>
-          <w:tcPr>
-            <w:tcW w:type="dxa" w:w="2160"/>
-          </w:tcPr>
-          <w:p>
-            <w:r>
-              <w:t>Low</w:t>
-            </w:r>
-          </w:p>
-        </w:tc>
-      </w:tr>
-      <w:tr>
-        <w:tc>
-          <w:tcPr>
-            <w:tcW w:type="dxa" w:w="2160"/>
-          </w:tcPr>
-          <w:p>
-            <w:r>
-              <w:t>Summer2026!</w:t>
-            </w:r>
-          </w:p>
-        </w:tc>
-        <w:tc>
-          <w:tcPr>
-            <w:tcW w:type="dxa" w:w="2160"/>
-          </w:tcPr>
-          <w:p>
-            <w:r>
-              <w:t>11</w:t>
-            </w:r>
-          </w:p>
-        </w:tc>
-        <w:tc>
-          <w:tcPr>
-            <w:tcW w:type="dxa" w:w="2160"/>
-          </w:tcPr>
-          <w:p>
-            <w:r>
-              <w:t>72.27</w:t>
-            </w:r>
-          </w:p>
-        </w:tc>
-        <w:tc>
-          <w:tcPr>
-            <w:tcW w:type="dxa" w:w="2160"/>
-          </w:tcPr>
-          <w:p>
-            <w:r>
-              <w:t>Low</w:t>
-            </w:r>
-          </w:p>
-        </w:tc>
-      </w:tr>
-      <w:tr>
-        <w:tc>
-          <w:tcPr>
-            <w:tcW w:type="dxa" w:w="2160"/>
-          </w:tcPr>
-          <w:p>
-            <w:r>
-              <w:t>letmein1</w:t>
-            </w:r>
-          </w:p>
-        </w:tc>
-        <w:tc>
-          <w:tcPr>
-            <w:tcW w:type="dxa" w:w="2160"/>
-          </w:tcPr>
-          <w:p>
-            <w:r>
-              <w:t>8</w:t>
-            </w:r>
-          </w:p>
-        </w:tc>
-        <w:tc>
-          <w:tcPr>
-            <w:tcW w:type="dxa" w:w="2160"/>
-          </w:tcPr>
-          <w:p>
-            <w:r>
-              <w:t>41.36</w:t>
-            </w:r>
-          </w:p>
-        </w:tc>
-        <w:tc>
-          <w:tcPr>
-            <w:tcW w:type="dxa" w:w="2160"/>
-          </w:tcPr>
-          <w:p>
-            <w:r>
-              <w:t>Medium</w:t>
-            </w:r>
-          </w:p>
-        </w:tc>
-      </w:tr>
-      <w:tr>
-        <w:tc>
-          <w:tcPr>
-            <w:tcW w:type="dxa" w:w="2160"/>
-          </w:tcPr>
-          <w:p>
-            <w:r>
-              <w:t>Xk9$mQ2#vL8pR4z</w:t>
-            </w:r>
-          </w:p>
-        </w:tc>
-        <w:tc>
-          <w:tcPr>
-            <w:tcW w:type="dxa" w:w="2160"/>
-          </w:tcPr>
-          <w:p>
-            <w:r>
-              <w:t>15</w:t>
-            </w:r>
-          </w:p>
-        </w:tc>
-        <w:tc>
-          <w:tcPr>
-            <w:tcW w:type="dxa" w:w="2160"/>
-          </w:tcPr>
-          <w:p>
-            <w:r>
-              <w:t>98.55</w:t>
-            </w:r>
-          </w:p>
-        </w:tc>
-        <w:tc>
-          <w:tcPr>
-            <w:tcW w:type="dxa" w:w="2160"/>
-          </w:tcPr>
-          <w:p>
-            <w:r>
-              <w:t>Low</w:t>
-            </w:r>
-          </w:p>
-        </w:tc>
-      </w:tr>
-    </w:tbl>
-    <w:p/>
-    <w:p>
-      <w:r>
-        <w:t>NIST SP 800-63B compliance result for the same sample set: 6 of 10 passwords compliant; the 4 non-compliant entries were rejected for matching the local breach corpus, being below the 8-character minimum, or containing a sequential character run.</w:t>
-      </w:r>
-    </w:p>
-    <w:p>
       <w:r>
         <w:drawing>
           <wp:inline xmlns:a="http://schemas.openxmlformats.org/drawingml/2006/main" xmlns:pic="http://schemas.openxmlformats.org/drawingml/2006/picture">
-            <wp:extent cx="4206240" cy="2804160"/>
+            <wp:extent cx="5669280" cy="2701441"/>
             <wp:docPr id="13" name="Picture 13"/>
             <wp:cNvGraphicFramePr>
               <a:graphicFrameLocks noChangeAspect="1"/>
@@ -1825,11 +2061,11 @@
               <a:graphicData uri="http://schemas.openxmlformats.org/drawingml/2006/picture">
                 <pic:pic>
                   <pic:nvPicPr>
-                    <pic:cNvPr id="0" name="entropy_histogram.png"/>
+                    <pic:cNvPr id="0" name="06_Live_Benchmark.png"/>
                     <pic:cNvPicPr/>
                   </pic:nvPicPr>
                   <pic:blipFill>
-                    <a:blip r:embed="rId22"/>
+                    <a:blip r:embed="rId23"/>
                     <a:stretch>
                       <a:fillRect/>
                     </a:stretch>
@@ -1837,7 +2073,7 @@
                   <pic:spPr>
                     <a:xfrm>
                       <a:off x="0" y="0"/>
-                      <a:ext cx="4206240" cy="2804160"/>
+                      <a:ext cx="5669280" cy="2701441"/>
                     </a:xfrm>
                     <a:prstGeom prst="rect"/>
                   </pic:spPr>
@@ -1850,20 +2086,52 @@
     </w:p>
     <w:p>
       <w:pPr>
+        <w:spacing w:before="40" w:after="200"/>
         <w:jc w:val="center"/>
       </w:pPr>
       <w:r>
         <w:rPr>
           <w:i/>
+          <w:color w:val="555555"/>
+          <w:sz w:val="18"/>
         </w:rPr>
-        <w:t>Figure 2: Password entropy distribution</w:t>
+        <w:t>Figure 13: Live-measured MD5 throughput — 1,109,323 hashes/sec on the host machine</w:t>
+      </w:r>
+    </w:p>
+    <w:p/>
+    <w:p>
+      <w:r>
+        <w:br w:type="page"/>
       </w:r>
     </w:p>
     <w:p>
+      <w:pPr>
+        <w:pStyle w:val="Heading2"/>
+      </w:pPr>
+      <w:r>
+        <w:rPr>
+          <w:color w:val="2F6EA5"/>
+          <w:sz w:val="24"/>
+        </w:rPr>
+        <w:t>8.12  Consolidated Audit Report</w:t>
+      </w:r>
+    </w:p>
+    <w:p>
+      <w:pPr>
+        <w:spacing w:after="120"/>
+      </w:pPr>
+      <w:r>
+        <w:t>The Audit Report tab aggregates all session results — dict attack, brute-force estimate, strength analysis, NIST compliance — into a single downloadable Markdown report. The figure below is split into two parts for legibility.</w:t>
+      </w:r>
+    </w:p>
+    <w:p>
+      <w:pPr>
+        <w:jc w:val="center"/>
+      </w:pPr>
       <w:r>
         <w:drawing>
           <wp:inline xmlns:a="http://schemas.openxmlformats.org/drawingml/2006/main" xmlns:pic="http://schemas.openxmlformats.org/drawingml/2006/picture">
-            <wp:extent cx="4206240" cy="4206240"/>
+            <wp:extent cx="5669280" cy="4953336"/>
             <wp:docPr id="14" name="Picture 14"/>
             <wp:cNvGraphicFramePr>
               <a:graphicFrameLocks noChangeAspect="1"/>
@@ -1872,11 +2140,11 @@
               <a:graphicData uri="http://schemas.openxmlformats.org/drawingml/2006/picture">
                 <pic:pic>
                   <pic:nvPicPr>
-                    <pic:cNvPr id="0" name="severity_pie.png"/>
+                    <pic:cNvPr id="0" name="07a_Report_Summary_Table.png"/>
                     <pic:cNvPicPr/>
                   </pic:nvPicPr>
                   <pic:blipFill>
-                    <a:blip r:embed="rId23"/>
+                    <a:blip r:embed="rId24"/>
                     <a:stretch>
                       <a:fillRect/>
                     </a:stretch>
@@ -1884,7 +2152,7 @@
                   <pic:spPr>
                     <a:xfrm>
                       <a:off x="0" y="0"/>
-                      <a:ext cx="4206240" cy="4206240"/>
+                      <a:ext cx="5669280" cy="4953336"/>
                     </a:xfrm>
                     <a:prstGeom prst="rect"/>
                   </pic:spPr>
@@ -1897,20 +2165,26 @@
     </w:p>
     <w:p>
       <w:pPr>
+        <w:spacing w:before="40" w:after="200"/>
         <w:jc w:val="center"/>
       </w:pPr>
       <w:r>
         <w:rPr>
           <w:i/>
+          <w:color w:val="555555"/>
+          <w:sz w:val="18"/>
         </w:rPr>
-        <w:t>Figure 3: Severity distribution across the sample set</w:t>
+        <w:t>Figure 14a: Audit report header, executive summary, and full strength-analysis table</w:t>
       </w:r>
     </w:p>
     <w:p>
+      <w:pPr>
+        <w:jc w:val="center"/>
+      </w:pPr>
       <w:r>
         <w:drawing>
           <wp:inline xmlns:a="http://schemas.openxmlformats.org/drawingml/2006/main" xmlns:pic="http://schemas.openxmlformats.org/drawingml/2006/picture">
-            <wp:extent cx="4206240" cy="2403566"/>
+            <wp:extent cx="5669280" cy="6626647"/>
             <wp:docPr id="15" name="Picture 15"/>
             <wp:cNvGraphicFramePr>
               <a:graphicFrameLocks noChangeAspect="1"/>
@@ -1919,11 +2193,11 @@
               <a:graphicData uri="http://schemas.openxmlformats.org/drawingml/2006/picture">
                 <pic:pic>
                   <pic:nvPicPr>
-                    <pic:cNvPr id="0" name="risk_ranking.png"/>
+                    <pic:cNvPr id="0" name="07b_Report_Attacks_Compliance.png"/>
                     <pic:cNvPicPr/>
                   </pic:nvPicPr>
                   <pic:blipFill>
-                    <a:blip r:embed="rId24"/>
+                    <a:blip r:embed="rId25"/>
                     <a:stretch>
                       <a:fillRect/>
                     </a:stretch>
@@ -1931,7 +2205,7 @@
                   <pic:spPr>
                     <a:xfrm>
                       <a:off x="0" y="0"/>
-                      <a:ext cx="4206240" cy="2403566"/>
+                      <a:ext cx="5669280" cy="6626647"/>
                     </a:xfrm>
                     <a:prstGeom prst="rect"/>
                   </pic:spPr>
@@ -1944,13 +2218,16 @@
     </w:p>
     <w:p>
       <w:pPr>
+        <w:spacing w:before="40" w:after="200"/>
         <w:jc w:val="center"/>
       </w:pPr>
       <w:r>
         <w:rPr>
           <w:i/>
+          <w:color w:val="555555"/>
+          <w:sz w:val="18"/>
         </w:rPr>
-        <w:t>Figure 4: Per-account risk ranking (lowest entropy = highest risk)</w:t>
+        <w:t>Figure 14b: Attack simulation results, brute-force estimate, NIST compliance section and recommendations</w:t>
       </w:r>
     </w:p>
     <w:p>
@@ -1961,33 +2238,452 @@
     <w:p>
       <w:pPr>
         <w:pStyle w:val="Heading1"/>
+        <w:pBdr>
+          <w:bottom w:val="single" w:sz="6" w:space="3" w:color="2F6EA5"/>
+        </w:pBdr>
       </w:pPr>
       <w:r>
         <w:rPr>
           <w:color w:val="1E3A5F"/>
+          <w:sz w:val="28"/>
         </w:rPr>
-        <w:t>10. Real Attack Demonstration</w:t>
-      </w:r>
-    </w:p>
-    <w:p>
-      <w:r>
-        <w:t>Unlike a purely theoretical exercise, this toolkit was verified against real, freshly generated crypt hashes. A SHA-512-crypt hash for user 'alice' (sample_shadow.txt) was cracked via a real passlib dictionary attack in 1,070 attempts, recovering the password 'password123'. An MD5-crypt hash for user 'bob' was cracked in 702 attempts, recovering 'admin'. This confirms the attack-simulation pipeline works against genuine crypt-style hashes, not only against pre-computed raw digests.</w:t>
+        <w:t>9. Real Attack Demonstration Results</w:t>
       </w:r>
     </w:p>
     <w:p>
       <w:pPr>
+        <w:spacing w:after="120"/>
+      </w:pPr>
+      <w:r>
+        <w:t>Unlike a theoretical simulation, this toolkit was verified against real, freshly generated Linux crypt hashes. The following table summarises each crypt attack run during the demonstration session.</w:t>
+      </w:r>
+    </w:p>
+    <w:tbl>
+      <w:tblPr>
+        <w:tblStyle w:val="TableGrid"/>
+        <w:tblW w:type="auto" w:w="0"/>
+        <w:tblLook w:firstColumn="1" w:firstRow="1" w:lastColumn="0" w:lastRow="0" w:noHBand="0" w:noVBand="1" w:val="04A0"/>
+      </w:tblPr>
+      <w:tblGrid>
+        <w:gridCol w:w="1805"/>
+        <w:gridCol w:w="1805"/>
+        <w:gridCol w:w="1805"/>
+        <w:gridCol w:w="1805"/>
+        <w:gridCol w:w="1805"/>
+      </w:tblGrid>
+      <w:tr>
+        <w:tc>
+          <w:tcPr>
+            <w:tcW w:type="dxa" w:w="1728"/>
+            <w:shd w:val="clear" w:color="auto" w:fill="2F6EA5"/>
+            <w:vAlign w:val="center"/>
+          </w:tcPr>
+          <w:p>
+            <w:pPr>
+              <w:jc w:val="center"/>
+            </w:pPr>
+            <w:r>
+              <w:rPr>
+                <w:b/>
+                <w:color w:val="FFFFFF"/>
+                <w:sz w:val="20"/>
+              </w:rPr>
+              <w:t>Username</w:t>
+            </w:r>
+          </w:p>
+        </w:tc>
+        <w:tc>
+          <w:tcPr>
+            <w:tcW w:type="dxa" w:w="3168"/>
+            <w:shd w:val="clear" w:color="auto" w:fill="2F6EA5"/>
+            <w:vAlign w:val="center"/>
+          </w:tcPr>
+          <w:p>
+            <w:pPr>
+              <w:jc w:val="center"/>
+            </w:pPr>
+            <w:r>
+              <w:rPr>
+                <w:b/>
+                <w:color w:val="FFFFFF"/>
+                <w:sz w:val="20"/>
+              </w:rPr>
+              <w:t>Algorithm</w:t>
+            </w:r>
+          </w:p>
+        </w:tc>
+        <w:tc>
+          <w:tcPr>
+            <w:tcW w:type="dxa" w:w="2880"/>
+            <w:shd w:val="clear" w:color="auto" w:fill="2F6EA5"/>
+            <w:vAlign w:val="center"/>
+          </w:tcPr>
+          <w:p>
+            <w:pPr>
+              <w:jc w:val="center"/>
+            </w:pPr>
+            <w:r>
+              <w:rPr>
+                <w:b/>
+                <w:color w:val="FFFFFF"/>
+                <w:sz w:val="20"/>
+              </w:rPr>
+              <w:t>Password Recovered</w:t>
+            </w:r>
+          </w:p>
+        </w:tc>
+        <w:tc>
+          <w:tcPr>
+            <w:tcW w:type="dxa" w:w="1584"/>
+            <w:shd w:val="clear" w:color="auto" w:fill="2F6EA5"/>
+            <w:vAlign w:val="center"/>
+          </w:tcPr>
+          <w:p>
+            <w:pPr>
+              <w:jc w:val="center"/>
+            </w:pPr>
+            <w:r>
+              <w:rPr>
+                <w:b/>
+                <w:color w:val="FFFFFF"/>
+                <w:sz w:val="20"/>
+              </w:rPr>
+              <w:t>Attempts</w:t>
+            </w:r>
+          </w:p>
+        </w:tc>
+        <w:tc>
+          <w:tcPr>
+            <w:tcW w:type="dxa" w:w="1440"/>
+            <w:shd w:val="clear" w:color="auto" w:fill="2F6EA5"/>
+            <w:vAlign w:val="center"/>
+          </w:tcPr>
+          <w:p>
+            <w:pPr>
+              <w:jc w:val="center"/>
+            </w:pPr>
+            <w:r>
+              <w:rPr>
+                <w:b/>
+                <w:color w:val="FFFFFF"/>
+                <w:sz w:val="20"/>
+              </w:rPr>
+              <w:t>Time (s)</w:t>
+            </w:r>
+          </w:p>
+        </w:tc>
+      </w:tr>
+      <w:tr>
+        <w:tc>
+          <w:tcPr>
+            <w:tcW w:type="dxa" w:w="1728"/>
+            <w:shd w:val="clear" w:color="auto" w:fill="EEF4FA"/>
+          </w:tcPr>
+          <w:p>
+            <w:r>
+              <w:rPr>
+                <w:sz w:val="20"/>
+              </w:rPr>
+              <w:t>root</w:t>
+            </w:r>
+          </w:p>
+        </w:tc>
+        <w:tc>
+          <w:tcPr>
+            <w:tcW w:type="dxa" w:w="3168"/>
+            <w:shd w:val="clear" w:color="auto" w:fill="EEF4FA"/>
+          </w:tcPr>
+          <w:p>
+            <w:r>
+              <w:rPr>
+                <w:sz w:val="20"/>
+              </w:rPr>
+              <w:t>SHA-512 crypt ($6$)</w:t>
+            </w:r>
+          </w:p>
+        </w:tc>
+        <w:tc>
+          <w:tcPr>
+            <w:tcW w:type="dxa" w:w="2880"/>
+            <w:shd w:val="clear" w:color="auto" w:fill="EEF4FA"/>
+          </w:tcPr>
+          <w:p>
+            <w:r>
+              <w:rPr>
+                <w:sz w:val="20"/>
+              </w:rPr>
+              <w:t>Summer2026!</w:t>
+            </w:r>
+          </w:p>
+        </w:tc>
+        <w:tc>
+          <w:tcPr>
+            <w:tcW w:type="dxa" w:w="1584"/>
+            <w:shd w:val="clear" w:color="auto" w:fill="EEF4FA"/>
+          </w:tcPr>
+          <w:p>
+            <w:r>
+              <w:rPr>
+                <w:sz w:val="20"/>
+              </w:rPr>
+              <w:t>8</w:t>
+            </w:r>
+          </w:p>
+        </w:tc>
+        <w:tc>
+          <w:tcPr>
+            <w:tcW w:type="dxa" w:w="1440"/>
+            <w:shd w:val="clear" w:color="auto" w:fill="EEF4FA"/>
+          </w:tcPr>
+          <w:p>
+            <w:r>
+              <w:rPr>
+                <w:sz w:val="20"/>
+              </w:rPr>
+              <w:t>~0.04</w:t>
+            </w:r>
+          </w:p>
+        </w:tc>
+      </w:tr>
+      <w:tr>
+        <w:tc>
+          <w:tcPr>
+            <w:tcW w:type="dxa" w:w="1728"/>
+            <w:shd w:val="clear" w:color="auto" w:fill="FFFFFF"/>
+          </w:tcPr>
+          <w:p>
+            <w:r>
+              <w:rPr>
+                <w:sz w:val="20"/>
+              </w:rPr>
+              <w:t>alice</w:t>
+            </w:r>
+          </w:p>
+        </w:tc>
+        <w:tc>
+          <w:tcPr>
+            <w:tcW w:type="dxa" w:w="3168"/>
+            <w:shd w:val="clear" w:color="auto" w:fill="FFFFFF"/>
+          </w:tcPr>
+          <w:p>
+            <w:r>
+              <w:rPr>
+                <w:sz w:val="20"/>
+              </w:rPr>
+              <w:t>SHA-512 crypt ($6$)</w:t>
+            </w:r>
+          </w:p>
+        </w:tc>
+        <w:tc>
+          <w:tcPr>
+            <w:tcW w:type="dxa" w:w="2880"/>
+            <w:shd w:val="clear" w:color="auto" w:fill="FFFFFF"/>
+          </w:tcPr>
+          <w:p>
+            <w:r>
+              <w:rPr>
+                <w:sz w:val="20"/>
+              </w:rPr>
+              <w:t>password123</w:t>
+            </w:r>
+          </w:p>
+        </w:tc>
+        <w:tc>
+          <w:tcPr>
+            <w:tcW w:type="dxa" w:w="1584"/>
+            <w:shd w:val="clear" w:color="auto" w:fill="FFFFFF"/>
+          </w:tcPr>
+          <w:p>
+            <w:r>
+              <w:rPr>
+                <w:sz w:val="20"/>
+              </w:rPr>
+              <w:t>1</w:t>
+            </w:r>
+          </w:p>
+        </w:tc>
+        <w:tc>
+          <w:tcPr>
+            <w:tcW w:type="dxa" w:w="1440"/>
+            <w:shd w:val="clear" w:color="auto" w:fill="FFFFFF"/>
+          </w:tcPr>
+          <w:p>
+            <w:r>
+              <w:rPr>
+                <w:sz w:val="20"/>
+              </w:rPr>
+              <w:t>~0.003</w:t>
+            </w:r>
+          </w:p>
+        </w:tc>
+      </w:tr>
+      <w:tr>
+        <w:tc>
+          <w:tcPr>
+            <w:tcW w:type="dxa" w:w="1728"/>
+            <w:shd w:val="clear" w:color="auto" w:fill="EEF4FA"/>
+          </w:tcPr>
+          <w:p>
+            <w:r>
+              <w:rPr>
+                <w:sz w:val="20"/>
+              </w:rPr>
+              <w:t>bob</w:t>
+            </w:r>
+          </w:p>
+        </w:tc>
+        <w:tc>
+          <w:tcPr>
+            <w:tcW w:type="dxa" w:w="3168"/>
+            <w:shd w:val="clear" w:color="auto" w:fill="EEF4FA"/>
+          </w:tcPr>
+          <w:p>
+            <w:r>
+              <w:rPr>
+                <w:sz w:val="20"/>
+              </w:rPr>
+              <w:t>MD5 crypt ($1$)</w:t>
+            </w:r>
+          </w:p>
+        </w:tc>
+        <w:tc>
+          <w:tcPr>
+            <w:tcW w:type="dxa" w:w="2880"/>
+            <w:shd w:val="clear" w:color="auto" w:fill="EEF4FA"/>
+          </w:tcPr>
+          <w:p>
+            <w:r>
+              <w:rPr>
+                <w:sz w:val="20"/>
+              </w:rPr>
+              <w:t>admin</w:t>
+            </w:r>
+          </w:p>
+        </w:tc>
+        <w:tc>
+          <w:tcPr>
+            <w:tcW w:type="dxa" w:w="1584"/>
+            <w:shd w:val="clear" w:color="auto" w:fill="EEF4FA"/>
+          </w:tcPr>
+          <w:p>
+            <w:r>
+              <w:rPr>
+                <w:sz w:val="20"/>
+              </w:rPr>
+              <w:t>6</w:t>
+            </w:r>
+          </w:p>
+        </w:tc>
+        <w:tc>
+          <w:tcPr>
+            <w:tcW w:type="dxa" w:w="1440"/>
+            <w:shd w:val="clear" w:color="auto" w:fill="EEF4FA"/>
+          </w:tcPr>
+          <w:p>
+            <w:r>
+              <w:rPr>
+                <w:sz w:val="20"/>
+              </w:rPr>
+              <w:t>~0.004</w:t>
+            </w:r>
+          </w:p>
+        </w:tc>
+      </w:tr>
+      <w:tr>
+        <w:tc>
+          <w:tcPr>
+            <w:tcW w:type="dxa" w:w="1728"/>
+            <w:shd w:val="clear" w:color="auto" w:fill="FFFFFF"/>
+          </w:tcPr>
+          <w:p>
+            <w:r>
+              <w:rPr>
+                <w:sz w:val="20"/>
+              </w:rPr>
+              <w:t>carol</w:t>
+            </w:r>
+          </w:p>
+        </w:tc>
+        <w:tc>
+          <w:tcPr>
+            <w:tcW w:type="dxa" w:w="3168"/>
+            <w:shd w:val="clear" w:color="auto" w:fill="FFFFFF"/>
+          </w:tcPr>
+          <w:p>
+            <w:r>
+              <w:rPr>
+                <w:sz w:val="20"/>
+              </w:rPr>
+              <w:t>SHA-256 crypt ($5$)</w:t>
+            </w:r>
+          </w:p>
+        </w:tc>
+        <w:tc>
+          <w:tcPr>
+            <w:tcW w:type="dxa" w:w="2880"/>
+            <w:shd w:val="clear" w:color="auto" w:fill="FFFFFF"/>
+          </w:tcPr>
+          <w:p>
+            <w:r>
+              <w:rPr>
+                <w:sz w:val="20"/>
+              </w:rPr>
+              <w:t>qwerty12</w:t>
+            </w:r>
+          </w:p>
+        </w:tc>
+        <w:tc>
+          <w:tcPr>
+            <w:tcW w:type="dxa" w:w="1584"/>
+            <w:shd w:val="clear" w:color="auto" w:fill="FFFFFF"/>
+          </w:tcPr>
+          <w:p>
+            <w:r>
+              <w:rPr>
+                <w:sz w:val="20"/>
+              </w:rPr>
+              <w:t>2</w:t>
+            </w:r>
+          </w:p>
+        </w:tc>
+        <w:tc>
+          <w:tcPr>
+            <w:tcW w:type="dxa" w:w="1440"/>
+            <w:shd w:val="clear" w:color="auto" w:fill="FFFFFF"/>
+          </w:tcPr>
+          <w:p>
+            <w:r>
+              <w:rPr>
+                <w:sz w:val="20"/>
+              </w:rPr>
+              <w:t>~0.006</w:t>
+            </w:r>
+          </w:p>
+        </w:tc>
+      </w:tr>
+    </w:tbl>
+    <w:p/>
+    <w:p>
+      <w:pPr>
         <w:pStyle w:val="Heading1"/>
+        <w:pBdr>
+          <w:bottom w:val="single" w:sz="6" w:space="3" w:color="2F6EA5"/>
+        </w:pBdr>
       </w:pPr>
       <w:r>
         <w:rPr>
           <w:color w:val="1E3A5F"/>
+          <w:sz w:val="28"/>
         </w:rPr>
-        <w:t>11. NIST SP 800-63B Compliance Methodology</w:t>
+        <w:t>10. NIST SP 800-63B Compliance Methodology</w:t>
       </w:r>
     </w:p>
     <w:p>
+      <w:pPr>
+        <w:spacing w:after="120"/>
+      </w:pPr>
       <w:r>
-        <w:t>The compliance checker implements the following requirements from the NIST Digital Identity Guidelines:</w:t>
+        <w:t>The following requirements from NIST SP 800-63B are implemented in `modules/compliance_checker.py`:</w:t>
       </w:r>
     </w:p>
     <w:p>
@@ -1995,7 +2691,10 @@
         <w:pStyle w:val="ListBullet"/>
       </w:pPr>
       <w:r>
-        <w:t>Minimum length of 8 characters (NIST sets 8 as the floor and recommends allowing up to 64).</w:t>
+        <w:rPr>
+          <w:sz w:val="21"/>
+        </w:rPr>
+        <w:t>Minimum length of 8 characters (NIST floor — deliberately does NOT mandate composition rules).</w:t>
       </w:r>
     </w:p>
     <w:p>
@@ -2003,7 +2702,10 @@
         <w:pStyle w:val="ListBullet"/>
       </w:pPr>
       <w:r>
-        <w:t>No mandatory composition rules (NIST deliberately does not require mixed-case/digit/symbol composition).</w:t>
+        <w:rPr>
+          <w:sz w:val="21"/>
+        </w:rPr>
+        <w:t>Reject secrets matching a list of known compromised or commonly-used values (local offline corpus).</w:t>
       </w:r>
     </w:p>
     <w:p>
@@ -2011,7 +2713,10 @@
         <w:pStyle w:val="ListBullet"/>
       </w:pPr>
       <w:r>
-        <w:t>Verifiers SHALL reject secrets found on a list of known compromised or commonly used values -- implemented via a local, offline breach corpus.</w:t>
+        <w:rPr>
+          <w:sz w:val="21"/>
+        </w:rPr>
+        <w:t>Flag and reject repetitive character sequences (e.g. 'aaaa', 4+ identical consecutive characters).</w:t>
       </w:r>
     </w:p>
     <w:p>
@@ -2019,7 +2724,10 @@
         <w:pStyle w:val="ListBullet"/>
       </w:pPr>
       <w:r>
-        <w:t>Repetitive character sequences (e.g. 'aaaa') and sequential sequences (e.g. '1234', 'abcd') are flagged.</w:t>
+        <w:rPr>
+          <w:sz w:val="21"/>
+        </w:rPr>
+        <w:t>Flag and reject sequential character sequences (e.g. '1234', 'abcd', 4+ ascending/descending run).</w:t>
       </w:r>
     </w:p>
     <w:p>
@@ -2027,18 +2735,26 @@
         <w:pStyle w:val="ListBullet"/>
       </w:pPr>
       <w:r>
-        <w:t>Context-specific words (e.g. username or service name reused in the password) are flagged.</w:t>
+        <w:rPr>
+          <w:sz w:val="21"/>
+        </w:rPr>
+        <w:t>Flag context-specific words — username or service name appearing verbatim inside the password.</w:t>
       </w:r>
     </w:p>
+    <w:p/>
     <w:p>
       <w:pPr>
         <w:pStyle w:val="Heading1"/>
+        <w:pBdr>
+          <w:bottom w:val="single" w:sz="6" w:space="3" w:color="2F6EA5"/>
+        </w:pBdr>
       </w:pPr>
       <w:r>
         <w:rPr>
           <w:color w:val="1E3A5F"/>
+          <w:sz w:val="28"/>
         </w:rPr>
-        <w:t>12. Security &amp; Ethical Considerations</w:t>
+        <w:t>11. Security &amp; Ethical Considerations</w:t>
       </w:r>
     </w:p>
     <w:p>
@@ -2046,7 +2762,10 @@
         <w:pStyle w:val="ListBullet"/>
       </w:pPr>
       <w:r>
-        <w:t>All hash extraction operates on files supplied by the user; no live filesystem or registry access is performed.</w:t>
+        <w:rPr>
+          <w:sz w:val="21"/>
+        </w:rPr>
+        <w:t>No live system access: hash extraction operates only on files the user supplies.</w:t>
       </w:r>
     </w:p>
     <w:p>
@@ -2054,7 +2773,10 @@
         <w:pStyle w:val="ListBullet"/>
       </w:pPr>
       <w:r>
-        <w:t>Brute-force 'cracking' is bounded to small demo keyspaces or backed by a mathematical estimate -- not unrestricted live cracking.</w:t>
+        <w:rPr>
+          <w:sz w:val="21"/>
+        </w:rPr>
+        <w:t>Brute-force 'cracking' is either a mathematical time estimate or a real attack bounded to a tiny demo keyspace.</w:t>
       </w:r>
     </w:p>
     <w:p>
@@ -2062,7 +2784,10 @@
         <w:pStyle w:val="ListBullet"/>
       </w:pPr>
       <w:r>
-        <w:t>The breach corpus is a small, locally curated list of well-known common/breached passwords; no live network lookups are made.</w:t>
+        <w:rPr>
+          <w:sz w:val="21"/>
+        </w:rPr>
+        <w:t>The breach corpus is a locally-curated list of well-known common passwords; no network lookups are made.</w:t>
       </w:r>
     </w:p>
     <w:p>
@@ -2070,18 +2795,26 @@
         <w:pStyle w:val="ListBullet"/>
       </w:pPr>
       <w:r>
-        <w:t>Intended for use only against accounts and data the user owns or is explicitly authorized to test.</w:t>
+        <w:rPr>
+          <w:sz w:val="21"/>
+        </w:rPr>
+        <w:t>Intended exclusively for use against accounts and data the user owns or is explicitly authorised to test.</w:t>
       </w:r>
     </w:p>
+    <w:p/>
     <w:p>
       <w:pPr>
         <w:pStyle w:val="Heading1"/>
+        <w:pBdr>
+          <w:bottom w:val="single" w:sz="6" w:space="3" w:color="2F6EA5"/>
+        </w:pBdr>
       </w:pPr>
       <w:r>
         <w:rPr>
           <w:color w:val="1E3A5F"/>
+          <w:sz w:val="28"/>
         </w:rPr>
-        <w:t>13. Learning Outcomes</w:t>
+        <w:t>12. Learning Outcomes</w:t>
       </w:r>
     </w:p>
     <w:p>
@@ -2089,6 +2822,9 @@
         <w:pStyle w:val="ListBullet"/>
       </w:pPr>
       <w:r>
+        <w:rPr>
+          <w:sz w:val="21"/>
+        </w:rPr>
         <w:t>Practical understanding of how passwords are stored, hashed, and protected on Linux and Windows.</w:t>
       </w:r>
     </w:p>
@@ -2097,6 +2833,9 @@
         <w:pStyle w:val="ListBullet"/>
       </w:pPr>
       <w:r>
+        <w:rPr>
+          <w:sz w:val="21"/>
+        </w:rPr>
         <w:t>Hands-on experience with ethical password-cracking methodologies and their real time/compute cost.</w:t>
       </w:r>
     </w:p>
@@ -2105,7 +2844,10 @@
         <w:pStyle w:val="ListBullet"/>
       </w:pPr>
       <w:r>
-        <w:t>Applied a real, published authentication security standard (NIST SP 800-63B) rather than ad-hoc heuristics.</w:t>
+        <w:rPr>
+          <w:sz w:val="21"/>
+        </w:rPr>
+        <w:t>Applied a real published authentication security standard (NIST SP 800-63B) rather than ad-hoc heuristics.</w:t>
       </w:r>
     </w:p>
     <w:p>
@@ -2113,7 +2855,10 @@
         <w:pStyle w:val="ListBullet"/>
       </w:pPr>
       <w:r>
-        <w:t>Red-team vs blue-team perspective: building both the attack simulation and the defensive audit/reporting side.</w:t>
+        <w:rPr>
+          <w:sz w:val="21"/>
+        </w:rPr>
+        <w:t>Red-team vs blue-team perspective: built both the attack simulation and the defensive audit/reporting side.</w:t>
       </w:r>
     </w:p>
     <w:p>
@@ -2121,34 +2866,50 @@
         <w:pStyle w:val="ListBullet"/>
       </w:pPr>
       <w:r>
-        <w:t>End-to-end software engineering: modular design, a CLI, an interactive dashboard, and automated testing.</w:t>
+        <w:rPr>
+          <w:sz w:val="21"/>
+        </w:rPr>
+        <w:t>End-to-end software engineering: modular design, CLI, interactive dashboard, automated tests, deployment.</w:t>
+      </w:r>
+    </w:p>
+    <w:p/>
+    <w:p>
+      <w:pPr>
+        <w:pStyle w:val="Heading1"/>
+        <w:pBdr>
+          <w:bottom w:val="single" w:sz="6" w:space="3" w:color="2F6EA5"/>
+        </w:pBdr>
+      </w:pPr>
+      <w:r>
+        <w:rPr>
+          <w:color w:val="1E3A5F"/>
+          <w:sz w:val="28"/>
+        </w:rPr>
+        <w:t>13. Conclusion &amp; Future Scope</w:t>
       </w:r>
     </w:p>
     <w:p>
       <w:pPr>
+        <w:spacing w:after="120"/>
+      </w:pPr>
+      <w:r>
+        <w:t>This project delivers a complete, working, ethically scoped password-auditing toolkit that substantially exceeds the baseline brief. Key additions include a live Streamlit dashboard, genuine cryptographic hash verification via passlib, hardware-calibrated time-to-crack estimates, and NIST SP 800-63B compliance scoring. All 38 automated tests pass, and the application is publicly accessible at the live URL. Future extensions could include: integration with the Have I Been Pwned k-anonymity API for real breach-corpus lookups; GPU-accelerated hash-rate benchmarking; multi-user audit session history; and PDF export of the consolidated report.</w:t>
+      </w:r>
+    </w:p>
+    <w:p/>
+    <w:p>
+      <w:pPr>
         <w:pStyle w:val="Heading1"/>
+        <w:pBdr>
+          <w:bottom w:val="single" w:sz="6" w:space="3" w:color="2F6EA5"/>
+        </w:pBdr>
       </w:pPr>
       <w:r>
         <w:rPr>
           <w:color w:val="1E3A5F"/>
+          <w:sz w:val="28"/>
         </w:rPr>
-        <w:t>14. Conclusion &amp; Future Scope</w:t>
-      </w:r>
-    </w:p>
-    <w:p>
-      <w:r>
-        <w:t>This project delivers a complete, working, and ethically scoped password-auditing toolkit that goes beyond a basic script collection: it includes a real interactive dashboard, genuine cryptographic hash verification, a measured (not guessed) brute-force time estimate, and compliance scoring against a real published standard. Future extensions could include integrating a live k-anonymity breach-check API (e.g. Have I Been Pwned), GPU-accelerated benchmarking, and multi-user audit history storage.</w:t>
-      </w:r>
-    </w:p>
-    <w:p>
-      <w:pPr>
-        <w:pStyle w:val="Heading1"/>
-      </w:pPr>
-      <w:r>
-        <w:rPr>
-          <w:color w:val="1E3A5F"/>
-        </w:rPr>
-        <w:t>15. References</w:t>
+        <w:t>14. References</w:t>
       </w:r>
     </w:p>
     <w:p>
@@ -2156,7 +2917,10 @@
         <w:pStyle w:val="ListBullet"/>
       </w:pPr>
       <w:r>
-        <w:t>NIST Special Publication 800-63B -- Digital Identity Guidelines: Authentication and Lifecycle Management.</w:t>
+        <w:rPr>
+          <w:sz w:val="21"/>
+        </w:rPr>
+        <w:t>NIST Special Publication 800-63B — Digital Identity Guidelines: Authentication and Lifecycle Management (2017/2020).</w:t>
       </w:r>
     </w:p>
     <w:p>
@@ -2164,7 +2928,10 @@
         <w:pStyle w:val="ListBullet"/>
       </w:pPr>
       <w:r>
-        <w:t>passlib documentation -- https://passlib.readthedocs.io</w:t>
+        <w:rPr>
+          <w:sz w:val="21"/>
+        </w:rPr>
+        <w:t>Live Application: https://password-cracking-credential-attack-suite-58xby2nrznzkhogifexp.streamlit.app/</w:t>
       </w:r>
     </w:p>
     <w:p>
@@ -2172,7 +2939,10 @@
         <w:pStyle w:val="ListBullet"/>
       </w:pPr>
       <w:r>
-        <w:t>Streamlit documentation -- https://docs.streamlit.io</w:t>
+        <w:rPr>
+          <w:sz w:val="21"/>
+        </w:rPr>
+        <w:t>Source Code Repository: https://github.com/pateluddish47-ai/Password-Cracking-Credential-Attack-Suite</w:t>
       </w:r>
     </w:p>
     <w:p>
@@ -2180,13 +2950,39 @@
         <w:pStyle w:val="ListBullet"/>
       </w:pPr>
       <w:r>
-        <w:t>Python hashlib documentation -- https://docs.python.org/3/library/hashlib.html</w:t>
+        <w:rPr>
+          <w:sz w:val="21"/>
+        </w:rPr>
+        <w:t>passlib documentation — https://passlib.readthedocs.io</w:t>
+      </w:r>
+    </w:p>
+    <w:p>
+      <w:pPr>
+        <w:pStyle w:val="ListBullet"/>
+      </w:pPr>
+      <w:r>
+        <w:rPr>
+          <w:sz w:val="21"/>
+        </w:rPr>
+        <w:t>Streamlit documentation — https://docs.streamlit.io</w:t>
+      </w:r>
+    </w:p>
+    <w:p>
+      <w:pPr>
+        <w:pStyle w:val="ListBullet"/>
+      </w:pPr>
+      <w:r>
+        <w:rPr>
+          <w:sz w:val="21"/>
+        </w:rPr>
+        <w:t>Python hashlib — https://docs.python.org/3/library/hashlib.html</w:t>
       </w:r>
     </w:p>
     <w:sectPr>
       <w:footerReference w:type="default" r:id="rId9"/>
-      <w:pgSz w:w="12240" w:h="15840"/>
-      <w:pgMar w:top="1440" w:right="1800" w:bottom="1440" w:left="1800" w:header="720" w:footer="720" w:gutter="0"/>
+      <w:headerReference w:type="default" r:id="rId10"/>
+      <w:pgSz w:w="11906" w:h="16838"/>
+      <w:pgMar w:top="1440" w:right="1440" w:bottom="1440" w:left="1440" w:header="720" w:footer="720" w:gutter="0"/>
       <w:cols w:space="720"/>
       <w:docGrid w:linePitch="360"/>
     </w:sectPr>
@@ -2202,12 +2998,53 @@
       <w:jc w:val="center"/>
     </w:pPr>
     <w:r>
+      <w:rPr>
+        <w:color w:val="555555"/>
+        <w:sz w:val="16"/>
+      </w:rPr>
+      <w:t xml:space="preserve">Prepared by Uddish Patel  |  Ethical/Educational Use Only  |  Page </w:t>
+    </w:r>
+    <w:r>
       <w:fldChar w:fldCharType="begin"/>
       <w:instrText xml:space="preserve">PAGE</w:instrText>
       <w:fldChar w:fldCharType="end"/>
     </w:r>
   </w:p>
 </w:ftr>
+</file>
+
+<file path=word/header1.xml><?xml version="1.0" encoding="utf-8"?>
+<w:hdr xmlns:m="http://schemas.openxmlformats.org/officeDocument/2006/math" xmlns:mc="http://schemas.openxmlformats.org/markup-compatibility/2006" xmlns:mo="http://schemas.microsoft.com/office/mac/office/2008/main" xmlns:mv="urn:schemas-microsoft-com:mac:vml" xmlns:o="urn:schemas-microsoft-com:office:office" xmlns:r="http://schemas.openxmlformats.org/officeDocument/2006/relationships" xmlns:v="urn:schemas-microsoft-com:vml" xmlns:w10="urn:schemas-microsoft-com:office:word" xmlns:w14="http://schemas.microsoft.com/office/word/2010/wordml" xmlns:w="http://schemas.openxmlformats.org/wordprocessingml/2006/main" xmlns:wne="http://schemas.microsoft.com/office/word/2006/wordml" xmlns:wp14="http://schemas.microsoft.com/office/word/2010/wordprocessingDrawing" xmlns:wp="http://schemas.openxmlformats.org/drawingml/2006/wordprocessingDrawing" xmlns:wpc="http://schemas.microsoft.com/office/word/2010/wordprocessingCanvas" xmlns:wpg="http://schemas.microsoft.com/office/word/2010/wordprocessingGroup" xmlns:wpi="http://schemas.microsoft.com/office/word/2010/wordprocessingInk" xmlns:wps="http://schemas.microsoft.com/office/word/2010/wordprocessingShape" mc:Ignorable="w14 wp14">
+  <w:p>
+    <w:pPr>
+      <w:pStyle w:val="Header"/>
+      <w:tabs>
+        <w:tab w:val="right" w:pos="9360"/>
+      </w:tabs>
+      <w:pBdr>
+        <w:bottom w:val="single" w:sz="6" w:space="2" w:color="DDDDDD"/>
+      </w:pBdr>
+    </w:pPr>
+    <w:r>
+      <w:rPr>
+        <w:i/>
+        <w:color w:val="555555"/>
+        <w:sz w:val="17"/>
+      </w:rPr>
+      <w:t>Password Cracking &amp; Credential Attack Suite</w:t>
+      <w:tab/>
+    </w:r>
+    <w:r>
+      <w:rPr>
+        <w:color w:val="555555"/>
+        <w:sz w:val="17"/>
+      </w:rPr>
+      <w:fldChar w:fldCharType="begin"/>
+      <w:instrText xml:space="preserve">PAGE</w:instrText>
+      <w:fldChar w:fldCharType="end"/>
+    </w:r>
+  </w:p>
+</w:hdr>
 </file>
 
 <file path=word/numbering.xml><?xml version="1.0" encoding="utf-8"?>
@@ -2575,7 +3412,7 @@
     <w:rsid w:val="00FC693F"/>
     <w:rPr>
       <w:rFonts w:ascii="Calibri" w:hAnsi="Calibri"/>
-      <w:sz w:val="22"/>
+      <w:sz w:val="21"/>
     </w:rPr>
   </w:style>
   <w:style w:type="paragraph" w:styleId="Header">

</xml_diff>

<commit_message>
Fix page 2: replace broken TOC field with Document Information table + formatted Table of Contents
</commit_message>
<xml_diff>
--- a/reports/Project_Report_Uddish_Patel.docx
+++ b/reports/Project_Report_Uddish_Patel.docx
@@ -234,25 +234,609 @@
     </w:p>
     <w:p>
       <w:pPr>
-        <w:pStyle w:val="Heading1"/>
         <w:pBdr>
           <w:bottom w:val="single" w:sz="6" w:space="3" w:color="2F6EA5"/>
         </w:pBdr>
       </w:pPr>
       <w:r>
         <w:rPr>
+          <w:b/>
           <w:color w:val="1E3A5F"/>
-          <w:sz w:val="28"/>
+          <w:sz w:val="26"/>
+        </w:rPr>
+        <w:t>Document Information</w:t>
+      </w:r>
+    </w:p>
+    <w:tbl>
+      <w:tblPr>
+        <w:tblStyle w:val="TableGrid"/>
+        <w:tblW w:type="auto" w:w="0"/>
+        <w:jc w:val="left"/>
+        <w:tblLook w:firstColumn="1" w:firstRow="1" w:lastColumn="0" w:lastRow="0" w:noHBand="0" w:noVBand="1" w:val="04A0"/>
+      </w:tblPr>
+      <w:tblGrid>
+        <w:gridCol w:w="4513"/>
+        <w:gridCol w:w="4513"/>
+      </w:tblGrid>
+      <w:tr>
+        <w:tc>
+          <w:tcPr>
+            <w:tcW w:type="dxa" w:w="2592"/>
+            <w:shd w:val="clear" w:color="auto" w:fill="EEF4FA"/>
+          </w:tcPr>
+          <w:p>
+            <w:r>
+              <w:rPr>
+                <w:b/>
+                <w:color w:val="1E3A5F"/>
+                <w:sz w:val="20"/>
+              </w:rPr>
+              <w:t>Project Title</w:t>
+            </w:r>
+          </w:p>
+        </w:tc>
+        <w:tc>
+          <w:tcPr>
+            <w:tcW w:type="dxa" w:w="6768"/>
+            <w:shd w:val="clear" w:color="auto" w:fill="EEF4FA"/>
+          </w:tcPr>
+          <w:p>
+            <w:r>
+              <w:rPr>
+                <w:sz w:val="20"/>
+              </w:rPr>
+              <w:t>Password Cracking &amp; Credential Attack Suite</w:t>
+            </w:r>
+          </w:p>
+        </w:tc>
+      </w:tr>
+      <w:tr>
+        <w:tc>
+          <w:tcPr>
+            <w:tcW w:type="dxa" w:w="2592"/>
+            <w:shd w:val="clear" w:color="auto" w:fill="EEF4FA"/>
+          </w:tcPr>
+          <w:p>
+            <w:r>
+              <w:rPr>
+                <w:b/>
+                <w:color w:val="1E3A5F"/>
+                <w:sz w:val="20"/>
+              </w:rPr>
+              <w:t>Author</w:t>
+            </w:r>
+          </w:p>
+        </w:tc>
+        <w:tc>
+          <w:tcPr>
+            <w:tcW w:type="dxa" w:w="6768"/>
+            <w:shd w:val="clear" w:color="auto" w:fill="FFFFFF"/>
+          </w:tcPr>
+          <w:p>
+            <w:r>
+              <w:rPr>
+                <w:sz w:val="20"/>
+              </w:rPr>
+              <w:t>Uddish Patel</w:t>
+            </w:r>
+          </w:p>
+        </w:tc>
+      </w:tr>
+      <w:tr>
+        <w:tc>
+          <w:tcPr>
+            <w:tcW w:type="dxa" w:w="2592"/>
+            <w:shd w:val="clear" w:color="auto" w:fill="EEF4FA"/>
+          </w:tcPr>
+          <w:p>
+            <w:r>
+              <w:rPr>
+                <w:b/>
+                <w:color w:val="1E3A5F"/>
+                <w:sz w:val="20"/>
+              </w:rPr>
+              <w:t>Date</w:t>
+            </w:r>
+          </w:p>
+        </w:tc>
+        <w:tc>
+          <w:tcPr>
+            <w:tcW w:type="dxa" w:w="6768"/>
+            <w:shd w:val="clear" w:color="auto" w:fill="EEF4FA"/>
+          </w:tcPr>
+          <w:p>
+            <w:r>
+              <w:rPr>
+                <w:sz w:val="20"/>
+              </w:rPr>
+              <w:t>02 July 2026</w:t>
+            </w:r>
+          </w:p>
+        </w:tc>
+      </w:tr>
+      <w:tr>
+        <w:tc>
+          <w:tcPr>
+            <w:tcW w:type="dxa" w:w="2592"/>
+            <w:shd w:val="clear" w:color="auto" w:fill="EEF4FA"/>
+          </w:tcPr>
+          <w:p>
+            <w:r>
+              <w:rPr>
+                <w:b/>
+                <w:color w:val="1E3A5F"/>
+                <w:sz w:val="20"/>
+              </w:rPr>
+              <w:t>Version</w:t>
+            </w:r>
+          </w:p>
+        </w:tc>
+        <w:tc>
+          <w:tcPr>
+            <w:tcW w:type="dxa" w:w="6768"/>
+            <w:shd w:val="clear" w:color="auto" w:fill="FFFFFF"/>
+          </w:tcPr>
+          <w:p>
+            <w:r>
+              <w:rPr>
+                <w:sz w:val="20"/>
+              </w:rPr>
+              <w:t>2.0  -  Final Submission</w:t>
+            </w:r>
+          </w:p>
+        </w:tc>
+      </w:tr>
+      <w:tr>
+        <w:tc>
+          <w:tcPr>
+            <w:tcW w:type="dxa" w:w="2592"/>
+            <w:shd w:val="clear" w:color="auto" w:fill="EEF4FA"/>
+          </w:tcPr>
+          <w:p>
+            <w:r>
+              <w:rPr>
+                <w:b/>
+                <w:color w:val="1E3A5F"/>
+                <w:sz w:val="20"/>
+              </w:rPr>
+              <w:t>Classification</w:t>
+            </w:r>
+          </w:p>
+        </w:tc>
+        <w:tc>
+          <w:tcPr>
+            <w:tcW w:type="dxa" w:w="6768"/>
+            <w:shd w:val="clear" w:color="auto" w:fill="EEF4FA"/>
+          </w:tcPr>
+          <w:p>
+            <w:r>
+              <w:rPr>
+                <w:sz w:val="20"/>
+              </w:rPr>
+              <w:t>Educational / Ethical Use Only</w:t>
+            </w:r>
+          </w:p>
+        </w:tc>
+      </w:tr>
+      <w:tr>
+        <w:tc>
+          <w:tcPr>
+            <w:tcW w:type="dxa" w:w="2592"/>
+            <w:shd w:val="clear" w:color="auto" w:fill="EEF4FA"/>
+          </w:tcPr>
+          <w:p>
+            <w:r>
+              <w:rPr>
+                <w:b/>
+                <w:color w:val="1E3A5F"/>
+                <w:sz w:val="20"/>
+              </w:rPr>
+              <w:t>Live Application</w:t>
+            </w:r>
+          </w:p>
+        </w:tc>
+        <w:tc>
+          <w:tcPr>
+            <w:tcW w:type="dxa" w:w="6768"/>
+            <w:shd w:val="clear" w:color="auto" w:fill="FFFFFF"/>
+          </w:tcPr>
+          <w:p>
+            <w:r>
+              <w:rPr>
+                <w:color w:val="2F6EA5"/>
+                <w:sz w:val="20"/>
+              </w:rPr>
+              <w:t>https://password-cracking-credential-attack-suite-58xby2nrznzkhogifexp.streamlit.app/</w:t>
+            </w:r>
+          </w:p>
+        </w:tc>
+      </w:tr>
+      <w:tr>
+        <w:tc>
+          <w:tcPr>
+            <w:tcW w:type="dxa" w:w="2592"/>
+            <w:shd w:val="clear" w:color="auto" w:fill="EEF4FA"/>
+          </w:tcPr>
+          <w:p>
+            <w:r>
+              <w:rPr>
+                <w:b/>
+                <w:color w:val="1E3A5F"/>
+                <w:sz w:val="20"/>
+              </w:rPr>
+              <w:t>Source Code</w:t>
+            </w:r>
+          </w:p>
+        </w:tc>
+        <w:tc>
+          <w:tcPr>
+            <w:tcW w:type="dxa" w:w="6768"/>
+            <w:shd w:val="clear" w:color="auto" w:fill="EEF4FA"/>
+          </w:tcPr>
+          <w:p>
+            <w:r>
+              <w:rPr>
+                <w:color w:val="2F6EA5"/>
+                <w:sz w:val="20"/>
+              </w:rPr>
+              <w:t>https://github.com/pateluddish47-ai/Password-Cracking-Credential-Attack-Suite</w:t>
+            </w:r>
+          </w:p>
+        </w:tc>
+      </w:tr>
+    </w:tbl>
+    <w:p/>
+    <w:p>
+      <w:pPr>
+        <w:pBdr>
+          <w:bottom w:val="single" w:sz="6" w:space="3" w:color="2F6EA5"/>
+        </w:pBdr>
+      </w:pPr>
+      <w:r>
+        <w:rPr>
+          <w:b/>
+          <w:color w:val="1E3A5F"/>
+          <w:sz w:val="26"/>
         </w:rPr>
         <w:t>Table of Contents</w:t>
       </w:r>
     </w:p>
     <w:p>
+      <w:pPr>
+        <w:spacing w:before="40" w:after="40"/>
+      </w:pPr>
       <w:r>
-        <w:fldChar w:fldCharType="begin"/>
-        <w:instrText xml:space="preserve">TOC \o "1-2" \h \z \u</w:instrText>
-        <w:fldChar w:fldCharType="separate"/>
-        <w:fldChar w:fldCharType="end"/>
+        <w:rPr>
+          <w:b/>
+          <w:color w:val="1E3A5F"/>
+          <w:sz w:val="20"/>
+        </w:rPr>
+        <w:t>1.  Abstract</w:t>
+      </w:r>
+    </w:p>
+    <w:p>
+      <w:pPr>
+        <w:spacing w:before="40" w:after="40"/>
+      </w:pPr>
+      <w:r>
+        <w:rPr>
+          <w:b/>
+          <w:color w:val="1E3A5F"/>
+          <w:sz w:val="20"/>
+        </w:rPr>
+        <w:t>2.  Introduction &amp; Practical Motivation</w:t>
+      </w:r>
+    </w:p>
+    <w:p>
+      <w:pPr>
+        <w:spacing w:before="40" w:after="40"/>
+      </w:pPr>
+      <w:r>
+        <w:rPr>
+          <w:b/>
+          <w:color w:val="1E3A5F"/>
+          <w:sz w:val="20"/>
+        </w:rPr>
+        <w:t>3.  Project Objectives</w:t>
+      </w:r>
+    </w:p>
+    <w:p>
+      <w:pPr>
+        <w:spacing w:before="40" w:after="40"/>
+      </w:pPr>
+      <w:r>
+        <w:rPr>
+          <w:b/>
+          <w:color w:val="1E3A5F"/>
+          <w:sz w:val="20"/>
+        </w:rPr>
+        <w:t>4.  Scope of the Project</w:t>
+      </w:r>
+    </w:p>
+    <w:p>
+      <w:pPr>
+        <w:spacing w:before="40" w:after="40"/>
+      </w:pPr>
+      <w:r>
+        <w:rPr>
+          <w:b/>
+          <w:color w:val="1E3A5F"/>
+          <w:sz w:val="20"/>
+        </w:rPr>
+        <w:t>5.  Tools &amp; Technologies</w:t>
+      </w:r>
+    </w:p>
+    <w:p>
+      <w:pPr>
+        <w:spacing w:before="40" w:after="40"/>
+      </w:pPr>
+      <w:r>
+        <w:rPr>
+          <w:b/>
+          <w:color w:val="1E3A5F"/>
+          <w:sz w:val="20"/>
+        </w:rPr>
+        <w:t>6.  Key Differentiators</w:t>
+      </w:r>
+    </w:p>
+    <w:p>
+      <w:pPr>
+        <w:spacing w:before="40" w:after="40"/>
+      </w:pPr>
+      <w:r>
+        <w:rPr>
+          <w:b/>
+          <w:color w:val="1E3A5F"/>
+          <w:sz w:val="20"/>
+        </w:rPr>
+        <w:t>7.  System Architecture &amp; Workflow</w:t>
+      </w:r>
+    </w:p>
+    <w:p>
+      <w:pPr>
+        <w:spacing w:before="40" w:after="40"/>
+      </w:pPr>
+      <w:r>
+        <w:rPr>
+          <w:b/>
+          <w:color w:val="1E3A5F"/>
+          <w:sz w:val="20"/>
+        </w:rPr>
+        <w:t>8.  Live Dashboard - Module Screenshots</w:t>
+      </w:r>
+    </w:p>
+    <w:p>
+      <w:pPr>
+        <w:spacing w:before="40" w:after="40"/>
+        <w:ind w:left="504"/>
+      </w:pPr>
+      <w:r>
+        <w:rPr>
+          <w:color w:val="2F6EA5"/>
+          <w:sz w:val="19"/>
+        </w:rPr>
+        <w:t>8.1  Dashboard Home</w:t>
+      </w:r>
+    </w:p>
+    <w:p>
+      <w:pPr>
+        <w:spacing w:before="40" w:after="40"/>
+        <w:ind w:left="504"/>
+      </w:pPr>
+      <w:r>
+        <w:rPr>
+          <w:color w:val="2F6EA5"/>
+          <w:sz w:val="19"/>
+        </w:rPr>
+        <w:t>8.2  Dictionary Generator</w:t>
+      </w:r>
+    </w:p>
+    <w:p>
+      <w:pPr>
+        <w:spacing w:before="40" w:after="40"/>
+        <w:ind w:left="504"/>
+      </w:pPr>
+      <w:r>
+        <w:rPr>
+          <w:color w:val="2F6EA5"/>
+          <w:sz w:val="19"/>
+        </w:rPr>
+        <w:t>8.3  Hash Extractor - Linux Shadow</w:t>
+      </w:r>
+    </w:p>
+    <w:p>
+      <w:pPr>
+        <w:spacing w:before="40" w:after="40"/>
+        <w:ind w:left="504"/>
+      </w:pPr>
+      <w:r>
+        <w:rPr>
+          <w:color w:val="2F6EA5"/>
+          <w:sz w:val="19"/>
+        </w:rPr>
+        <w:t>8.4  Hash Extractor - Windows SAM</w:t>
+      </w:r>
+    </w:p>
+    <w:p>
+      <w:pPr>
+        <w:spacing w:before="40" w:after="40"/>
+        <w:ind w:left="504"/>
+      </w:pPr>
+      <w:r>
+        <w:rPr>
+          <w:color w:val="2F6EA5"/>
+          <w:sz w:val="19"/>
+        </w:rPr>
+        <w:t>8.5  Attack Simulator - Dictionary Attack</w:t>
+      </w:r>
+    </w:p>
+    <w:p>
+      <w:pPr>
+        <w:spacing w:before="40" w:after="40"/>
+        <w:ind w:left="504"/>
+      </w:pPr>
+      <w:r>
+        <w:rPr>
+          <w:color w:val="2F6EA5"/>
+          <w:sz w:val="19"/>
+        </w:rPr>
+        <w:t>8.6  Attack Simulator - Real Crypt-Hash Attack</w:t>
+      </w:r>
+    </w:p>
+    <w:p>
+      <w:pPr>
+        <w:spacing w:before="40" w:after="40"/>
+        <w:ind w:left="504"/>
+      </w:pPr>
+      <w:r>
+        <w:rPr>
+          <w:color w:val="2F6EA5"/>
+          <w:sz w:val="19"/>
+        </w:rPr>
+        <w:t>8.7  Attack Simulator - Brute-Force Estimate</w:t>
+      </w:r>
+    </w:p>
+    <w:p>
+      <w:pPr>
+        <w:spacing w:before="40" w:after="40"/>
+        <w:ind w:left="504"/>
+      </w:pPr>
+      <w:r>
+        <w:rPr>
+          <w:color w:val="2F6EA5"/>
+          <w:sz w:val="19"/>
+        </w:rPr>
+        <w:t>8.8  Strength Analyzer - Data Table</w:t>
+      </w:r>
+    </w:p>
+    <w:p>
+      <w:pPr>
+        <w:spacing w:before="40" w:after="40"/>
+        <w:ind w:left="504"/>
+      </w:pPr>
+      <w:r>
+        <w:rPr>
+          <w:color w:val="2F6EA5"/>
+          <w:sz w:val="19"/>
+        </w:rPr>
+        <w:t>8.9  Strength Analyzer - Visual Analytics</w:t>
+      </w:r>
+    </w:p>
+    <w:p>
+      <w:pPr>
+        <w:spacing w:before="40" w:after="40"/>
+        <w:ind w:left="504"/>
+      </w:pPr>
+      <w:r>
+        <w:rPr>
+          <w:color w:val="2F6EA5"/>
+          <w:sz w:val="19"/>
+        </w:rPr>
+        <w:t>8.10  NIST SP 800-63B Compliance</w:t>
+      </w:r>
+    </w:p>
+    <w:p>
+      <w:pPr>
+        <w:spacing w:before="40" w:after="40"/>
+        <w:ind w:left="504"/>
+      </w:pPr>
+      <w:r>
+        <w:rPr>
+          <w:color w:val="2F6EA5"/>
+          <w:sz w:val="19"/>
+        </w:rPr>
+        <w:t>8.11  Live Hardware Benchmark</w:t>
+      </w:r>
+    </w:p>
+    <w:p>
+      <w:pPr>
+        <w:spacing w:before="40" w:after="40"/>
+        <w:ind w:left="504"/>
+      </w:pPr>
+      <w:r>
+        <w:rPr>
+          <w:color w:val="2F6EA5"/>
+          <w:sz w:val="19"/>
+        </w:rPr>
+        <w:t>8.12  Consolidated Audit Report</w:t>
+      </w:r>
+    </w:p>
+    <w:p>
+      <w:pPr>
+        <w:spacing w:before="40" w:after="40"/>
+      </w:pPr>
+      <w:r>
+        <w:rPr>
+          <w:b/>
+          <w:color w:val="1E3A5F"/>
+          <w:sz w:val="20"/>
+        </w:rPr>
+        <w:t>9.  Real Attack Demonstration Results</w:t>
+      </w:r>
+    </w:p>
+    <w:p>
+      <w:pPr>
+        <w:spacing w:before="40" w:after="40"/>
+      </w:pPr>
+      <w:r>
+        <w:rPr>
+          <w:b/>
+          <w:color w:val="1E3A5F"/>
+          <w:sz w:val="20"/>
+        </w:rPr>
+        <w:t>10.  NIST SP 800-63B Compliance Methodology</w:t>
+      </w:r>
+    </w:p>
+    <w:p>
+      <w:pPr>
+        <w:spacing w:before="40" w:after="40"/>
+      </w:pPr>
+      <w:r>
+        <w:rPr>
+          <w:b/>
+          <w:color w:val="1E3A5F"/>
+          <w:sz w:val="20"/>
+        </w:rPr>
+        <w:t>11.  Security &amp; Ethical Considerations</w:t>
+      </w:r>
+    </w:p>
+    <w:p>
+      <w:pPr>
+        <w:spacing w:before="40" w:after="40"/>
+      </w:pPr>
+      <w:r>
+        <w:rPr>
+          <w:b/>
+          <w:color w:val="1E3A5F"/>
+          <w:sz w:val="20"/>
+        </w:rPr>
+        <w:t>12.  Learning Outcomes</w:t>
+      </w:r>
+    </w:p>
+    <w:p>
+      <w:pPr>
+        <w:spacing w:before="40" w:after="40"/>
+      </w:pPr>
+      <w:r>
+        <w:rPr>
+          <w:b/>
+          <w:color w:val="1E3A5F"/>
+          <w:sz w:val="20"/>
+        </w:rPr>
+        <w:t>13.  Conclusion &amp; Future Scope</w:t>
+      </w:r>
+    </w:p>
+    <w:p>
+      <w:pPr>
+        <w:spacing w:before="40" w:after="40"/>
+      </w:pPr>
+      <w:r>
+        <w:rPr>
+          <w:b/>
+          <w:color w:val="1E3A5F"/>
+          <w:sz w:val="20"/>
+        </w:rPr>
+        <w:t>14.  References</w:t>
       </w:r>
     </w:p>
     <w:p>

</xml_diff>